<commit_message>
docs: format Step 2 vehicle conversion equations using native Word OMML
</commit_message>
<xml_diff>
--- a/docs/VNYLT 2026.docx
+++ b/docs/VNYLT 2026.docx
@@ -1012,7 +1012,7 @@
       <w:pPr>
         <w:spacing w:after="120" w:before="120" w:line="312" w:lineRule="auto"/>
         <w:ind w:left="0" w:firstLine="0"/>
-        <w:jc w:val="both"/>
+        <w:jc w:val="left"/>
         <w:rPr>
           <w:rFonts w:ascii="Times New Roman" w:cs="Times New Roman" w:eastAsia="Times New Roman" w:hAnsi="Times New Roman"/>
           <w:b w:val="1"/>
@@ -3072,7 +3072,7 @@
     <w:p>
       <w:pPr>
         <w:spacing w:after="200" w:line="276" w:lineRule="auto"/>
-        <w:jc w:val="center"/>
+        <w:jc w:val="left"/>
         <w:rPr>
           <w:rFonts w:ascii="Times New Roman" w:cs="Times New Roman" w:eastAsia="Times New Roman" w:hAnsi="Times New Roman"/>
           <w:sz w:val="26"/>
@@ -3208,7 +3208,7 @@
     <w:p>
       <w:pPr>
         <w:spacing w:after="120" w:before="120" w:line="312" w:lineRule="auto"/>
-        <w:jc w:val="both"/>
+        <w:jc w:val="left"/>
         <w:rPr>
           <w:rFonts w:ascii="Times New Roman" w:cs="Times New Roman" w:eastAsia="Times New Roman" w:hAnsi="Times New Roman"/>
           <w:sz w:val="26"/>
@@ -3239,7 +3239,7 @@
     <w:p>
       <w:pPr>
         <w:spacing w:after="120" w:before="120" w:line="312" w:lineRule="auto"/>
-        <w:jc w:val="both"/>
+        <w:jc w:val="left"/>
         <w:rPr>
           <w:rFonts w:ascii="Times New Roman" w:cs="Times New Roman" w:eastAsia="Times New Roman" w:hAnsi="Times New Roman"/>
           <w:sz w:val="26"/>
@@ -3277,10 +3277,344 @@
     </w:p>
     <w:p>
       <w:pPr>
-        <w:spacing w:after="200" w:line="276" w:lineRule="auto"/>
+        <w:spacing w:before="80" w:after="40"/>
+      </w:pPr>
+      <w:r>
+        <w:rPr>
+          <w:rFonts w:ascii="Times New Roman" w:hAnsi="Times New Roman"/>
+          <w:b w:val="0"/>
+          <w:i/>
+          <w:sz w:val="25"/>
+        </w:rPr>
+        <w:t>1. Sản lượng quả đạt chuẩn đưa vào chuỗi lạnh:</w:t>
+      </w:r>
+    </w:p>
+    <w:p>
+      <w:pPr>
+        <w:spacing w:after="120" w:line="276" w:lineRule="auto" w:before="60"/>
         <w:jc w:val="center"/>
         <w:rPr>
           <w:rFonts w:ascii="Cambria" w:cs="Cambria" w:eastAsia="Cambria" w:hAnsi="Cambria"/>
+        </w:rPr>
+      </w:pPr>
+      <w:r/>
+      <m:oMathPara>
+        <m:oMath>
+          <m:sSub>
+            <m:e>
+              <m:r>
+                <m:rPr>
+                  <m:sty m:val="i"/>
+                </m:rPr>
+                <m:t>Y</m:t>
+              </m:r>
+            </m:e>
+            <m:sub>
+              <m:r>
+                <m:t>cold,t</m:t>
+              </m:r>
+            </m:sub>
+          </m:sSub>
+          <m:r>
+            <m:t> = </m:t>
+          </m:r>
+          <m:sSub>
+            <m:e>
+              <m:acc>
+                <m:accPr>
+                  <m:chr m:val="^"/>
+                </m:accPr>
+                <m:e>
+                  <m:r>
+                    <m:rPr>
+                      <m:sty m:val="i"/>
+                    </m:rPr>
+                    <m:t>Y</m:t>
+                  </m:r>
+                </m:e>
+              </m:acc>
+            </m:e>
+            <m:sub>
+              <m:r>
+                <m:rPr>
+                  <m:sty m:val="i"/>
+                </m:rPr>
+                <m:t>t</m:t>
+              </m:r>
+            </m:sub>
+          </m:sSub>
+          <m:r>
+            <m:t> × </m:t>
+          </m:r>
+          <m:sSub>
+            <m:e>
+              <m:r>
+                <m:rPr>
+                  <m:sty m:val="i"/>
+                </m:rPr>
+                <m:t>α</m:t>
+              </m:r>
+            </m:e>
+            <m:sub>
+              <m:r>
+                <m:rPr>
+                  <m:sty m:val="i"/>
+                </m:rPr>
+                <m:t>t</m:t>
+              </m:r>
+            </m:sub>
+          </m:sSub>
+        </m:oMath>
+      </m:oMathPara>
+    </w:p>
+    <w:p>
+      <w:pPr>
+        <w:spacing w:before="80" w:after="40"/>
+      </w:pPr>
+      <w:r>
+        <w:rPr>
+          <w:rFonts w:ascii="Times New Roman" w:hAnsi="Times New Roman"/>
+          <w:b w:val="0"/>
+          <w:i/>
+          <w:sz w:val="25"/>
+        </w:rPr>
+        <w:t>2. Số lượng Container lạnh 40 feet (Hàm sàn - Đóng kín các lô đủ tải 17.28 tấn):</w:t>
+      </w:r>
+    </w:p>
+    <w:p>
+      <w:pPr>
+        <w:spacing w:before="40" w:after="120"/>
+        <w:jc w:val="center"/>
+      </w:pPr>
+      <m:oMathPara>
+        <m:oMath>
+          <m:sSub>
+            <m:e>
+              <m:r>
+                <m:rPr>
+                  <m:sty m:val="i"/>
+                </m:rPr>
+                <m:t>N</m:t>
+              </m:r>
+            </m:e>
+            <m:sub>
+              <m:r>
+                <m:t>Cont40,t</m:t>
+              </m:r>
+            </m:sub>
+          </m:sSub>
+          <m:r>
+            <m:t> = </m:t>
+          </m:r>
+          <m:d>
+            <m:dPr>
+              <m:begChr m:val="⌊"/>
+              <m:endChr m:val="⌋"/>
+            </m:dPr>
+            <m:e>
+              <m:f>
+                <m:num>
+                  <m:sSub>
+                    <m:e>
+                      <m:r>
+                        <m:rPr>
+                          <m:sty m:val="i"/>
+                        </m:rPr>
+                        <m:t>Y</m:t>
+                      </m:r>
+                    </m:e>
+                    <m:sub>
+                      <m:r>
+                        <m:t>cold,t</m:t>
+                      </m:r>
+                    </m:sub>
+                  </m:sSub>
+                </m:num>
+                <m:den>
+                  <m:sSub>
+                    <m:e>
+                      <m:r>
+                        <m:rPr>
+                          <m:sty m:val="i"/>
+                        </m:rPr>
+                        <m:t>C</m:t>
+                      </m:r>
+                    </m:e>
+                    <m:sub>
+                      <m:r>
+                        <m:t>eff, Cont40</m:t>
+                      </m:r>
+                    </m:sub>
+                  </m:sSub>
+                </m:den>
+              </m:f>
+            </m:e>
+          </m:d>
+          <m:r>
+            <m:t> = </m:t>
+          </m:r>
+          <m:d>
+            <m:dPr>
+              <m:begChr m:val="⌊"/>
+              <m:endChr m:val="⌋"/>
+            </m:dPr>
+            <m:e>
+              <m:f>
+                <m:num>
+                  <m:sSub>
+                    <m:e>
+                      <m:r>
+                        <m:rPr>
+                          <m:sty m:val="i"/>
+                        </m:rPr>
+                        <m:t>Y</m:t>
+                      </m:r>
+                    </m:e>
+                    <m:sub>
+                      <m:r>
+                        <m:t>cold,t</m:t>
+                      </m:r>
+                    </m:sub>
+                  </m:sSub>
+                </m:num>
+                <m:den>
+                  <m:r>
+                    <m:t>17.28</m:t>
+                  </m:r>
+                </m:den>
+              </m:f>
+            </m:e>
+          </m:d>
+        </m:oMath>
+      </m:oMathPara>
+    </w:p>
+    <w:p>
+      <w:pPr>
+        <w:spacing w:before="80" w:after="40"/>
+      </w:pPr>
+      <w:r>
+        <w:rPr>
+          <w:rFonts w:ascii="Times New Roman" w:hAnsi="Times New Roman"/>
+          <w:b w:val="0"/>
+          <w:i/>
+          <w:sz w:val="25"/>
+        </w:rPr>
+        <w:t>3. Số lượng Xe tải lạnh 5 tấn (Hàm trần - Giải tỏa sản lượng vải dư lẻ LTL):</w:t>
+      </w:r>
+    </w:p>
+    <w:p>
+      <w:pPr>
+        <w:spacing w:before="40" w:after="160"/>
+        <w:jc w:val="center"/>
+      </w:pPr>
+      <m:oMathPara>
+        <m:oMath>
+          <m:sSub>
+            <m:e>
+              <m:r>
+                <m:rPr>
+                  <m:sty m:val="i"/>
+                </m:rPr>
+                <m:t>N</m:t>
+              </m:r>
+            </m:e>
+            <m:sub>
+              <m:r>
+                <m:t>Truck5,t</m:t>
+              </m:r>
+            </m:sub>
+          </m:sSub>
+          <m:r>
+            <m:t> = </m:t>
+          </m:r>
+          <m:d>
+            <m:dPr>
+              <m:begChr m:val="⌈"/>
+              <m:endChr m:val="⌉"/>
+            </m:dPr>
+            <m:e>
+              <m:f>
+                <m:num>
+                  <m:sSub>
+                    <m:e>
+                      <m:r>
+                        <m:rPr>
+                          <m:sty m:val="i"/>
+                        </m:rPr>
+                        <m:t>Y</m:t>
+                      </m:r>
+                    </m:e>
+                    <m:sub>
+                      <m:r>
+                        <m:t>rem,t</m:t>
+                      </m:r>
+                    </m:sub>
+                  </m:sSub>
+                </m:num>
+                <m:den>
+                  <m:sSub>
+                    <m:e>
+                      <m:r>
+                        <m:rPr>
+                          <m:sty m:val="i"/>
+                        </m:rPr>
+                        <m:t>C</m:t>
+                      </m:r>
+                    </m:e>
+                    <m:sub>
+                      <m:r>
+                        <m:t>eff, Truck5</m:t>
+                      </m:r>
+                    </m:sub>
+                  </m:sSub>
+                </m:den>
+              </m:f>
+            </m:e>
+          </m:d>
+          <m:r>
+            <m:t> = </m:t>
+          </m:r>
+          <m:d>
+            <m:dPr>
+              <m:begChr m:val="⌈"/>
+              <m:endChr m:val="⌉"/>
+            </m:dPr>
+            <m:e>
+              <m:f>
+                <m:num>
+                  <m:sSub>
+                    <m:e>
+                      <m:r>
+                        <m:rPr>
+                          <m:sty m:val="i"/>
+                        </m:rPr>
+                        <m:t>Y</m:t>
+                      </m:r>
+                    </m:e>
+                    <m:sub>
+                      <m:r>
+                        <m:t>rem,t</m:t>
+                      </m:r>
+                    </m:sub>
+                  </m:sSub>
+                </m:num>
+                <m:den>
+                  <m:r>
+                    <m:t>4.80</m:t>
+                  </m:r>
+                </m:den>
+              </m:f>
+            </m:e>
+          </m:d>
+        </m:oMath>
+      </m:oMathPara>
+    </w:p>
+    <w:p>
+      <w:pPr>
+        <w:spacing w:after="100" w:line="276" w:lineRule="auto"/>
+        <w:rPr>
+          <w:rFonts w:ascii="Calibri" w:cs="Calibri" w:eastAsia="Calibri" w:hAnsi="Calibri"/>
+          <w:color w:val="1e293b"/>
         </w:rPr>
       </w:pPr>
       <w:r/>
@@ -3291,25 +3625,6 @@
           <w:i w:val="0"/>
           <w:sz w:val="26"/>
         </w:rPr>
-        <w:t>Y_cold,t = Ŷₜ × αₜ   |   N_Cont40,t = ⌊Y_cold,t / 17.28⌋   |   N_Truck5,t = ⌈Y_rem,t / 4.80⌉</w:t>
-      </w:r>
-    </w:p>
-    <w:p>
-      <w:pPr>
-        <w:spacing w:after="100" w:line="276" w:lineRule="auto"/>
-        <w:rPr>
-          <w:rFonts w:ascii="Calibri" w:cs="Calibri" w:eastAsia="Calibri" w:hAnsi="Calibri"/>
-          <w:color w:val="1e293b"/>
-        </w:rPr>
-      </w:pPr>
-      <w:r/>
-      <w:r>
-        <w:rPr>
-          <w:rFonts w:ascii="Times New Roman" w:hAnsi="Times New Roman"/>
-          <w:b/>
-          <w:i w:val="0"/>
-          <w:sz w:val="26"/>
-        </w:rPr>
         <w:t>Trong đó:</w:t>
       </w:r>
     </w:p>
@@ -3397,7 +3712,7 @@
     <w:p>
       <w:pPr>
         <w:spacing w:after="240" w:before="240" w:line="312" w:lineRule="auto"/>
-        <w:jc w:val="both"/>
+        <w:jc w:val="left"/>
         <w:rPr>
           <w:rFonts w:ascii="Times New Roman" w:cs="Times New Roman" w:eastAsia="Times New Roman" w:hAnsi="Times New Roman"/>
           <w:sz w:val="26"/>
@@ -3459,7 +3774,7 @@
         </w:numPr>
         <w:spacing w:after="120" w:before="120" w:line="312" w:lineRule="auto"/>
         <w:ind w:left="720" w:hanging="360"/>
-        <w:jc w:val="both"/>
+        <w:jc w:val="left"/>
         <w:rPr>
           <w:rFonts w:ascii="Times New Roman" w:cs="Times New Roman" w:eastAsia="Times New Roman" w:hAnsi="Times New Roman"/>
           <w:sz w:val="26"/>
@@ -7587,7 +7902,7 @@
         <w:keepNext w:val="0"/>
         <w:keepLines w:val="0"/>
         <w:spacing w:after="120" w:before="120" w:line="312" w:lineRule="auto"/>
-        <w:jc w:val="both"/>
+        <w:jc w:val="left"/>
         <w:rPr>
           <w:rFonts w:ascii="Times New Roman" w:cs="Times New Roman" w:eastAsia="Times New Roman" w:hAnsi="Times New Roman"/>
           <w:b w:val="1"/>

</xml_diff>

<commit_message>
feat(capex): expand Table 2 with granular 20-item breakdown and partner savings defense
</commit_message>
<xml_diff>
--- a/docs/VNYLT 2026.docx
+++ b/docs/VNYLT 2026.docx
@@ -5548,805 +5548,2423 @@
     </w:p>
     <w:p>
       <w:pPr>
-        <w:spacing w:line="360" w:lineRule="auto"/>
+        <w:keepNext/>
+        <w:spacing w:line="360" w:lineRule="auto" w:before="160" w:after="80"/>
         <w:ind w:firstLine="720"/>
-        <w:jc w:val="both"/>
-        <w:rPr>
-          <w:rFonts w:ascii="Times New Roman" w:cs="Times New Roman" w:eastAsia="Times New Roman" w:hAnsi="Times New Roman"/>
-          <w:sz w:val="26"/>
-          <w:szCs w:val="26"/>
-        </w:rPr>
-      </w:pPr>
-      <w:r>
-        <w:rPr>
-          <w:rtl w:val="0"/>
-        </w:rPr>
+        <w:jc w:val="left"/>
+        <w:rPr>
+          <w:rFonts w:ascii="Times New Roman" w:cs="Times New Roman" w:eastAsia="Times New Roman" w:hAnsi="Times New Roman"/>
+          <w:sz w:val="26"/>
+          <w:szCs w:val="26"/>
+        </w:rPr>
+      </w:pPr>
+      <w:r>
+        <w:rPr>
+          <w:rFonts w:ascii="Segoe UI" w:hAnsi="Segoe UI"/>
+          <w:b/>
+          <w:color w:val="1565C0"/>
+          <w:sz w:val="20"/>
+        </w:rPr>
+        <w:t>Bảng 5.2. Dự toán Chi tiết Chi phí Đầu tư Ban đầu (CAPEX) giữa Hai Phương án Triển khai</w:t>
       </w:r>
     </w:p>
     <w:tbl>
       <w:tblPr>
-        <w:tblStyle w:val="Table2"/>
-        <w:tblW w:w="9024.999999999998" w:type="dxa"/>
-        <w:jc w:val="left"/>
+        <w:tblW w:type="auto" w:w="0"/>
+        <w:jc w:val="center"/>
+        <w:tblLayout w:type="fixed"/>
+        <w:tblLook w:firstColumn="1" w:firstRow="1" w:lastColumn="0" w:lastRow="0" w:noHBand="0" w:noVBand="1" w:val="04A0"/>
         <w:tblBorders>
-          <w:top w:color="000000" w:space="0" w:sz="4" w:val="single"/>
-          <w:left w:color="000000" w:space="0" w:sz="4" w:val="single"/>
-          <w:bottom w:color="000000" w:space="0" w:sz="4" w:val="single"/>
-          <w:right w:color="000000" w:space="0" w:sz="4" w:val="single"/>
-          <w:insideH w:color="000000" w:space="0" w:sz="4" w:val="single"/>
-          <w:insideV w:color="000000" w:space="0" w:sz="4" w:val="single"/>
+          <w:top w:val="single" w:sz="6" w:space="0" w:color="1565C0"/>
+          <w:bottom w:val="single" w:sz="8" w:space="0" w:color="1565C0"/>
+          <w:left w:val="none"/>
+          <w:right w:val="none"/>
+          <w:insideH w:val="single" w:sz="4" w:space="0" w:color="E0E0E0"/>
+          <w:insideV w:val="none"/>
         </w:tblBorders>
-        <w:tblLayout w:type="fixed"/>
-        <w:tblLook w:val="0600"/>
       </w:tblPr>
       <w:tblGrid>
-        <w:gridCol w:w="3109"/>
-        <w:gridCol w:w="2662"/>
-        <w:gridCol w:w="3254"/>
-        <w:tblGridChange w:id="0">
-          <w:tblGrid>
-            <w:gridCol w:w="3109"/>
-            <w:gridCol w:w="2662"/>
-            <w:gridCol w:w="3254"/>
-          </w:tblGrid>
-        </w:tblGridChange>
+        <w:gridCol w:w="3010"/>
+        <w:gridCol w:w="3010"/>
+        <w:gridCol w:w="3010"/>
       </w:tblGrid>
       <w:tr>
         <w:trPr>
-          <w:cantSplit w:val="0"/>
-          <w:trHeight w:val="770" w:hRule="atLeast"/>
-          <w:tblHeader w:val="0"/>
+          <w:cantSplit/>
+          <w:tblHeader/>
         </w:trPr>
         <w:tc>
           <w:tcPr>
-            <w:tcBorders>
-              <w:top w:color="000000" w:space="0" w:sz="4" w:val="single"/>
-              <w:left w:color="000000" w:space="0" w:sz="4" w:val="single"/>
-              <w:bottom w:color="000000" w:space="0" w:sz="4" w:val="single"/>
-              <w:right w:color="000000" w:space="0" w:sz="4" w:val="single"/>
-            </w:tcBorders>
-            <w:tcMar>
-              <w:top w:w="100.0" w:type="dxa"/>
-              <w:left w:w="100.0" w:type="dxa"/>
-              <w:bottom w:w="100.0" w:type="dxa"/>
-              <w:right w:w="100.0" w:type="dxa"/>
-            </w:tcMar>
-          </w:tcPr>
-          <w:p>
-            <w:pPr>
-              <w:spacing w:line="360" w:lineRule="auto"/>
-              <w:jc w:val="center"/>
-              <w:rPr>
-                <w:rFonts w:ascii="Times New Roman" w:cs="Times New Roman" w:eastAsia="Times New Roman" w:hAnsi="Times New Roman"/>
-                <w:sz w:val="26"/>
-                <w:szCs w:val="26"/>
-              </w:rPr>
-            </w:pPr>
-            <w:r>
-              <w:rPr>
-                <w:rFonts w:ascii="Times New Roman" w:cs="Times New Roman" w:eastAsia="Times New Roman" w:hAnsi="Times New Roman"/>
-                <w:b w:val="1"/>
-                <w:bCs w:val="1"/>
-                <w:sz w:val="26"/>
-                <w:szCs w:val="26"/>
-                <w:rtl w:val="0"/>
-              </w:rPr>
-              <w:t xml:space="preserve">Hạng mục Chi phí Triển khai (Giả định)</w:t>
-            </w:r>
-            <w:r>
-              <w:rPr>
-                <w:rtl w:val="0"/>
-              </w:rPr>
-            </w:r>
-          </w:p>
-        </w:tc>
-        <w:tc>
-          <w:tcPr>
-            <w:tcBorders>
-              <w:top w:color="000000" w:space="0" w:sz="4" w:val="single"/>
-              <w:left w:color="000000" w:space="0" w:sz="4" w:val="single"/>
-              <w:bottom w:color="000000" w:space="0" w:sz="4" w:val="single"/>
-              <w:right w:color="000000" w:space="0" w:sz="4" w:val="single"/>
-            </w:tcBorders>
-            <w:tcMar>
-              <w:top w:w="100.0" w:type="dxa"/>
-              <w:left w:w="100.0" w:type="dxa"/>
-              <w:bottom w:w="100.0" w:type="dxa"/>
-              <w:right w:w="100.0" w:type="dxa"/>
-            </w:tcMar>
-          </w:tcPr>
-          <w:p>
-            <w:pPr>
-              <w:spacing w:line="360" w:lineRule="auto"/>
-              <w:jc w:val="center"/>
-              <w:rPr>
-                <w:rFonts w:ascii="Times New Roman" w:cs="Times New Roman" w:eastAsia="Times New Roman" w:hAnsi="Times New Roman"/>
-                <w:sz w:val="26"/>
-                <w:szCs w:val="26"/>
-              </w:rPr>
-            </w:pPr>
-            <w:r>
-              <w:rPr>
-                <w:rFonts w:ascii="Times New Roman" w:cs="Times New Roman" w:eastAsia="Times New Roman" w:hAnsi="Times New Roman"/>
-                <w:b w:val="1"/>
-                <w:bCs w:val="1"/>
-                <w:sz w:val="26"/>
-                <w:szCs w:val="26"/>
-                <w:rtl w:val="0"/>
-              </w:rPr>
-              <w:t xml:space="preserve">Xây dựng Mới Hoàn toàn (VNĐ)</w:t>
-            </w:r>
-            <w:r>
-              <w:rPr>
-                <w:rtl w:val="0"/>
-              </w:rPr>
-            </w:r>
-          </w:p>
-        </w:tc>
-        <w:tc>
-          <w:tcPr>
-            <w:tcBorders>
-              <w:top w:color="000000" w:space="0" w:sz="4" w:val="single"/>
-              <w:left w:color="000000" w:space="0" w:sz="4" w:val="single"/>
-              <w:bottom w:color="000000" w:space="0" w:sz="4" w:val="single"/>
-              <w:right w:color="000000" w:space="0" w:sz="4" w:val="single"/>
-            </w:tcBorders>
-            <w:tcMar>
-              <w:top w:w="100.0" w:type="dxa"/>
-              <w:left w:w="100.0" w:type="dxa"/>
-              <w:bottom w:w="100.0" w:type="dxa"/>
-              <w:right w:w="100.0" w:type="dxa"/>
-            </w:tcMar>
-          </w:tcPr>
-          <w:p>
-            <w:pPr>
-              <w:spacing w:line="360" w:lineRule="auto"/>
-              <w:jc w:val="center"/>
-              <w:rPr>
-                <w:rFonts w:ascii="Times New Roman" w:cs="Times New Roman" w:eastAsia="Times New Roman" w:hAnsi="Times New Roman"/>
-                <w:sz w:val="26"/>
-                <w:szCs w:val="26"/>
-              </w:rPr>
-            </w:pPr>
-            <w:r>
-              <w:rPr>
-                <w:rFonts w:ascii="Times New Roman" w:cs="Times New Roman" w:eastAsia="Times New Roman" w:hAnsi="Times New Roman"/>
-                <w:b w:val="1"/>
-                <w:bCs w:val="1"/>
-                <w:sz w:val="26"/>
-                <w:szCs w:val="26"/>
-                <w:rtl w:val="0"/>
-              </w:rPr>
-              <w:t xml:space="preserve">Triển khai dựa trên Hạ tầng Đối tác (VNĐ)</w:t>
-            </w:r>
-            <w:r>
-              <w:rPr>
-                <w:rtl w:val="0"/>
-              </w:rPr>
+            <w:tcW w:type="dxa" w:w="4997"/>
+            <w:shd w:fill="1565C0"/>
+            <w:tcMar>
+              <w:top w:w="55" w:type="dxa"/>
+              <w:bottom w:w="55" w:type="dxa"/>
+              <w:left w:w="70" w:type="dxa"/>
+              <w:right w:w="70" w:type="dxa"/>
+            </w:tcMar>
+          </w:tcPr>
+          <w:p>
+            <w:pPr>
+              <w:spacing w:before="60" w:after="60"/>
+              <w:jc w:val="left"/>
+            </w:pPr>
+            <w:r>
+              <w:rPr>
+                <w:rFonts w:ascii="Segoe UI" w:hAnsi="Segoe UI"/>
+                <w:b/>
+                <w:color w:val="FFFFFF"/>
+                <w:sz w:val="17"/>
+              </w:rPr>
+              <w:t>Hạng mục Chi phí Đầu tư &amp; Căn cứ Định mức</w:t>
+            </w:r>
+          </w:p>
+        </w:tc>
+        <w:tc>
+          <w:tcPr>
+            <w:tcW w:type="dxa" w:w="2016"/>
+            <w:shd w:fill="1565C0"/>
+            <w:tcMar>
+              <w:top w:w="55" w:type="dxa"/>
+              <w:bottom w:w="55" w:type="dxa"/>
+              <w:left w:w="70" w:type="dxa"/>
+              <w:right w:w="70" w:type="dxa"/>
+            </w:tcMar>
+          </w:tcPr>
+          <w:p>
+            <w:pPr>
+              <w:spacing w:before="60" w:after="60"/>
+              <w:jc w:val="right"/>
+            </w:pPr>
+            <w:r>
+              <w:rPr>
+                <w:rFonts w:ascii="Segoe UI" w:hAnsi="Segoe UI"/>
+                <w:b/>
+                <w:color w:val="FFFFFF"/>
+                <w:sz w:val="17"/>
+              </w:rPr>
+              <w:t>Xây dựng Mới Hoàn toàn (VNĐ)</w:t>
+            </w:r>
+          </w:p>
+        </w:tc>
+        <w:tc>
+          <w:tcPr>
+            <w:tcW w:type="dxa" w:w="2016"/>
+            <w:shd w:fill="1565C0"/>
+            <w:tcMar>
+              <w:top w:w="55" w:type="dxa"/>
+              <w:bottom w:w="55" w:type="dxa"/>
+              <w:left w:w="70" w:type="dxa"/>
+              <w:right w:w="70" w:type="dxa"/>
+            </w:tcMar>
+          </w:tcPr>
+          <w:p>
+            <w:pPr>
+              <w:spacing w:before="60" w:after="60"/>
+              <w:jc w:val="right"/>
+            </w:pPr>
+            <w:r>
+              <w:rPr>
+                <w:rFonts w:ascii="Segoe UI" w:hAnsi="Segoe UI"/>
+                <w:b/>
+                <w:color w:val="FFFFFF"/>
+                <w:sz w:val="17"/>
+              </w:rPr>
+              <w:t>Triển khai dựa trên Hạ tầng Đối tác (VNĐ)</w:t>
             </w:r>
           </w:p>
         </w:tc>
       </w:tr>
       <w:tr>
         <w:trPr>
-          <w:cantSplit w:val="0"/>
-          <w:trHeight w:val="770" w:hRule="atLeast"/>
-          <w:tblHeader w:val="0"/>
+          <w:cantSplit/>
         </w:trPr>
         <w:tc>
           <w:tcPr>
-            <w:tcBorders>
-              <w:top w:color="000000" w:space="0" w:sz="4" w:val="single"/>
-              <w:left w:color="000000" w:space="0" w:sz="4" w:val="single"/>
-              <w:bottom w:color="000000" w:space="0" w:sz="4" w:val="single"/>
-              <w:right w:color="000000" w:space="0" w:sz="4" w:val="single"/>
-            </w:tcBorders>
-            <w:tcMar>
-              <w:top w:w="100.0" w:type="dxa"/>
-              <w:left w:w="100.0" w:type="dxa"/>
-              <w:bottom w:w="100.0" w:type="dxa"/>
-              <w:right w:w="100.0" w:type="dxa"/>
-            </w:tcMar>
-          </w:tcPr>
-          <w:p>
-            <w:pPr>
-              <w:spacing w:line="360" w:lineRule="auto"/>
-              <w:jc w:val="both"/>
-              <w:rPr>
-                <w:rFonts w:ascii="Times New Roman" w:cs="Times New Roman" w:eastAsia="Times New Roman" w:hAnsi="Times New Roman"/>
-                <w:sz w:val="26"/>
-                <w:szCs w:val="26"/>
-              </w:rPr>
-            </w:pPr>
-            <w:r>
-              <w:rPr>
-                <w:rFonts w:ascii="Times New Roman" w:cs="Times New Roman" w:eastAsia="Times New Roman" w:hAnsi="Times New Roman"/>
-                <w:b w:val="1"/>
-                <w:bCs w:val="1"/>
-                <w:sz w:val="26"/>
-                <w:szCs w:val="26"/>
-                <w:rtl w:val="0"/>
-              </w:rPr>
-              <w:t xml:space="preserve">Phát triển phần mềm (AI, thuật toán, API)</w:t>
-            </w:r>
-            <w:r>
-              <w:rPr>
-                <w:rtl w:val="0"/>
-              </w:rPr>
-            </w:r>
-          </w:p>
-        </w:tc>
-        <w:tc>
-          <w:tcPr>
-            <w:tcBorders>
-              <w:top w:color="000000" w:space="0" w:sz="4" w:val="single"/>
-              <w:left w:color="000000" w:space="0" w:sz="4" w:val="single"/>
-              <w:bottom w:color="000000" w:space="0" w:sz="4" w:val="single"/>
-              <w:right w:color="000000" w:space="0" w:sz="4" w:val="single"/>
-            </w:tcBorders>
-            <w:tcMar>
-              <w:top w:w="100.0" w:type="dxa"/>
-              <w:left w:w="100.0" w:type="dxa"/>
-              <w:bottom w:w="100.0" w:type="dxa"/>
-              <w:right w:w="100.0" w:type="dxa"/>
-            </w:tcMar>
-          </w:tcPr>
-          <w:p>
-            <w:pPr>
-              <w:spacing w:line="360" w:lineRule="auto"/>
-              <w:jc w:val="center"/>
-              <w:rPr>
-                <w:rFonts w:ascii="Times New Roman" w:cs="Times New Roman" w:eastAsia="Times New Roman" w:hAnsi="Times New Roman"/>
-                <w:sz w:val="26"/>
-                <w:szCs w:val="26"/>
-              </w:rPr>
-            </w:pPr>
-            <w:r>
-              <w:rPr>
-                <w:rFonts w:ascii="Times New Roman" w:cs="Times New Roman" w:eastAsia="Times New Roman" w:hAnsi="Times New Roman"/>
-                <w:sz w:val="26"/>
-                <w:szCs w:val="26"/>
-                <w:rtl w:val="0"/>
-              </w:rPr>
-              <w:t xml:space="preserve">1.837.500.000</w:t>
-            </w:r>
-          </w:p>
-        </w:tc>
-        <w:tc>
-          <w:tcPr>
-            <w:tcBorders>
-              <w:top w:color="000000" w:space="0" w:sz="4" w:val="single"/>
-              <w:left w:color="000000" w:space="0" w:sz="4" w:val="single"/>
-              <w:bottom w:color="000000" w:space="0" w:sz="4" w:val="single"/>
-              <w:right w:color="000000" w:space="0" w:sz="4" w:val="single"/>
-            </w:tcBorders>
-            <w:tcMar>
-              <w:top w:w="100.0" w:type="dxa"/>
-              <w:left w:w="100.0" w:type="dxa"/>
-              <w:bottom w:w="100.0" w:type="dxa"/>
-              <w:right w:w="100.0" w:type="dxa"/>
-            </w:tcMar>
-          </w:tcPr>
-          <w:p>
-            <w:pPr>
-              <w:spacing w:line="360" w:lineRule="auto"/>
-              <w:jc w:val="center"/>
-              <w:rPr>
-                <w:rFonts w:ascii="Times New Roman" w:cs="Times New Roman" w:eastAsia="Times New Roman" w:hAnsi="Times New Roman"/>
-                <w:sz w:val="26"/>
-                <w:szCs w:val="26"/>
-              </w:rPr>
-            </w:pPr>
-            <w:r>
-              <w:rPr>
-                <w:rFonts w:ascii="Times New Roman" w:cs="Times New Roman" w:eastAsia="Times New Roman" w:hAnsi="Times New Roman"/>
-                <w:sz w:val="26"/>
-                <w:szCs w:val="26"/>
-                <w:rtl w:val="0"/>
-              </w:rPr>
-              <w:t xml:space="preserve">1.125.000.000</w:t>
-            </w:r>
+            <w:tcW w:type="dxa" w:w="2016"/>
+            <w:gridSpan w:val="3"/>
+            <w:shd w:fill="E3F2FD"/>
+            <w:tcMar>
+              <w:top w:w="45" w:type="dxa"/>
+              <w:bottom w:w="45" w:type="dxa"/>
+              <w:left w:w="70" w:type="dxa"/>
+              <w:right w:w="70" w:type="dxa"/>
+            </w:tcMar>
+          </w:tcPr>
+          <w:p>
+            <w:pPr>
+              <w:keepNext/>
+              <w:spacing w:before="60" w:after="40"/>
+              <w:jc w:val="left"/>
+            </w:pPr>
+            <w:r>
+              <w:rPr>
+                <w:rFonts w:ascii="Segoe UI" w:hAnsi="Segoe UI"/>
+                <w:b/>
+                <w:color w:val="0D47A1"/>
+                <w:sz w:val="17"/>
+              </w:rPr>
+              <w:t>I. PHÁT TRIỂN NỀN TẢNG PHẦN MỀM &amp; ĐỘNG CƠ AI LÕI</w:t>
+            </w:r>
+          </w:p>
+          <w:p>
+            <w:r/>
+          </w:p>
+          <w:p>
+            <w:r/>
           </w:p>
         </w:tc>
       </w:tr>
       <w:tr>
         <w:trPr>
-          <w:cantSplit w:val="0"/>
-          <w:trHeight w:val="770" w:hRule="atLeast"/>
-          <w:tblHeader w:val="0"/>
+          <w:cantSplit/>
         </w:trPr>
         <w:tc>
           <w:tcPr>
-            <w:tcBorders>
-              <w:top w:color="000000" w:space="0" w:sz="4" w:val="single"/>
-              <w:left w:color="000000" w:space="0" w:sz="4" w:val="single"/>
-              <w:bottom w:color="000000" w:space="0" w:sz="4" w:val="single"/>
-              <w:right w:color="000000" w:space="0" w:sz="4" w:val="single"/>
-            </w:tcBorders>
-            <w:tcMar>
-              <w:top w:w="100.0" w:type="dxa"/>
-              <w:left w:w="100.0" w:type="dxa"/>
-              <w:bottom w:w="100.0" w:type="dxa"/>
-              <w:right w:w="100.0" w:type="dxa"/>
-            </w:tcMar>
-          </w:tcPr>
-          <w:p>
-            <w:pPr>
-              <w:spacing w:line="360" w:lineRule="auto"/>
-              <w:jc w:val="both"/>
-              <w:rPr>
-                <w:rFonts w:ascii="Times New Roman" w:cs="Times New Roman" w:eastAsia="Times New Roman" w:hAnsi="Times New Roman"/>
-                <w:sz w:val="26"/>
-                <w:szCs w:val="26"/>
-              </w:rPr>
-            </w:pPr>
-            <w:r>
-              <w:rPr>
-                <w:rFonts w:ascii="Times New Roman" w:cs="Times New Roman" w:eastAsia="Times New Roman" w:hAnsi="Times New Roman"/>
-                <w:b w:val="1"/>
-                <w:bCs w:val="1"/>
-                <w:sz w:val="26"/>
-                <w:szCs w:val="26"/>
-                <w:rtl w:val="0"/>
-              </w:rPr>
-              <w:t xml:space="preserve">Cơ sở hạ tầng &amp; Điện toán Đám mây</w:t>
-            </w:r>
-            <w:r>
-              <w:rPr>
-                <w:rtl w:val="0"/>
-              </w:rPr>
-            </w:r>
-          </w:p>
-        </w:tc>
-        <w:tc>
-          <w:tcPr>
-            <w:tcBorders>
-              <w:top w:color="000000" w:space="0" w:sz="4" w:val="single"/>
-              <w:left w:color="000000" w:space="0" w:sz="4" w:val="single"/>
-              <w:bottom w:color="000000" w:space="0" w:sz="4" w:val="single"/>
-              <w:right w:color="000000" w:space="0" w:sz="4" w:val="single"/>
-            </w:tcBorders>
-            <w:tcMar>
-              <w:top w:w="100.0" w:type="dxa"/>
-              <w:left w:w="100.0" w:type="dxa"/>
-              <w:bottom w:w="100.0" w:type="dxa"/>
-              <w:right w:w="100.0" w:type="dxa"/>
-            </w:tcMar>
-          </w:tcPr>
-          <w:p>
-            <w:pPr>
-              <w:spacing w:line="360" w:lineRule="auto"/>
-              <w:jc w:val="center"/>
-              <w:rPr>
-                <w:rFonts w:ascii="Times New Roman" w:cs="Times New Roman" w:eastAsia="Times New Roman" w:hAnsi="Times New Roman"/>
-                <w:sz w:val="26"/>
-                <w:szCs w:val="26"/>
-              </w:rPr>
-            </w:pPr>
-            <w:r>
-              <w:rPr>
-                <w:rFonts w:ascii="Times New Roman" w:cs="Times New Roman" w:eastAsia="Times New Roman" w:hAnsi="Times New Roman"/>
-                <w:sz w:val="26"/>
-                <w:szCs w:val="26"/>
-                <w:rtl w:val="0"/>
-              </w:rPr>
-              <w:t xml:space="preserve">175.000.000</w:t>
-            </w:r>
-          </w:p>
-        </w:tc>
-        <w:tc>
-          <w:tcPr>
-            <w:tcBorders>
-              <w:top w:color="000000" w:space="0" w:sz="4" w:val="single"/>
-              <w:left w:color="000000" w:space="0" w:sz="4" w:val="single"/>
-              <w:bottom w:color="000000" w:space="0" w:sz="4" w:val="single"/>
-              <w:right w:color="000000" w:space="0" w:sz="4" w:val="single"/>
-            </w:tcBorders>
-            <w:tcMar>
-              <w:top w:w="100.0" w:type="dxa"/>
-              <w:left w:w="100.0" w:type="dxa"/>
-              <w:bottom w:w="100.0" w:type="dxa"/>
-              <w:right w:w="100.0" w:type="dxa"/>
-            </w:tcMar>
-          </w:tcPr>
-          <w:p>
-            <w:pPr>
-              <w:spacing w:line="360" w:lineRule="auto"/>
-              <w:jc w:val="center"/>
-              <w:rPr>
-                <w:rFonts w:ascii="Times New Roman" w:cs="Times New Roman" w:eastAsia="Times New Roman" w:hAnsi="Times New Roman"/>
-                <w:sz w:val="26"/>
-                <w:szCs w:val="26"/>
-              </w:rPr>
-            </w:pPr>
-            <w:r>
-              <w:rPr>
-                <w:rFonts w:ascii="Times New Roman" w:cs="Times New Roman" w:eastAsia="Times New Roman" w:hAnsi="Times New Roman"/>
-                <w:sz w:val="26"/>
-                <w:szCs w:val="26"/>
-                <w:rtl w:val="0"/>
-              </w:rPr>
-              <w:t xml:space="preserve">175.000.000</w:t>
+            <w:tcW w:type="dxa" w:w="4997"/>
+            <w:shd w:fill="FFFFFF"/>
+            <w:tcMar>
+              <w:top w:w="35" w:type="dxa"/>
+              <w:bottom w:w="35" w:type="dxa"/>
+              <w:left w:w="60" w:type="dxa"/>
+              <w:right w:w="60" w:type="dxa"/>
+            </w:tcMar>
+          </w:tcPr>
+          <w:p>
+            <w:pPr>
+              <w:spacing w:before="30" w:after="30"/>
+              <w:jc w:val="left"/>
+            </w:pPr>
+            <w:r>
+              <w:rPr>
+                <w:rFonts w:ascii="Segoe UI" w:hAnsi="Segoe UI"/>
+                <w:color w:val="212121"/>
+                <w:sz w:val="15"/>
+              </w:rPr>
+              <w:t>1.1. Nghiên cứu &amp; Huấn luyện Động cơ AI Dự báo (XGBoost, OLS, RF &amp; Vi khí hậu)</w:t>
+              <w:br/>
+              <w:t xml:space="preserve">   [Lead AI Engineer: 4 man-months × 45.000.000 VNĐ/tháng]</w:t>
+            </w:r>
+          </w:p>
+        </w:tc>
+        <w:tc>
+          <w:tcPr>
+            <w:tcW w:type="dxa" w:w="2016"/>
+            <w:shd w:fill="FFFFFF"/>
+            <w:tcMar>
+              <w:top w:w="35" w:type="dxa"/>
+              <w:bottom w:w="35" w:type="dxa"/>
+              <w:left w:w="60" w:type="dxa"/>
+              <w:right w:w="60" w:type="dxa"/>
+            </w:tcMar>
+          </w:tcPr>
+          <w:p>
+            <w:pPr>
+              <w:spacing w:before="30" w:after="30"/>
+              <w:jc w:val="right"/>
+            </w:pPr>
+            <w:r>
+              <w:rPr>
+                <w:rFonts w:ascii="Consolas" w:hAnsi="Consolas"/>
+                <w:color w:val="212121"/>
+                <w:sz w:val="16"/>
+              </w:rPr>
+              <w:t>180.000.000</w:t>
+            </w:r>
+          </w:p>
+        </w:tc>
+        <w:tc>
+          <w:tcPr>
+            <w:tcW w:type="dxa" w:w="2016"/>
+            <w:shd w:fill="FFFFFF"/>
+            <w:tcMar>
+              <w:top w:w="35" w:type="dxa"/>
+              <w:bottom w:w="35" w:type="dxa"/>
+              <w:left w:w="60" w:type="dxa"/>
+              <w:right w:w="60" w:type="dxa"/>
+            </w:tcMar>
+          </w:tcPr>
+          <w:p>
+            <w:pPr>
+              <w:spacing w:before="30" w:after="30"/>
+              <w:jc w:val="right"/>
+            </w:pPr>
+            <w:r>
+              <w:rPr>
+                <w:rFonts w:ascii="Consolas" w:hAnsi="Consolas"/>
+                <w:color w:val="212121"/>
+                <w:sz w:val="16"/>
+              </w:rPr>
+              <w:t>180.000.000</w:t>
             </w:r>
           </w:p>
         </w:tc>
       </w:tr>
       <w:tr>
         <w:trPr>
-          <w:cantSplit w:val="0"/>
-          <w:trHeight w:val="500" w:hRule="atLeast"/>
-          <w:tblHeader w:val="0"/>
+          <w:cantSplit/>
         </w:trPr>
         <w:tc>
           <w:tcPr>
-            <w:tcBorders>
-              <w:top w:color="000000" w:space="0" w:sz="4" w:val="single"/>
-              <w:left w:color="000000" w:space="0" w:sz="4" w:val="single"/>
-              <w:bottom w:color="000000" w:space="0" w:sz="4" w:val="single"/>
-              <w:right w:color="000000" w:space="0" w:sz="4" w:val="single"/>
-            </w:tcBorders>
-            <w:tcMar>
-              <w:top w:w="100.0" w:type="dxa"/>
-              <w:left w:w="100.0" w:type="dxa"/>
-              <w:bottom w:w="100.0" w:type="dxa"/>
-              <w:right w:w="100.0" w:type="dxa"/>
-            </w:tcMar>
-          </w:tcPr>
-          <w:p>
-            <w:pPr>
-              <w:spacing w:line="360" w:lineRule="auto"/>
-              <w:jc w:val="both"/>
-              <w:rPr>
-                <w:rFonts w:ascii="Times New Roman" w:cs="Times New Roman" w:eastAsia="Times New Roman" w:hAnsi="Times New Roman"/>
-                <w:sz w:val="26"/>
-                <w:szCs w:val="26"/>
-              </w:rPr>
-            </w:pPr>
-            <w:r>
-              <w:rPr>
-                <w:rFonts w:ascii="Times New Roman" w:cs="Times New Roman" w:eastAsia="Times New Roman" w:hAnsi="Times New Roman"/>
-                <w:b w:val="1"/>
-                <w:bCs w:val="1"/>
-                <w:sz w:val="26"/>
-                <w:szCs w:val="26"/>
-                <w:rtl w:val="0"/>
-              </w:rPr>
-              <w:t xml:space="preserve">Bảo mật &amp; Go-live</w:t>
-            </w:r>
-            <w:r>
-              <w:rPr>
-                <w:rtl w:val="0"/>
-              </w:rPr>
-            </w:r>
-          </w:p>
-        </w:tc>
-        <w:tc>
-          <w:tcPr>
-            <w:tcBorders>
-              <w:top w:color="000000" w:space="0" w:sz="4" w:val="single"/>
-              <w:left w:color="000000" w:space="0" w:sz="4" w:val="single"/>
-              <w:bottom w:color="000000" w:space="0" w:sz="4" w:val="single"/>
-              <w:right w:color="000000" w:space="0" w:sz="4" w:val="single"/>
-            </w:tcBorders>
-            <w:tcMar>
-              <w:top w:w="100.0" w:type="dxa"/>
-              <w:left w:w="100.0" w:type="dxa"/>
-              <w:bottom w:w="100.0" w:type="dxa"/>
-              <w:right w:w="100.0" w:type="dxa"/>
-            </w:tcMar>
-          </w:tcPr>
-          <w:p>
-            <w:pPr>
-              <w:spacing w:line="360" w:lineRule="auto"/>
-              <w:jc w:val="center"/>
-              <w:rPr>
-                <w:rFonts w:ascii="Times New Roman" w:cs="Times New Roman" w:eastAsia="Times New Roman" w:hAnsi="Times New Roman"/>
-                <w:sz w:val="26"/>
-                <w:szCs w:val="26"/>
-              </w:rPr>
-            </w:pPr>
-            <w:r>
-              <w:rPr>
-                <w:rFonts w:ascii="Times New Roman" w:cs="Times New Roman" w:eastAsia="Times New Roman" w:hAnsi="Times New Roman"/>
-                <w:sz w:val="26"/>
-                <w:szCs w:val="26"/>
-                <w:rtl w:val="0"/>
-              </w:rPr>
-              <w:t xml:space="preserve">300.000.000</w:t>
-            </w:r>
-          </w:p>
-        </w:tc>
-        <w:tc>
-          <w:tcPr>
-            <w:tcBorders>
-              <w:top w:color="000000" w:space="0" w:sz="4" w:val="single"/>
-              <w:left w:color="000000" w:space="0" w:sz="4" w:val="single"/>
-              <w:bottom w:color="000000" w:space="0" w:sz="4" w:val="single"/>
-              <w:right w:color="000000" w:space="0" w:sz="4" w:val="single"/>
-            </w:tcBorders>
-            <w:tcMar>
-              <w:top w:w="100.0" w:type="dxa"/>
-              <w:left w:w="100.0" w:type="dxa"/>
-              <w:bottom w:w="100.0" w:type="dxa"/>
-              <w:right w:w="100.0" w:type="dxa"/>
-            </w:tcMar>
-          </w:tcPr>
-          <w:p>
-            <w:pPr>
-              <w:spacing w:line="360" w:lineRule="auto"/>
-              <w:jc w:val="center"/>
-              <w:rPr>
-                <w:rFonts w:ascii="Times New Roman" w:cs="Times New Roman" w:eastAsia="Times New Roman" w:hAnsi="Times New Roman"/>
-                <w:sz w:val="26"/>
-                <w:szCs w:val="26"/>
-              </w:rPr>
-            </w:pPr>
-            <w:r>
-              <w:rPr>
-                <w:rFonts w:ascii="Times New Roman" w:cs="Times New Roman" w:eastAsia="Times New Roman" w:hAnsi="Times New Roman"/>
-                <w:sz w:val="26"/>
-                <w:szCs w:val="26"/>
-                <w:rtl w:val="0"/>
-              </w:rPr>
-              <w:t xml:space="preserve">250.000.000</w:t>
+            <w:tcW w:type="dxa" w:w="4997"/>
+            <w:shd w:fill="F8F9FA"/>
+            <w:tcMar>
+              <w:top w:w="35" w:type="dxa"/>
+              <w:bottom w:w="35" w:type="dxa"/>
+              <w:left w:w="60" w:type="dxa"/>
+              <w:right w:w="60" w:type="dxa"/>
+            </w:tcMar>
+          </w:tcPr>
+          <w:p>
+            <w:pPr>
+              <w:spacing w:before="30" w:after="30"/>
+              <w:jc w:val="left"/>
+            </w:pPr>
+            <w:r>
+              <w:rPr>
+                <w:rFonts w:ascii="Segoe UI" w:hAnsi="Segoe UI"/>
+                <w:color w:val="212121"/>
+                <w:sz w:val="15"/>
+              </w:rPr>
+              <w:t>1.2. Thuật toán Tối ưu hóa Điều phối Đội xe Hỗn hợp &amp; Quy hoạch Tuyến tính</w:t>
+              <w:br/>
+              <w:t xml:space="preserve">   [Senior Optimization Engineer: 3.5 man-months × 40.000.000 VNĐ/tháng]</w:t>
+            </w:r>
+          </w:p>
+        </w:tc>
+        <w:tc>
+          <w:tcPr>
+            <w:tcW w:type="dxa" w:w="2016"/>
+            <w:shd w:fill="F8F9FA"/>
+            <w:tcMar>
+              <w:top w:w="35" w:type="dxa"/>
+              <w:bottom w:w="35" w:type="dxa"/>
+              <w:left w:w="60" w:type="dxa"/>
+              <w:right w:w="60" w:type="dxa"/>
+            </w:tcMar>
+          </w:tcPr>
+          <w:p>
+            <w:pPr>
+              <w:spacing w:before="30" w:after="30"/>
+              <w:jc w:val="right"/>
+            </w:pPr>
+            <w:r>
+              <w:rPr>
+                <w:rFonts w:ascii="Consolas" w:hAnsi="Consolas"/>
+                <w:color w:val="212121"/>
+                <w:sz w:val="16"/>
+              </w:rPr>
+              <w:t>140.000.000</w:t>
+            </w:r>
+          </w:p>
+        </w:tc>
+        <w:tc>
+          <w:tcPr>
+            <w:tcW w:type="dxa" w:w="2016"/>
+            <w:shd w:fill="F8F9FA"/>
+            <w:tcMar>
+              <w:top w:w="35" w:type="dxa"/>
+              <w:bottom w:w="35" w:type="dxa"/>
+              <w:left w:w="60" w:type="dxa"/>
+              <w:right w:w="60" w:type="dxa"/>
+            </w:tcMar>
+          </w:tcPr>
+          <w:p>
+            <w:pPr>
+              <w:spacing w:before="30" w:after="30"/>
+              <w:jc w:val="right"/>
+            </w:pPr>
+            <w:r>
+              <w:rPr>
+                <w:rFonts w:ascii="Consolas" w:hAnsi="Consolas"/>
+                <w:color w:val="212121"/>
+                <w:sz w:val="16"/>
+              </w:rPr>
+              <w:t>140.000.000</w:t>
             </w:r>
           </w:p>
         </w:tc>
       </w:tr>
       <w:tr>
         <w:trPr>
-          <w:cantSplit w:val="0"/>
-          <w:trHeight w:val="770" w:hRule="atLeast"/>
-          <w:tblHeader w:val="0"/>
+          <w:cantSplit/>
         </w:trPr>
         <w:tc>
           <w:tcPr>
-            <w:tcBorders>
-              <w:top w:color="000000" w:space="0" w:sz="4" w:val="single"/>
-              <w:left w:color="000000" w:space="0" w:sz="4" w:val="single"/>
-              <w:bottom w:color="000000" w:space="0" w:sz="4" w:val="single"/>
-              <w:right w:color="000000" w:space="0" w:sz="4" w:val="single"/>
-            </w:tcBorders>
-            <w:tcMar>
-              <w:top w:w="100.0" w:type="dxa"/>
-              <w:left w:w="100.0" w:type="dxa"/>
-              <w:bottom w:w="100.0" w:type="dxa"/>
-              <w:right w:w="100.0" w:type="dxa"/>
-            </w:tcMar>
-          </w:tcPr>
-          <w:p>
-            <w:pPr>
-              <w:spacing w:line="360" w:lineRule="auto"/>
-              <w:jc w:val="both"/>
-              <w:rPr>
-                <w:rFonts w:ascii="Times New Roman" w:cs="Times New Roman" w:eastAsia="Times New Roman" w:hAnsi="Times New Roman"/>
-                <w:sz w:val="26"/>
-                <w:szCs w:val="26"/>
-              </w:rPr>
-            </w:pPr>
-            <w:r>
-              <w:rPr>
-                <w:rFonts w:ascii="Times New Roman" w:cs="Times New Roman" w:eastAsia="Times New Roman" w:hAnsi="Times New Roman"/>
-                <w:b w:val="1"/>
-                <w:bCs w:val="1"/>
-                <w:sz w:val="26"/>
-                <w:szCs w:val="26"/>
-                <w:rtl w:val="0"/>
-              </w:rPr>
-              <w:t xml:space="preserve">Chi phí Marketing &amp; Khởi động</w:t>
-            </w:r>
-            <w:r>
-              <w:rPr>
-                <w:rtl w:val="0"/>
-              </w:rPr>
-            </w:r>
-          </w:p>
-        </w:tc>
-        <w:tc>
-          <w:tcPr>
-            <w:tcBorders>
-              <w:top w:color="000000" w:space="0" w:sz="4" w:val="single"/>
-              <w:left w:color="000000" w:space="0" w:sz="4" w:val="single"/>
-              <w:bottom w:color="000000" w:space="0" w:sz="4" w:val="single"/>
-              <w:right w:color="000000" w:space="0" w:sz="4" w:val="single"/>
-            </w:tcBorders>
-            <w:tcMar>
-              <w:top w:w="100.0" w:type="dxa"/>
-              <w:left w:w="100.0" w:type="dxa"/>
-              <w:bottom w:w="100.0" w:type="dxa"/>
-              <w:right w:w="100.0" w:type="dxa"/>
-            </w:tcMar>
-          </w:tcPr>
-          <w:p>
-            <w:pPr>
-              <w:spacing w:line="360" w:lineRule="auto"/>
-              <w:jc w:val="center"/>
-              <w:rPr>
-                <w:rFonts w:ascii="Times New Roman" w:cs="Times New Roman" w:eastAsia="Times New Roman" w:hAnsi="Times New Roman"/>
-                <w:sz w:val="26"/>
-                <w:szCs w:val="26"/>
-              </w:rPr>
-            </w:pPr>
-            <w:r>
-              <w:rPr>
-                <w:rFonts w:ascii="Times New Roman" w:cs="Times New Roman" w:eastAsia="Times New Roman" w:hAnsi="Times New Roman"/>
-                <w:sz w:val="26"/>
-                <w:szCs w:val="26"/>
-                <w:rtl w:val="0"/>
-              </w:rPr>
-              <w:t xml:space="preserve">500.000.000</w:t>
-            </w:r>
-          </w:p>
-        </w:tc>
-        <w:tc>
-          <w:tcPr>
-            <w:tcBorders>
-              <w:top w:color="000000" w:space="0" w:sz="4" w:val="single"/>
-              <w:left w:color="000000" w:space="0" w:sz="4" w:val="single"/>
-              <w:bottom w:color="000000" w:space="0" w:sz="4" w:val="single"/>
-              <w:right w:color="000000" w:space="0" w:sz="4" w:val="single"/>
-            </w:tcBorders>
-            <w:tcMar>
-              <w:top w:w="100.0" w:type="dxa"/>
-              <w:left w:w="100.0" w:type="dxa"/>
-              <w:bottom w:w="100.0" w:type="dxa"/>
-              <w:right w:w="100.0" w:type="dxa"/>
-            </w:tcMar>
-          </w:tcPr>
-          <w:p>
-            <w:pPr>
-              <w:spacing w:line="360" w:lineRule="auto"/>
-              <w:jc w:val="center"/>
-              <w:rPr>
-                <w:rFonts w:ascii="Times New Roman" w:cs="Times New Roman" w:eastAsia="Times New Roman" w:hAnsi="Times New Roman"/>
-                <w:sz w:val="26"/>
-                <w:szCs w:val="26"/>
-              </w:rPr>
-            </w:pPr>
-            <w:r>
-              <w:rPr>
-                <w:rFonts w:ascii="Times New Roman" w:cs="Times New Roman" w:eastAsia="Times New Roman" w:hAnsi="Times New Roman"/>
-                <w:sz w:val="26"/>
-                <w:szCs w:val="26"/>
-                <w:rtl w:val="0"/>
-              </w:rPr>
-              <w:t xml:space="preserve">300.000.000</w:t>
+            <w:tcW w:type="dxa" w:w="4997"/>
+            <w:shd w:fill="FFFFFF"/>
+            <w:tcMar>
+              <w:top w:w="35" w:type="dxa"/>
+              <w:bottom w:w="35" w:type="dxa"/>
+              <w:left w:w="60" w:type="dxa"/>
+              <w:right w:w="60" w:type="dxa"/>
+            </w:tcMar>
+          </w:tcPr>
+          <w:p>
+            <w:pPr>
+              <w:spacing w:before="30" w:after="30"/>
+              <w:jc w:val="left"/>
+            </w:pPr>
+            <w:r>
+              <w:rPr>
+                <w:rFonts w:ascii="Segoe UI" w:hAnsi="Segoe UI"/>
+                <w:color w:val="212121"/>
+                <w:sz w:val="15"/>
+              </w:rPr>
+              <w:t>1.3. Hệ thống Quản lý Vận tải (TMS Core) &amp; Ghép chuyến Đa tầng</w:t>
+              <w:br/>
+              <w:t xml:space="preserve">   [Xây mới: 8 MM × 35tr | Đối tác: Tích hợp Module vào TMS có sẵn của Viettel Post]</w:t>
+            </w:r>
+          </w:p>
+        </w:tc>
+        <w:tc>
+          <w:tcPr>
+            <w:tcW w:type="dxa" w:w="2016"/>
+            <w:shd w:fill="FFFFFF"/>
+            <w:tcMar>
+              <w:top w:w="35" w:type="dxa"/>
+              <w:bottom w:w="35" w:type="dxa"/>
+              <w:left w:w="60" w:type="dxa"/>
+              <w:right w:w="60" w:type="dxa"/>
+            </w:tcMar>
+          </w:tcPr>
+          <w:p>
+            <w:pPr>
+              <w:spacing w:before="30" w:after="30"/>
+              <w:jc w:val="right"/>
+            </w:pPr>
+            <w:r>
+              <w:rPr>
+                <w:rFonts w:ascii="Consolas" w:hAnsi="Consolas"/>
+                <w:color w:val="212121"/>
+                <w:sz w:val="16"/>
+              </w:rPr>
+              <w:t>280.000.000</w:t>
+            </w:r>
+          </w:p>
+        </w:tc>
+        <w:tc>
+          <w:tcPr>
+            <w:tcW w:type="dxa" w:w="2016"/>
+            <w:shd w:fill="FFFFFF"/>
+            <w:tcMar>
+              <w:top w:w="35" w:type="dxa"/>
+              <w:bottom w:w="35" w:type="dxa"/>
+              <w:left w:w="60" w:type="dxa"/>
+              <w:right w:w="60" w:type="dxa"/>
+            </w:tcMar>
+          </w:tcPr>
+          <w:p>
+            <w:pPr>
+              <w:spacing w:before="30" w:after="30"/>
+              <w:jc w:val="right"/>
+            </w:pPr>
+            <w:r>
+              <w:rPr>
+                <w:rFonts w:ascii="Consolas" w:hAnsi="Consolas"/>
+                <w:color w:val="212121"/>
+                <w:sz w:val="16"/>
+              </w:rPr>
+              <w:t>105.000.000</w:t>
             </w:r>
           </w:p>
         </w:tc>
       </w:tr>
       <w:tr>
         <w:trPr>
-          <w:cantSplit w:val="0"/>
-          <w:trHeight w:val="770" w:hRule="atLeast"/>
-          <w:tblHeader w:val="0"/>
+          <w:cantSplit/>
         </w:trPr>
         <w:tc>
           <w:tcPr>
-            <w:tcBorders>
-              <w:top w:color="000000" w:space="0" w:sz="4" w:val="single"/>
-              <w:left w:color="000000" w:space="0" w:sz="4" w:val="single"/>
-              <w:bottom w:color="000000" w:space="0" w:sz="4" w:val="single"/>
-              <w:right w:color="000000" w:space="0" w:sz="4" w:val="single"/>
-            </w:tcBorders>
-            <w:tcMar>
-              <w:top w:w="100.0" w:type="dxa"/>
-              <w:left w:w="100.0" w:type="dxa"/>
-              <w:bottom w:w="100.0" w:type="dxa"/>
-              <w:right w:w="100.0" w:type="dxa"/>
-            </w:tcMar>
-          </w:tcPr>
-          <w:p>
-            <w:pPr>
-              <w:spacing w:line="360" w:lineRule="auto"/>
-              <w:jc w:val="both"/>
-              <w:rPr>
-                <w:rFonts w:ascii="Times New Roman" w:cs="Times New Roman" w:eastAsia="Times New Roman" w:hAnsi="Times New Roman"/>
-                <w:sz w:val="26"/>
-                <w:szCs w:val="26"/>
-              </w:rPr>
-            </w:pPr>
-            <w:r>
-              <w:rPr>
-                <w:rFonts w:ascii="Times New Roman" w:cs="Times New Roman" w:eastAsia="Times New Roman" w:hAnsi="Times New Roman"/>
-                <w:b w:val="1"/>
-                <w:bCs w:val="1"/>
-                <w:sz w:val="26"/>
-                <w:szCs w:val="26"/>
-                <w:rtl w:val="0"/>
-              </w:rPr>
-              <w:t xml:space="preserve">Tổng Chi phí Đầu tư Ban đầu (CAPEX)</w:t>
-            </w:r>
-            <w:r>
-              <w:rPr>
-                <w:rtl w:val="0"/>
-              </w:rPr>
-            </w:r>
-          </w:p>
-        </w:tc>
-        <w:tc>
-          <w:tcPr>
-            <w:tcBorders>
-              <w:top w:color="000000" w:space="0" w:sz="4" w:val="single"/>
-              <w:left w:color="000000" w:space="0" w:sz="4" w:val="single"/>
-              <w:bottom w:color="000000" w:space="0" w:sz="4" w:val="single"/>
-              <w:right w:color="000000" w:space="0" w:sz="4" w:val="single"/>
-            </w:tcBorders>
-            <w:tcMar>
-              <w:top w:w="100.0" w:type="dxa"/>
-              <w:left w:w="100.0" w:type="dxa"/>
-              <w:bottom w:w="100.0" w:type="dxa"/>
-              <w:right w:w="100.0" w:type="dxa"/>
-            </w:tcMar>
-          </w:tcPr>
-          <w:p>
-            <w:pPr>
-              <w:spacing w:line="360" w:lineRule="auto"/>
-              <w:jc w:val="center"/>
-              <w:rPr>
-                <w:rFonts w:ascii="Times New Roman" w:cs="Times New Roman" w:eastAsia="Times New Roman" w:hAnsi="Times New Roman"/>
-                <w:sz w:val="26"/>
-                <w:szCs w:val="26"/>
-              </w:rPr>
-            </w:pPr>
-            <w:r>
-              <w:rPr>
-                <w:rFonts w:ascii="Times New Roman" w:cs="Times New Roman" w:eastAsia="Times New Roman" w:hAnsi="Times New Roman"/>
-                <w:b w:val="1"/>
-                <w:bCs w:val="1"/>
-                <w:sz w:val="26"/>
-                <w:szCs w:val="26"/>
-                <w:rtl w:val="0"/>
-              </w:rPr>
-              <w:t xml:space="preserve">2.812.500.000</w:t>
-            </w:r>
-            <w:r>
-              <w:rPr>
-                <w:rtl w:val="0"/>
-              </w:rPr>
-            </w:r>
-          </w:p>
-        </w:tc>
-        <w:tc>
-          <w:tcPr>
-            <w:tcBorders>
-              <w:top w:color="000000" w:space="0" w:sz="4" w:val="single"/>
-              <w:left w:color="000000" w:space="0" w:sz="4" w:val="single"/>
-              <w:bottom w:color="000000" w:space="0" w:sz="4" w:val="single"/>
-              <w:right w:color="000000" w:space="0" w:sz="4" w:val="single"/>
-            </w:tcBorders>
-            <w:tcMar>
-              <w:top w:w="100.0" w:type="dxa"/>
-              <w:left w:w="100.0" w:type="dxa"/>
-              <w:bottom w:w="100.0" w:type="dxa"/>
-              <w:right w:w="100.0" w:type="dxa"/>
-            </w:tcMar>
-          </w:tcPr>
-          <w:p>
-            <w:pPr>
-              <w:spacing w:line="360" w:lineRule="auto"/>
-              <w:jc w:val="center"/>
-              <w:rPr>
-                <w:rFonts w:ascii="Times New Roman" w:cs="Times New Roman" w:eastAsia="Times New Roman" w:hAnsi="Times New Roman"/>
-                <w:sz w:val="26"/>
-                <w:szCs w:val="26"/>
-              </w:rPr>
-            </w:pPr>
-            <w:r>
-              <w:rPr>
-                <w:rFonts w:ascii="Times New Roman" w:cs="Times New Roman" w:eastAsia="Times New Roman" w:hAnsi="Times New Roman"/>
-                <w:b w:val="1"/>
-                <w:bCs w:val="1"/>
-                <w:sz w:val="26"/>
-                <w:szCs w:val="26"/>
-                <w:rtl w:val="0"/>
-              </w:rPr>
-              <w:t xml:space="preserve">1.850.000.000</w:t>
-            </w:r>
-            <w:r>
-              <w:rPr>
-                <w:rtl w:val="0"/>
-              </w:rPr>
+            <w:tcW w:type="dxa" w:w="4997"/>
+            <w:shd w:fill="F8F9FA"/>
+            <w:tcMar>
+              <w:top w:w="35" w:type="dxa"/>
+              <w:bottom w:w="35" w:type="dxa"/>
+              <w:left w:w="60" w:type="dxa"/>
+              <w:right w:w="60" w:type="dxa"/>
+            </w:tcMar>
+          </w:tcPr>
+          <w:p>
+            <w:pPr>
+              <w:spacing w:before="30" w:after="30"/>
+              <w:jc w:val="left"/>
+            </w:pPr>
+            <w:r>
+              <w:rPr>
+                <w:rFonts w:ascii="Segoe UI" w:hAnsi="Segoe UI"/>
+                <w:color w:val="212121"/>
+                <w:sz w:val="15"/>
+              </w:rPr>
+              <w:t>1.4. Ứng dụng Di động Đa nền tảng (Mobile App cho HTX &amp; Tài xế - iOS/Android)</w:t>
+              <w:br/>
+              <w:t xml:space="preserve">   [Xây mới: 2 Mobile Devs × 5 MM × 30tr | Đối tác: Mini-App trên hệ sinh thái đối tác]</w:t>
+            </w:r>
+          </w:p>
+        </w:tc>
+        <w:tc>
+          <w:tcPr>
+            <w:tcW w:type="dxa" w:w="2016"/>
+            <w:shd w:fill="F8F9FA"/>
+            <w:tcMar>
+              <w:top w:w="35" w:type="dxa"/>
+              <w:bottom w:w="35" w:type="dxa"/>
+              <w:left w:w="60" w:type="dxa"/>
+              <w:right w:w="60" w:type="dxa"/>
+            </w:tcMar>
+          </w:tcPr>
+          <w:p>
+            <w:pPr>
+              <w:spacing w:before="30" w:after="30"/>
+              <w:jc w:val="right"/>
+            </w:pPr>
+            <w:r>
+              <w:rPr>
+                <w:rFonts w:ascii="Consolas" w:hAnsi="Consolas"/>
+                <w:color w:val="212121"/>
+                <w:sz w:val="16"/>
+              </w:rPr>
+              <w:t>300.000.000</w:t>
+            </w:r>
+          </w:p>
+        </w:tc>
+        <w:tc>
+          <w:tcPr>
+            <w:tcW w:type="dxa" w:w="2016"/>
+            <w:shd w:fill="F8F9FA"/>
+            <w:tcMar>
+              <w:top w:w="35" w:type="dxa"/>
+              <w:bottom w:w="35" w:type="dxa"/>
+              <w:left w:w="60" w:type="dxa"/>
+              <w:right w:w="60" w:type="dxa"/>
+            </w:tcMar>
+          </w:tcPr>
+          <w:p>
+            <w:pPr>
+              <w:spacing w:before="30" w:after="30"/>
+              <w:jc w:val="right"/>
+            </w:pPr>
+            <w:r>
+              <w:rPr>
+                <w:rFonts w:ascii="Consolas" w:hAnsi="Consolas"/>
+                <w:color w:val="212121"/>
+                <w:sz w:val="16"/>
+              </w:rPr>
+              <w:t>180.000.000</w:t>
+            </w:r>
+          </w:p>
+        </w:tc>
+      </w:tr>
+      <w:tr>
+        <w:trPr>
+          <w:cantSplit/>
+        </w:trPr>
+        <w:tc>
+          <w:tcPr>
+            <w:tcW w:type="dxa" w:w="4997"/>
+            <w:shd w:fill="FFFFFF"/>
+            <w:tcMar>
+              <w:top w:w="35" w:type="dxa"/>
+              <w:bottom w:w="35" w:type="dxa"/>
+              <w:left w:w="60" w:type="dxa"/>
+              <w:right w:w="60" w:type="dxa"/>
+            </w:tcMar>
+          </w:tcPr>
+          <w:p>
+            <w:pPr>
+              <w:spacing w:before="30" w:after="30"/>
+              <w:jc w:val="left"/>
+            </w:pPr>
+            <w:r>
+              <w:rPr>
+                <w:rFonts w:ascii="Segoe UI" w:hAnsi="Segoe UI"/>
+                <w:color w:val="212121"/>
+                <w:sz w:val="15"/>
+              </w:rPr>
+              <w:t>1.5. Cổng Web Portal Quản trị Liên minh HTX &amp; Dashboard Giám sát Nhiệt độ</w:t>
+              <w:br/>
+              <w:t xml:space="preserve">   [Fullstack Dev: 4 man-months × 30.000.000 VNĐ/tháng]</w:t>
+            </w:r>
+          </w:p>
+        </w:tc>
+        <w:tc>
+          <w:tcPr>
+            <w:tcW w:type="dxa" w:w="2016"/>
+            <w:shd w:fill="FFFFFF"/>
+            <w:tcMar>
+              <w:top w:w="35" w:type="dxa"/>
+              <w:bottom w:w="35" w:type="dxa"/>
+              <w:left w:w="60" w:type="dxa"/>
+              <w:right w:w="60" w:type="dxa"/>
+            </w:tcMar>
+          </w:tcPr>
+          <w:p>
+            <w:pPr>
+              <w:spacing w:before="30" w:after="30"/>
+              <w:jc w:val="right"/>
+            </w:pPr>
+            <w:r>
+              <w:rPr>
+                <w:rFonts w:ascii="Consolas" w:hAnsi="Consolas"/>
+                <w:color w:val="212121"/>
+                <w:sz w:val="16"/>
+              </w:rPr>
+              <w:t>120.000.000</w:t>
+            </w:r>
+          </w:p>
+        </w:tc>
+        <w:tc>
+          <w:tcPr>
+            <w:tcW w:type="dxa" w:w="2016"/>
+            <w:shd w:fill="FFFFFF"/>
+            <w:tcMar>
+              <w:top w:w="35" w:type="dxa"/>
+              <w:bottom w:w="35" w:type="dxa"/>
+              <w:left w:w="60" w:type="dxa"/>
+              <w:right w:w="60" w:type="dxa"/>
+            </w:tcMar>
+          </w:tcPr>
+          <w:p>
+            <w:pPr>
+              <w:spacing w:before="30" w:after="30"/>
+              <w:jc w:val="right"/>
+            </w:pPr>
+            <w:r>
+              <w:rPr>
+                <w:rFonts w:ascii="Consolas" w:hAnsi="Consolas"/>
+                <w:color w:val="212121"/>
+                <w:sz w:val="16"/>
+              </w:rPr>
+              <w:t>120.000.000</w:t>
+            </w:r>
+          </w:p>
+        </w:tc>
+      </w:tr>
+      <w:tr>
+        <w:trPr>
+          <w:cantSplit/>
+        </w:trPr>
+        <w:tc>
+          <w:tcPr>
+            <w:tcW w:type="dxa" w:w="4997"/>
+            <w:shd w:fill="F8F9FA"/>
+            <w:tcMar>
+              <w:top w:w="35" w:type="dxa"/>
+              <w:bottom w:w="35" w:type="dxa"/>
+              <w:left w:w="60" w:type="dxa"/>
+              <w:right w:w="60" w:type="dxa"/>
+            </w:tcMar>
+          </w:tcPr>
+          <w:p>
+            <w:pPr>
+              <w:spacing w:before="30" w:after="30"/>
+              <w:jc w:val="left"/>
+            </w:pPr>
+            <w:r>
+              <w:rPr>
+                <w:rFonts w:ascii="Segoe UI" w:hAnsi="Segoe UI"/>
+                <w:color w:val="212121"/>
+                <w:sz w:val="15"/>
+              </w:rPr>
+              <w:t>1.6. Tích hợp Bản đồ Số, Định vị GPS &amp; Trạm Khí tượng API</w:t>
+              <w:br/>
+              <w:t xml:space="preserve">   [Xây mới: Xây Telemetry riêng | Đối tác: Kế thừa hạ tầng GPS &amp; Viettel Maps]</w:t>
+            </w:r>
+          </w:p>
+        </w:tc>
+        <w:tc>
+          <w:tcPr>
+            <w:tcW w:type="dxa" w:w="2016"/>
+            <w:shd w:fill="F8F9FA"/>
+            <w:tcMar>
+              <w:top w:w="35" w:type="dxa"/>
+              <w:bottom w:w="35" w:type="dxa"/>
+              <w:left w:w="60" w:type="dxa"/>
+              <w:right w:w="60" w:type="dxa"/>
+            </w:tcMar>
+          </w:tcPr>
+          <w:p>
+            <w:pPr>
+              <w:spacing w:before="30" w:after="30"/>
+              <w:jc w:val="right"/>
+            </w:pPr>
+            <w:r>
+              <w:rPr>
+                <w:rFonts w:ascii="Consolas" w:hAnsi="Consolas"/>
+                <w:color w:val="212121"/>
+                <w:sz w:val="16"/>
+              </w:rPr>
+              <w:t>180.000.000</w:t>
+            </w:r>
+          </w:p>
+        </w:tc>
+        <w:tc>
+          <w:tcPr>
+            <w:tcW w:type="dxa" w:w="2016"/>
+            <w:shd w:fill="F8F9FA"/>
+            <w:tcMar>
+              <w:top w:w="35" w:type="dxa"/>
+              <w:bottom w:w="35" w:type="dxa"/>
+              <w:left w:w="60" w:type="dxa"/>
+              <w:right w:w="60" w:type="dxa"/>
+            </w:tcMar>
+          </w:tcPr>
+          <w:p>
+            <w:pPr>
+              <w:spacing w:before="30" w:after="30"/>
+              <w:jc w:val="right"/>
+            </w:pPr>
+            <w:r>
+              <w:rPr>
+                <w:rFonts w:ascii="Consolas" w:hAnsi="Consolas"/>
+                <w:color w:val="212121"/>
+                <w:sz w:val="16"/>
+              </w:rPr>
+              <w:t>80.000.000</w:t>
+            </w:r>
+          </w:p>
+        </w:tc>
+      </w:tr>
+      <w:tr>
+        <w:trPr>
+          <w:cantSplit/>
+        </w:trPr>
+        <w:tc>
+          <w:tcPr>
+            <w:tcW w:type="dxa" w:w="4997"/>
+            <w:shd w:fill="FFFFFF"/>
+            <w:tcMar>
+              <w:top w:w="35" w:type="dxa"/>
+              <w:bottom w:w="35" w:type="dxa"/>
+              <w:left w:w="60" w:type="dxa"/>
+              <w:right w:w="60" w:type="dxa"/>
+            </w:tcMar>
+          </w:tcPr>
+          <w:p>
+            <w:pPr>
+              <w:spacing w:before="30" w:after="30"/>
+              <w:jc w:val="left"/>
+            </w:pPr>
+            <w:r>
+              <w:rPr>
+                <w:rFonts w:ascii="Segoe UI" w:hAnsi="Segoe UI"/>
+                <w:color w:val="212121"/>
+                <w:sz w:val="15"/>
+              </w:rPr>
+              <w:t>1.7. Cổng Thanh toán Điện tử, Hợp đồng Số &amp; Ký quỹ Giữ chỗ Lớp 2 (Escrow)</w:t>
+              <w:br/>
+              <w:t xml:space="preserve">   [Xây mới: Xây cổng thanh toán độc lập | Đối tác: Tận dụng Viettel Money sẵn có]</w:t>
+            </w:r>
+          </w:p>
+        </w:tc>
+        <w:tc>
+          <w:tcPr>
+            <w:tcW w:type="dxa" w:w="2016"/>
+            <w:shd w:fill="FFFFFF"/>
+            <w:tcMar>
+              <w:top w:w="35" w:type="dxa"/>
+              <w:bottom w:w="35" w:type="dxa"/>
+              <w:left w:w="60" w:type="dxa"/>
+              <w:right w:w="60" w:type="dxa"/>
+            </w:tcMar>
+          </w:tcPr>
+          <w:p>
+            <w:pPr>
+              <w:spacing w:before="30" w:after="30"/>
+              <w:jc w:val="right"/>
+            </w:pPr>
+            <w:r>
+              <w:rPr>
+                <w:rFonts w:ascii="Consolas" w:hAnsi="Consolas"/>
+                <w:color w:val="212121"/>
+                <w:sz w:val="16"/>
+              </w:rPr>
+              <w:t>250.000.000</w:t>
+            </w:r>
+          </w:p>
+        </w:tc>
+        <w:tc>
+          <w:tcPr>
+            <w:tcW w:type="dxa" w:w="2016"/>
+            <w:shd w:fill="FFFFFF"/>
+            <w:tcMar>
+              <w:top w:w="35" w:type="dxa"/>
+              <w:bottom w:w="35" w:type="dxa"/>
+              <w:left w:w="60" w:type="dxa"/>
+              <w:right w:w="60" w:type="dxa"/>
+            </w:tcMar>
+          </w:tcPr>
+          <w:p>
+            <w:pPr>
+              <w:spacing w:before="30" w:after="30"/>
+              <w:jc w:val="right"/>
+            </w:pPr>
+            <w:r>
+              <w:rPr>
+                <w:rFonts w:ascii="Consolas" w:hAnsi="Consolas"/>
+                <w:color w:val="212121"/>
+                <w:sz w:val="16"/>
+              </w:rPr>
+              <w:t>100.000.000</w:t>
+            </w:r>
+          </w:p>
+        </w:tc>
+      </w:tr>
+      <w:tr>
+        <w:trPr>
+          <w:cantSplit/>
+        </w:trPr>
+        <w:tc>
+          <w:tcPr>
+            <w:tcW w:type="dxa" w:w="4997"/>
+            <w:shd w:fill="F8F9FA"/>
+            <w:tcMar>
+              <w:top w:w="35" w:type="dxa"/>
+              <w:bottom w:w="35" w:type="dxa"/>
+              <w:left w:w="60" w:type="dxa"/>
+              <w:right w:w="60" w:type="dxa"/>
+            </w:tcMar>
+          </w:tcPr>
+          <w:p>
+            <w:pPr>
+              <w:spacing w:before="30" w:after="30"/>
+              <w:jc w:val="left"/>
+            </w:pPr>
+            <w:r>
+              <w:rPr>
+                <w:rFonts w:ascii="Segoe UI" w:hAnsi="Segoe UI"/>
+                <w:color w:val="212121"/>
+                <w:sz w:val="15"/>
+              </w:rPr>
+              <w:t>1.8. Kiểm thử Chất lượng (QA/QC), Kiểm thử Tải Mùa vụ (92 ngày) &amp; UAT</w:t>
+              <w:br/>
+              <w:t xml:space="preserve">   [Xây mới: Dựng Staging độc lập | Đối tác: Kế thừa quy trình &amp; Sandbox có sẵn]</w:t>
+            </w:r>
+          </w:p>
+        </w:tc>
+        <w:tc>
+          <w:tcPr>
+            <w:tcW w:type="dxa" w:w="2016"/>
+            <w:shd w:fill="F8F9FA"/>
+            <w:tcMar>
+              <w:top w:w="35" w:type="dxa"/>
+              <w:bottom w:w="35" w:type="dxa"/>
+              <w:left w:w="60" w:type="dxa"/>
+              <w:right w:w="60" w:type="dxa"/>
+            </w:tcMar>
+          </w:tcPr>
+          <w:p>
+            <w:pPr>
+              <w:spacing w:before="30" w:after="30"/>
+              <w:jc w:val="right"/>
+            </w:pPr>
+            <w:r>
+              <w:rPr>
+                <w:rFonts w:ascii="Consolas" w:hAnsi="Consolas"/>
+                <w:color w:val="212121"/>
+                <w:sz w:val="16"/>
+              </w:rPr>
+              <w:t>387.500.000</w:t>
+            </w:r>
+          </w:p>
+        </w:tc>
+        <w:tc>
+          <w:tcPr>
+            <w:tcW w:type="dxa" w:w="2016"/>
+            <w:shd w:fill="F8F9FA"/>
+            <w:tcMar>
+              <w:top w:w="35" w:type="dxa"/>
+              <w:bottom w:w="35" w:type="dxa"/>
+              <w:left w:w="60" w:type="dxa"/>
+              <w:right w:w="60" w:type="dxa"/>
+            </w:tcMar>
+          </w:tcPr>
+          <w:p>
+            <w:pPr>
+              <w:spacing w:before="30" w:after="30"/>
+              <w:jc w:val="right"/>
+            </w:pPr>
+            <w:r>
+              <w:rPr>
+                <w:rFonts w:ascii="Consolas" w:hAnsi="Consolas"/>
+                <w:color w:val="212121"/>
+                <w:sz w:val="16"/>
+              </w:rPr>
+              <w:t>220.000.000</w:t>
+            </w:r>
+          </w:p>
+        </w:tc>
+      </w:tr>
+      <w:tr>
+        <w:trPr>
+          <w:cantSplit/>
+        </w:trPr>
+        <w:tc>
+          <w:tcPr>
+            <w:tcW w:type="dxa" w:w="4997"/>
+            <w:shd w:fill="F1F8E9"/>
+            <w:tcMar>
+              <w:top w:w="40" w:type="dxa"/>
+              <w:bottom w:w="40" w:type="dxa"/>
+              <w:left w:w="60" w:type="dxa"/>
+              <w:right w:w="60" w:type="dxa"/>
+            </w:tcMar>
+          </w:tcPr>
+          <w:p>
+            <w:pPr>
+              <w:spacing w:before="40" w:after="40"/>
+              <w:jc w:val="left"/>
+            </w:pPr>
+            <w:r>
+              <w:rPr>
+                <w:rFonts w:ascii="Segoe UI" w:hAnsi="Segoe UI"/>
+                <w:b/>
+                <w:color w:val="2E7D32"/>
+                <w:sz w:val="16"/>
+              </w:rPr>
+              <w:t>Tiểu tổng Nhóm I: Phát triển Phần mềm &amp; AI Lõi (Tiết kiệm 712.500.000 VNĐ)</w:t>
+            </w:r>
+          </w:p>
+        </w:tc>
+        <w:tc>
+          <w:tcPr>
+            <w:tcW w:type="dxa" w:w="2016"/>
+            <w:shd w:fill="F1F8E9"/>
+            <w:tcMar>
+              <w:top w:w="40" w:type="dxa"/>
+              <w:bottom w:w="40" w:type="dxa"/>
+              <w:left w:w="60" w:type="dxa"/>
+              <w:right w:w="60" w:type="dxa"/>
+            </w:tcMar>
+          </w:tcPr>
+          <w:p>
+            <w:pPr>
+              <w:spacing w:before="40" w:after="40"/>
+              <w:jc w:val="right"/>
+            </w:pPr>
+            <w:r>
+              <w:rPr>
+                <w:rFonts w:ascii="Consolas" w:hAnsi="Consolas"/>
+                <w:b/>
+                <w:color w:val="212121"/>
+                <w:sz w:val="16"/>
+              </w:rPr>
+              <w:t>1.837.500.000</w:t>
+            </w:r>
+          </w:p>
+        </w:tc>
+        <w:tc>
+          <w:tcPr>
+            <w:tcW w:type="dxa" w:w="2016"/>
+            <w:shd w:fill="F1F8E9"/>
+            <w:tcMar>
+              <w:top w:w="40" w:type="dxa"/>
+              <w:bottom w:w="40" w:type="dxa"/>
+              <w:left w:w="60" w:type="dxa"/>
+              <w:right w:w="60" w:type="dxa"/>
+            </w:tcMar>
+          </w:tcPr>
+          <w:p>
+            <w:pPr>
+              <w:spacing w:before="40" w:after="40"/>
+              <w:jc w:val="right"/>
+            </w:pPr>
+            <w:r>
+              <w:rPr>
+                <w:rFonts w:ascii="Consolas" w:hAnsi="Consolas"/>
+                <w:b/>
+                <w:color w:val="212121"/>
+                <w:sz w:val="16"/>
+              </w:rPr>
+              <w:t>1.125.000.000</w:t>
+            </w:r>
+          </w:p>
+        </w:tc>
+      </w:tr>
+      <w:tr>
+        <w:trPr>
+          <w:cantSplit/>
+        </w:trPr>
+        <w:tc>
+          <w:tcPr>
+            <w:tcW w:type="dxa" w:w="2016"/>
+            <w:gridSpan w:val="3"/>
+            <w:shd w:fill="E3F2FD"/>
+            <w:tcMar>
+              <w:top w:w="45" w:type="dxa"/>
+              <w:bottom w:w="45" w:type="dxa"/>
+              <w:left w:w="70" w:type="dxa"/>
+              <w:right w:w="70" w:type="dxa"/>
+            </w:tcMar>
+          </w:tcPr>
+          <w:p>
+            <w:pPr>
+              <w:keepNext/>
+              <w:pageBreakBefore/>
+              <w:spacing w:before="60" w:after="40"/>
+              <w:jc w:val="left"/>
+            </w:pPr>
+            <w:r>
+              <w:rPr>
+                <w:rFonts w:ascii="Segoe UI" w:hAnsi="Segoe UI"/>
+                <w:b/>
+                <w:color w:val="0D47A1"/>
+                <w:sz w:val="17"/>
+              </w:rPr>
+              <w:t>II. CƠ SỞ HẠ TẦNG MÁY CHỦ &amp; ĐIỆN TOÁN ĐÁM MÂY (NĂM ĐẦU TIÊN)</w:t>
+            </w:r>
+          </w:p>
+          <w:p>
+            <w:r/>
+          </w:p>
+          <w:p>
+            <w:r/>
+          </w:p>
+        </w:tc>
+      </w:tr>
+      <w:tr>
+        <w:trPr>
+          <w:cantSplit/>
+        </w:trPr>
+        <w:tc>
+          <w:tcPr>
+            <w:tcW w:type="dxa" w:w="4997"/>
+            <w:shd w:fill="FFFFFF"/>
+            <w:tcMar>
+              <w:top w:w="35" w:type="dxa"/>
+              <w:bottom w:w="35" w:type="dxa"/>
+              <w:left w:w="60" w:type="dxa"/>
+              <w:right w:w="60" w:type="dxa"/>
+            </w:tcMar>
+          </w:tcPr>
+          <w:p>
+            <w:pPr>
+              <w:spacing w:before="30" w:after="30"/>
+              <w:jc w:val="left"/>
+            </w:pPr>
+            <w:r>
+              <w:rPr>
+                <w:rFonts w:ascii="Segoe UI" w:hAnsi="Segoe UI"/>
+                <w:color w:val="212121"/>
+                <w:sz w:val="15"/>
+              </w:rPr>
+              <w:t>2.1. Cụm Máy chủ Đám mây (Cloud Kubernetes / VPS Cluster - Auto-scaling T5-T7)</w:t>
+              <w:br/>
+              <w:t xml:space="preserve">   [12 tháng × bình quân 7.000.000 VNĐ/tháng, tháng 6 cao điểm scale x3]</w:t>
+            </w:r>
+          </w:p>
+        </w:tc>
+        <w:tc>
+          <w:tcPr>
+            <w:tcW w:type="dxa" w:w="2016"/>
+            <w:shd w:fill="FFFFFF"/>
+            <w:tcMar>
+              <w:top w:w="35" w:type="dxa"/>
+              <w:bottom w:w="35" w:type="dxa"/>
+              <w:left w:w="60" w:type="dxa"/>
+              <w:right w:w="60" w:type="dxa"/>
+            </w:tcMar>
+          </w:tcPr>
+          <w:p>
+            <w:pPr>
+              <w:spacing w:before="30" w:after="30"/>
+              <w:jc w:val="right"/>
+            </w:pPr>
+            <w:r>
+              <w:rPr>
+                <w:rFonts w:ascii="Consolas" w:hAnsi="Consolas"/>
+                <w:color w:val="212121"/>
+                <w:sz w:val="16"/>
+              </w:rPr>
+              <w:t>84.000.000</w:t>
+            </w:r>
+          </w:p>
+        </w:tc>
+        <w:tc>
+          <w:tcPr>
+            <w:tcW w:type="dxa" w:w="2016"/>
+            <w:shd w:fill="FFFFFF"/>
+            <w:tcMar>
+              <w:top w:w="35" w:type="dxa"/>
+              <w:bottom w:w="35" w:type="dxa"/>
+              <w:left w:w="60" w:type="dxa"/>
+              <w:right w:w="60" w:type="dxa"/>
+            </w:tcMar>
+          </w:tcPr>
+          <w:p>
+            <w:pPr>
+              <w:spacing w:before="30" w:after="30"/>
+              <w:jc w:val="right"/>
+            </w:pPr>
+            <w:r>
+              <w:rPr>
+                <w:rFonts w:ascii="Consolas" w:hAnsi="Consolas"/>
+                <w:color w:val="212121"/>
+                <w:sz w:val="16"/>
+              </w:rPr>
+              <w:t>84.000.000</w:t>
+            </w:r>
+          </w:p>
+        </w:tc>
+      </w:tr>
+      <w:tr>
+        <w:trPr>
+          <w:cantSplit/>
+        </w:trPr>
+        <w:tc>
+          <w:tcPr>
+            <w:tcW w:type="dxa" w:w="4997"/>
+            <w:shd w:fill="F8F9FA"/>
+            <w:tcMar>
+              <w:top w:w="35" w:type="dxa"/>
+              <w:bottom w:w="35" w:type="dxa"/>
+              <w:left w:w="60" w:type="dxa"/>
+              <w:right w:w="60" w:type="dxa"/>
+            </w:tcMar>
+          </w:tcPr>
+          <w:p>
+            <w:pPr>
+              <w:spacing w:before="30" w:after="30"/>
+              <w:jc w:val="left"/>
+            </w:pPr>
+            <w:r>
+              <w:rPr>
+                <w:rFonts w:ascii="Segoe UI" w:hAnsi="Segoe UI"/>
+                <w:color w:val="212121"/>
+                <w:sz w:val="15"/>
+              </w:rPr>
+              <w:t>2.2. Cơ sở Dữ liệu Chuỗi thời gian &amp; Lưu trữ Lịch sử Khí tượng ECMWF ERA5</w:t>
+              <w:br/>
+              <w:t xml:space="preserve">   [12 tháng × 3.000.000 VNĐ/tháng]</w:t>
+            </w:r>
+          </w:p>
+        </w:tc>
+        <w:tc>
+          <w:tcPr>
+            <w:tcW w:type="dxa" w:w="2016"/>
+            <w:shd w:fill="F8F9FA"/>
+            <w:tcMar>
+              <w:top w:w="35" w:type="dxa"/>
+              <w:bottom w:w="35" w:type="dxa"/>
+              <w:left w:w="60" w:type="dxa"/>
+              <w:right w:w="60" w:type="dxa"/>
+            </w:tcMar>
+          </w:tcPr>
+          <w:p>
+            <w:pPr>
+              <w:spacing w:before="30" w:after="30"/>
+              <w:jc w:val="right"/>
+            </w:pPr>
+            <w:r>
+              <w:rPr>
+                <w:rFonts w:ascii="Consolas" w:hAnsi="Consolas"/>
+                <w:color w:val="212121"/>
+                <w:sz w:val="16"/>
+              </w:rPr>
+              <w:t>36.000.000</w:t>
+            </w:r>
+          </w:p>
+        </w:tc>
+        <w:tc>
+          <w:tcPr>
+            <w:tcW w:type="dxa" w:w="2016"/>
+            <w:shd w:fill="F8F9FA"/>
+            <w:tcMar>
+              <w:top w:w="35" w:type="dxa"/>
+              <w:bottom w:w="35" w:type="dxa"/>
+              <w:left w:w="60" w:type="dxa"/>
+              <w:right w:w="60" w:type="dxa"/>
+            </w:tcMar>
+          </w:tcPr>
+          <w:p>
+            <w:pPr>
+              <w:spacing w:before="30" w:after="30"/>
+              <w:jc w:val="right"/>
+            </w:pPr>
+            <w:r>
+              <w:rPr>
+                <w:rFonts w:ascii="Consolas" w:hAnsi="Consolas"/>
+                <w:color w:val="212121"/>
+                <w:sz w:val="16"/>
+              </w:rPr>
+              <w:t>36.000.000</w:t>
+            </w:r>
+          </w:p>
+        </w:tc>
+      </w:tr>
+      <w:tr>
+        <w:trPr>
+          <w:cantSplit/>
+        </w:trPr>
+        <w:tc>
+          <w:tcPr>
+            <w:tcW w:type="dxa" w:w="4997"/>
+            <w:shd w:fill="FFFFFF"/>
+            <w:tcMar>
+              <w:top w:w="35" w:type="dxa"/>
+              <w:bottom w:w="35" w:type="dxa"/>
+              <w:left w:w="60" w:type="dxa"/>
+              <w:right w:w="60" w:type="dxa"/>
+            </w:tcMar>
+          </w:tcPr>
+          <w:p>
+            <w:pPr>
+              <w:spacing w:before="30" w:after="30"/>
+              <w:jc w:val="left"/>
+            </w:pPr>
+            <w:r>
+              <w:rPr>
+                <w:rFonts w:ascii="Segoe UI" w:hAnsi="Segoe UI"/>
+                <w:color w:val="212121"/>
+                <w:sz w:val="15"/>
+              </w:rPr>
+              <w:t>2.3. Băng thông Mạng, Mạng Phân phối Nội dung (CDN) &amp; Sao lưu Dự phòng (DR)</w:t>
+              <w:br/>
+              <w:t xml:space="preserve">   [Định mức duy trì hạ tầng trọn gói 1 năm]</w:t>
+            </w:r>
+          </w:p>
+        </w:tc>
+        <w:tc>
+          <w:tcPr>
+            <w:tcW w:type="dxa" w:w="2016"/>
+            <w:shd w:fill="FFFFFF"/>
+            <w:tcMar>
+              <w:top w:w="35" w:type="dxa"/>
+              <w:bottom w:w="35" w:type="dxa"/>
+              <w:left w:w="60" w:type="dxa"/>
+              <w:right w:w="60" w:type="dxa"/>
+            </w:tcMar>
+          </w:tcPr>
+          <w:p>
+            <w:pPr>
+              <w:spacing w:before="30" w:after="30"/>
+              <w:jc w:val="right"/>
+            </w:pPr>
+            <w:r>
+              <w:rPr>
+                <w:rFonts w:ascii="Consolas" w:hAnsi="Consolas"/>
+                <w:color w:val="212121"/>
+                <w:sz w:val="16"/>
+              </w:rPr>
+              <w:t>25.000.000</w:t>
+            </w:r>
+          </w:p>
+        </w:tc>
+        <w:tc>
+          <w:tcPr>
+            <w:tcW w:type="dxa" w:w="2016"/>
+            <w:shd w:fill="FFFFFF"/>
+            <w:tcMar>
+              <w:top w:w="35" w:type="dxa"/>
+              <w:bottom w:w="35" w:type="dxa"/>
+              <w:left w:w="60" w:type="dxa"/>
+              <w:right w:w="60" w:type="dxa"/>
+            </w:tcMar>
+          </w:tcPr>
+          <w:p>
+            <w:pPr>
+              <w:spacing w:before="30" w:after="30"/>
+              <w:jc w:val="right"/>
+            </w:pPr>
+            <w:r>
+              <w:rPr>
+                <w:rFonts w:ascii="Consolas" w:hAnsi="Consolas"/>
+                <w:color w:val="212121"/>
+                <w:sz w:val="16"/>
+              </w:rPr>
+              <w:t>25.000.000</w:t>
+            </w:r>
+          </w:p>
+        </w:tc>
+      </w:tr>
+      <w:tr>
+        <w:trPr>
+          <w:cantSplit/>
+        </w:trPr>
+        <w:tc>
+          <w:tcPr>
+            <w:tcW w:type="dxa" w:w="4997"/>
+            <w:shd w:fill="F8F9FA"/>
+            <w:tcMar>
+              <w:top w:w="35" w:type="dxa"/>
+              <w:bottom w:w="35" w:type="dxa"/>
+              <w:left w:w="60" w:type="dxa"/>
+              <w:right w:w="60" w:type="dxa"/>
+            </w:tcMar>
+          </w:tcPr>
+          <w:p>
+            <w:pPr>
+              <w:spacing w:before="30" w:after="30"/>
+              <w:jc w:val="left"/>
+            </w:pPr>
+            <w:r>
+              <w:rPr>
+                <w:rFonts w:ascii="Segoe UI" w:hAnsi="Segoe UI"/>
+                <w:color w:val="212121"/>
+                <w:sz w:val="15"/>
+              </w:rPr>
+              <w:t>2.4. Bản quyền API Dịch vụ Ngoại vi (Open-Meteo Commercial &amp; SMS OTP Tài xế)</w:t>
+              <w:br/>
+              <w:t xml:space="preserve">   [Gói thuê bao dữ liệu khí tượng thương mại &amp; xác thực số điện thoại 1 năm]</w:t>
+            </w:r>
+          </w:p>
+        </w:tc>
+        <w:tc>
+          <w:tcPr>
+            <w:tcW w:type="dxa" w:w="2016"/>
+            <w:shd w:fill="F8F9FA"/>
+            <w:tcMar>
+              <w:top w:w="35" w:type="dxa"/>
+              <w:bottom w:w="35" w:type="dxa"/>
+              <w:left w:w="60" w:type="dxa"/>
+              <w:right w:w="60" w:type="dxa"/>
+            </w:tcMar>
+          </w:tcPr>
+          <w:p>
+            <w:pPr>
+              <w:spacing w:before="30" w:after="30"/>
+              <w:jc w:val="right"/>
+            </w:pPr>
+            <w:r>
+              <w:rPr>
+                <w:rFonts w:ascii="Consolas" w:hAnsi="Consolas"/>
+                <w:color w:val="212121"/>
+                <w:sz w:val="16"/>
+              </w:rPr>
+              <w:t>30.000.000</w:t>
+            </w:r>
+          </w:p>
+        </w:tc>
+        <w:tc>
+          <w:tcPr>
+            <w:tcW w:type="dxa" w:w="2016"/>
+            <w:shd w:fill="F8F9FA"/>
+            <w:tcMar>
+              <w:top w:w="35" w:type="dxa"/>
+              <w:bottom w:w="35" w:type="dxa"/>
+              <w:left w:w="60" w:type="dxa"/>
+              <w:right w:w="60" w:type="dxa"/>
+            </w:tcMar>
+          </w:tcPr>
+          <w:p>
+            <w:pPr>
+              <w:spacing w:before="30" w:after="30"/>
+              <w:jc w:val="right"/>
+            </w:pPr>
+            <w:r>
+              <w:rPr>
+                <w:rFonts w:ascii="Consolas" w:hAnsi="Consolas"/>
+                <w:color w:val="212121"/>
+                <w:sz w:val="16"/>
+              </w:rPr>
+              <w:t>30.000.000</w:t>
+            </w:r>
+          </w:p>
+        </w:tc>
+      </w:tr>
+      <w:tr>
+        <w:trPr>
+          <w:cantSplit/>
+        </w:trPr>
+        <w:tc>
+          <w:tcPr>
+            <w:tcW w:type="dxa" w:w="4997"/>
+            <w:shd w:fill="F1F8E9"/>
+            <w:tcMar>
+              <w:top w:w="40" w:type="dxa"/>
+              <w:bottom w:w="40" w:type="dxa"/>
+              <w:left w:w="60" w:type="dxa"/>
+              <w:right w:w="60" w:type="dxa"/>
+            </w:tcMar>
+          </w:tcPr>
+          <w:p>
+            <w:pPr>
+              <w:spacing w:before="40" w:after="40"/>
+              <w:jc w:val="left"/>
+            </w:pPr>
+            <w:r>
+              <w:rPr>
+                <w:rFonts w:ascii="Segoe UI" w:hAnsi="Segoe UI"/>
+                <w:b/>
+                <w:color w:val="2E7D32"/>
+                <w:sz w:val="16"/>
+              </w:rPr>
+              <w:t>Tiểu tổng Nhóm II: Hạ tầng &amp; Điện toán Đám mây</w:t>
+            </w:r>
+          </w:p>
+        </w:tc>
+        <w:tc>
+          <w:tcPr>
+            <w:tcW w:type="dxa" w:w="2016"/>
+            <w:shd w:fill="F1F8E9"/>
+            <w:tcMar>
+              <w:top w:w="40" w:type="dxa"/>
+              <w:bottom w:w="40" w:type="dxa"/>
+              <w:left w:w="60" w:type="dxa"/>
+              <w:right w:w="60" w:type="dxa"/>
+            </w:tcMar>
+          </w:tcPr>
+          <w:p>
+            <w:pPr>
+              <w:spacing w:before="40" w:after="40"/>
+              <w:jc w:val="right"/>
+            </w:pPr>
+            <w:r>
+              <w:rPr>
+                <w:rFonts w:ascii="Consolas" w:hAnsi="Consolas"/>
+                <w:b/>
+                <w:color w:val="212121"/>
+                <w:sz w:val="16"/>
+              </w:rPr>
+              <w:t>175.000.000</w:t>
+            </w:r>
+          </w:p>
+        </w:tc>
+        <w:tc>
+          <w:tcPr>
+            <w:tcW w:type="dxa" w:w="2016"/>
+            <w:shd w:fill="F1F8E9"/>
+            <w:tcMar>
+              <w:top w:w="40" w:type="dxa"/>
+              <w:bottom w:w="40" w:type="dxa"/>
+              <w:left w:w="60" w:type="dxa"/>
+              <w:right w:w="60" w:type="dxa"/>
+            </w:tcMar>
+          </w:tcPr>
+          <w:p>
+            <w:pPr>
+              <w:spacing w:before="40" w:after="40"/>
+              <w:jc w:val="right"/>
+            </w:pPr>
+            <w:r>
+              <w:rPr>
+                <w:rFonts w:ascii="Consolas" w:hAnsi="Consolas"/>
+                <w:b/>
+                <w:color w:val="212121"/>
+                <w:sz w:val="16"/>
+              </w:rPr>
+              <w:t>175.000.000</w:t>
+            </w:r>
+          </w:p>
+        </w:tc>
+      </w:tr>
+      <w:tr>
+        <w:trPr>
+          <w:cantSplit/>
+        </w:trPr>
+        <w:tc>
+          <w:tcPr>
+            <w:tcW w:type="dxa" w:w="2016"/>
+            <w:gridSpan w:val="3"/>
+            <w:shd w:fill="E3F2FD"/>
+            <w:tcMar>
+              <w:top w:w="45" w:type="dxa"/>
+              <w:bottom w:w="45" w:type="dxa"/>
+              <w:left w:w="70" w:type="dxa"/>
+              <w:right w:w="70" w:type="dxa"/>
+            </w:tcMar>
+          </w:tcPr>
+          <w:p>
+            <w:pPr>
+              <w:keepNext/>
+              <w:spacing w:before="60" w:after="40"/>
+              <w:jc w:val="left"/>
+            </w:pPr>
+            <w:r>
+              <w:rPr>
+                <w:rFonts w:ascii="Segoe UI" w:hAnsi="Segoe UI"/>
+                <w:b/>
+                <w:color w:val="0D47A1"/>
+                <w:sz w:val="17"/>
+              </w:rPr>
+              <w:t>III. BẢO MẬT THÔNG TIN, PHÁP LÝ &amp; GO-LIVE NGHIỆM THU</w:t>
+            </w:r>
+          </w:p>
+          <w:p>
+            <w:r/>
+          </w:p>
+          <w:p>
+            <w:r/>
+          </w:p>
+        </w:tc>
+      </w:tr>
+      <w:tr>
+        <w:trPr>
+          <w:cantSplit/>
+        </w:trPr>
+        <w:tc>
+          <w:tcPr>
+            <w:tcW w:type="dxa" w:w="4997"/>
+            <w:shd w:fill="FFFFFF"/>
+            <w:tcMar>
+              <w:top w:w="35" w:type="dxa"/>
+              <w:bottom w:w="35" w:type="dxa"/>
+              <w:left w:w="60" w:type="dxa"/>
+              <w:right w:w="60" w:type="dxa"/>
+            </w:tcMar>
+          </w:tcPr>
+          <w:p>
+            <w:pPr>
+              <w:spacing w:before="30" w:after="30"/>
+              <w:jc w:val="left"/>
+            </w:pPr>
+            <w:r>
+              <w:rPr>
+                <w:rFonts w:ascii="Segoe UI" w:hAnsi="Segoe UI"/>
+                <w:color w:val="212121"/>
+                <w:sz w:val="15"/>
+              </w:rPr>
+              <w:t>3.1. Đánh giá An toàn Thông tin &amp; Kiểm thử Xâm nhập Hệ thống (VAPT / Audit)</w:t>
+              <w:br/>
+              <w:t xml:space="preserve">   [Xây mới: Kiểm toán toàn diện | Đối tác: Kế thừa ISO 27001, chỉ test API kết nối]</w:t>
+            </w:r>
+          </w:p>
+        </w:tc>
+        <w:tc>
+          <w:tcPr>
+            <w:tcW w:type="dxa" w:w="2016"/>
+            <w:shd w:fill="FFFFFF"/>
+            <w:tcMar>
+              <w:top w:w="35" w:type="dxa"/>
+              <w:bottom w:w="35" w:type="dxa"/>
+              <w:left w:w="60" w:type="dxa"/>
+              <w:right w:w="60" w:type="dxa"/>
+            </w:tcMar>
+          </w:tcPr>
+          <w:p>
+            <w:pPr>
+              <w:spacing w:before="30" w:after="30"/>
+              <w:jc w:val="right"/>
+            </w:pPr>
+            <w:r>
+              <w:rPr>
+                <w:rFonts w:ascii="Consolas" w:hAnsi="Consolas"/>
+                <w:color w:val="212121"/>
+                <w:sz w:val="16"/>
+              </w:rPr>
+              <w:t>120.000.000</w:t>
+            </w:r>
+          </w:p>
+        </w:tc>
+        <w:tc>
+          <w:tcPr>
+            <w:tcW w:type="dxa" w:w="2016"/>
+            <w:shd w:fill="FFFFFF"/>
+            <w:tcMar>
+              <w:top w:w="35" w:type="dxa"/>
+              <w:bottom w:w="35" w:type="dxa"/>
+              <w:left w:w="60" w:type="dxa"/>
+              <w:right w:w="60" w:type="dxa"/>
+            </w:tcMar>
+          </w:tcPr>
+          <w:p>
+            <w:pPr>
+              <w:spacing w:before="30" w:after="30"/>
+              <w:jc w:val="right"/>
+            </w:pPr>
+            <w:r>
+              <w:rPr>
+                <w:rFonts w:ascii="Consolas" w:hAnsi="Consolas"/>
+                <w:color w:val="212121"/>
+                <w:sz w:val="16"/>
+              </w:rPr>
+              <w:t>80.000.000</w:t>
+            </w:r>
+          </w:p>
+        </w:tc>
+      </w:tr>
+      <w:tr>
+        <w:trPr>
+          <w:cantSplit/>
+        </w:trPr>
+        <w:tc>
+          <w:tcPr>
+            <w:tcW w:type="dxa" w:w="4997"/>
+            <w:shd w:fill="F8F9FA"/>
+            <w:tcMar>
+              <w:top w:w="35" w:type="dxa"/>
+              <w:bottom w:w="35" w:type="dxa"/>
+              <w:left w:w="60" w:type="dxa"/>
+              <w:right w:w="60" w:type="dxa"/>
+            </w:tcMar>
+          </w:tcPr>
+          <w:p>
+            <w:pPr>
+              <w:spacing w:before="30" w:after="30"/>
+              <w:jc w:val="left"/>
+            </w:pPr>
+            <w:r>
+              <w:rPr>
+                <w:rFonts w:ascii="Segoe UI" w:hAnsi="Segoe UI"/>
+                <w:color w:val="212121"/>
+                <w:sz w:val="15"/>
+              </w:rPr>
+              <w:t>3.2. Bản quyền Sở hữu Trí tuệ Thuật toán AI &amp; Thủ tục Giấy phép Sàn TMĐT Vận tải</w:t>
+              <w:br/>
+              <w:t xml:space="preserve">   [Đăng ký bản quyền phần mềm và hồ sơ thông báo Bộ Công Thương]</w:t>
+            </w:r>
+          </w:p>
+        </w:tc>
+        <w:tc>
+          <w:tcPr>
+            <w:tcW w:type="dxa" w:w="2016"/>
+            <w:shd w:fill="F8F9FA"/>
+            <w:tcMar>
+              <w:top w:w="35" w:type="dxa"/>
+              <w:bottom w:w="35" w:type="dxa"/>
+              <w:left w:w="60" w:type="dxa"/>
+              <w:right w:w="60" w:type="dxa"/>
+            </w:tcMar>
+          </w:tcPr>
+          <w:p>
+            <w:pPr>
+              <w:spacing w:before="30" w:after="30"/>
+              <w:jc w:val="right"/>
+            </w:pPr>
+            <w:r>
+              <w:rPr>
+                <w:rFonts w:ascii="Consolas" w:hAnsi="Consolas"/>
+                <w:color w:val="212121"/>
+                <w:sz w:val="16"/>
+              </w:rPr>
+              <w:t>50.000.000</w:t>
+            </w:r>
+          </w:p>
+        </w:tc>
+        <w:tc>
+          <w:tcPr>
+            <w:tcW w:type="dxa" w:w="2016"/>
+            <w:shd w:fill="F8F9FA"/>
+            <w:tcMar>
+              <w:top w:w="35" w:type="dxa"/>
+              <w:bottom w:w="35" w:type="dxa"/>
+              <w:left w:w="60" w:type="dxa"/>
+              <w:right w:w="60" w:type="dxa"/>
+            </w:tcMar>
+          </w:tcPr>
+          <w:p>
+            <w:pPr>
+              <w:spacing w:before="30" w:after="30"/>
+              <w:jc w:val="right"/>
+            </w:pPr>
+            <w:r>
+              <w:rPr>
+                <w:rFonts w:ascii="Consolas" w:hAnsi="Consolas"/>
+                <w:color w:val="212121"/>
+                <w:sz w:val="16"/>
+              </w:rPr>
+              <w:t>50.000.000</w:t>
+            </w:r>
+          </w:p>
+        </w:tc>
+      </w:tr>
+      <w:tr>
+        <w:trPr>
+          <w:cantSplit/>
+        </w:trPr>
+        <w:tc>
+          <w:tcPr>
+            <w:tcW w:type="dxa" w:w="4997"/>
+            <w:shd w:fill="FFFFFF"/>
+            <w:tcMar>
+              <w:top w:w="35" w:type="dxa"/>
+              <w:bottom w:w="35" w:type="dxa"/>
+              <w:left w:w="60" w:type="dxa"/>
+              <w:right w:w="60" w:type="dxa"/>
+            </w:tcMar>
+          </w:tcPr>
+          <w:p>
+            <w:pPr>
+              <w:spacing w:before="30" w:after="30"/>
+              <w:jc w:val="left"/>
+            </w:pPr>
+            <w:r>
+              <w:rPr>
+                <w:rFonts w:ascii="Segoe UI" w:hAnsi="Segoe UI"/>
+                <w:color w:val="212121"/>
+                <w:sz w:val="15"/>
+              </w:rPr>
+              <w:t>3.3. Tư vấn Khung Hợp đồng Pháp lý 3 Lớp &amp; Chế tài Phạt Hủy Cọc Newsvendor</w:t>
+              <w:br/>
+              <w:t xml:space="preserve">   [Chi phí văn phòng luật sư chuyên trách chuỗi cung ứng &amp; thương mại nông sản]</w:t>
+            </w:r>
+          </w:p>
+        </w:tc>
+        <w:tc>
+          <w:tcPr>
+            <w:tcW w:type="dxa" w:w="2016"/>
+            <w:shd w:fill="FFFFFF"/>
+            <w:tcMar>
+              <w:top w:w="35" w:type="dxa"/>
+              <w:bottom w:w="35" w:type="dxa"/>
+              <w:left w:w="60" w:type="dxa"/>
+              <w:right w:w="60" w:type="dxa"/>
+            </w:tcMar>
+          </w:tcPr>
+          <w:p>
+            <w:pPr>
+              <w:spacing w:before="30" w:after="30"/>
+              <w:jc w:val="right"/>
+            </w:pPr>
+            <w:r>
+              <w:rPr>
+                <w:rFonts w:ascii="Consolas" w:hAnsi="Consolas"/>
+                <w:color w:val="212121"/>
+                <w:sz w:val="16"/>
+              </w:rPr>
+              <w:t>50.000.000</w:t>
+            </w:r>
+          </w:p>
+        </w:tc>
+        <w:tc>
+          <w:tcPr>
+            <w:tcW w:type="dxa" w:w="2016"/>
+            <w:shd w:fill="FFFFFF"/>
+            <w:tcMar>
+              <w:top w:w="35" w:type="dxa"/>
+              <w:bottom w:w="35" w:type="dxa"/>
+              <w:left w:w="60" w:type="dxa"/>
+              <w:right w:w="60" w:type="dxa"/>
+            </w:tcMar>
+          </w:tcPr>
+          <w:p>
+            <w:pPr>
+              <w:spacing w:before="30" w:after="30"/>
+              <w:jc w:val="right"/>
+            </w:pPr>
+            <w:r>
+              <w:rPr>
+                <w:rFonts w:ascii="Consolas" w:hAnsi="Consolas"/>
+                <w:color w:val="212121"/>
+                <w:sz w:val="16"/>
+              </w:rPr>
+              <w:t>50.000.000</w:t>
+            </w:r>
+          </w:p>
+        </w:tc>
+      </w:tr>
+      <w:tr>
+        <w:trPr>
+          <w:cantSplit/>
+        </w:trPr>
+        <w:tc>
+          <w:tcPr>
+            <w:tcW w:type="dxa" w:w="4997"/>
+            <w:shd w:fill="F8F9FA"/>
+            <w:tcMar>
+              <w:top w:w="35" w:type="dxa"/>
+              <w:bottom w:w="35" w:type="dxa"/>
+              <w:left w:w="60" w:type="dxa"/>
+              <w:right w:w="60" w:type="dxa"/>
+            </w:tcMar>
+          </w:tcPr>
+          <w:p>
+            <w:pPr>
+              <w:spacing w:before="30" w:after="30"/>
+              <w:jc w:val="left"/>
+            </w:pPr>
+            <w:r>
+              <w:rPr>
+                <w:rFonts w:ascii="Segoe UI" w:hAnsi="Segoe UI"/>
+                <w:color w:val="212121"/>
+                <w:sz w:val="15"/>
+              </w:rPr>
+              <w:t>3.4. Nghiệm thu Thực địa &amp; Pilot Test trên 20 Container Lạnh Thực tế tại Lục Ngạn</w:t>
+              <w:br/>
+              <w:t xml:space="preserve">   [Xây mới: Tự đo đạc độc lập | Đối tác: Phối hợp bến bãi đối tác mỏ neo]</w:t>
+            </w:r>
+          </w:p>
+        </w:tc>
+        <w:tc>
+          <w:tcPr>
+            <w:tcW w:type="dxa" w:w="2016"/>
+            <w:shd w:fill="F8F9FA"/>
+            <w:tcMar>
+              <w:top w:w="35" w:type="dxa"/>
+              <w:bottom w:w="35" w:type="dxa"/>
+              <w:left w:w="60" w:type="dxa"/>
+              <w:right w:w="60" w:type="dxa"/>
+            </w:tcMar>
+          </w:tcPr>
+          <w:p>
+            <w:pPr>
+              <w:spacing w:before="30" w:after="30"/>
+              <w:jc w:val="right"/>
+            </w:pPr>
+            <w:r>
+              <w:rPr>
+                <w:rFonts w:ascii="Consolas" w:hAnsi="Consolas"/>
+                <w:color w:val="212121"/>
+                <w:sz w:val="16"/>
+              </w:rPr>
+              <w:t>80.000.000</w:t>
+            </w:r>
+          </w:p>
+        </w:tc>
+        <w:tc>
+          <w:tcPr>
+            <w:tcW w:type="dxa" w:w="2016"/>
+            <w:shd w:fill="F8F9FA"/>
+            <w:tcMar>
+              <w:top w:w="35" w:type="dxa"/>
+              <w:bottom w:w="35" w:type="dxa"/>
+              <w:left w:w="60" w:type="dxa"/>
+              <w:right w:w="60" w:type="dxa"/>
+            </w:tcMar>
+          </w:tcPr>
+          <w:p>
+            <w:pPr>
+              <w:spacing w:before="30" w:after="30"/>
+              <w:jc w:val="right"/>
+            </w:pPr>
+            <w:r>
+              <w:rPr>
+                <w:rFonts w:ascii="Consolas" w:hAnsi="Consolas"/>
+                <w:color w:val="212121"/>
+                <w:sz w:val="16"/>
+              </w:rPr>
+              <w:t>70.000.000</w:t>
+            </w:r>
+          </w:p>
+        </w:tc>
+      </w:tr>
+      <w:tr>
+        <w:trPr>
+          <w:cantSplit/>
+        </w:trPr>
+        <w:tc>
+          <w:tcPr>
+            <w:tcW w:type="dxa" w:w="4997"/>
+            <w:shd w:fill="F1F8E9"/>
+            <w:tcMar>
+              <w:top w:w="40" w:type="dxa"/>
+              <w:bottom w:w="40" w:type="dxa"/>
+              <w:left w:w="60" w:type="dxa"/>
+              <w:right w:w="60" w:type="dxa"/>
+            </w:tcMar>
+          </w:tcPr>
+          <w:p>
+            <w:pPr>
+              <w:spacing w:before="40" w:after="40"/>
+              <w:jc w:val="left"/>
+            </w:pPr>
+            <w:r>
+              <w:rPr>
+                <w:rFonts w:ascii="Segoe UI" w:hAnsi="Segoe UI"/>
+                <w:b/>
+                <w:color w:val="2E7D32"/>
+                <w:sz w:val="16"/>
+              </w:rPr>
+              <w:t>Tiểu tổng Nhóm III: Bảo mật, Pháp lý &amp; Go-live (Tiết kiệm 50.000.000 VNĐ)</w:t>
+            </w:r>
+          </w:p>
+        </w:tc>
+        <w:tc>
+          <w:tcPr>
+            <w:tcW w:type="dxa" w:w="2016"/>
+            <w:shd w:fill="F1F8E9"/>
+            <w:tcMar>
+              <w:top w:w="40" w:type="dxa"/>
+              <w:bottom w:w="40" w:type="dxa"/>
+              <w:left w:w="60" w:type="dxa"/>
+              <w:right w:w="60" w:type="dxa"/>
+            </w:tcMar>
+          </w:tcPr>
+          <w:p>
+            <w:pPr>
+              <w:spacing w:before="40" w:after="40"/>
+              <w:jc w:val="right"/>
+            </w:pPr>
+            <w:r>
+              <w:rPr>
+                <w:rFonts w:ascii="Consolas" w:hAnsi="Consolas"/>
+                <w:b/>
+                <w:color w:val="212121"/>
+                <w:sz w:val="16"/>
+              </w:rPr>
+              <w:t>300.000.000</w:t>
+            </w:r>
+          </w:p>
+        </w:tc>
+        <w:tc>
+          <w:tcPr>
+            <w:tcW w:type="dxa" w:w="2016"/>
+            <w:shd w:fill="F1F8E9"/>
+            <w:tcMar>
+              <w:top w:w="40" w:type="dxa"/>
+              <w:bottom w:w="40" w:type="dxa"/>
+              <w:left w:w="60" w:type="dxa"/>
+              <w:right w:w="60" w:type="dxa"/>
+            </w:tcMar>
+          </w:tcPr>
+          <w:p>
+            <w:pPr>
+              <w:spacing w:before="40" w:after="40"/>
+              <w:jc w:val="right"/>
+            </w:pPr>
+            <w:r>
+              <w:rPr>
+                <w:rFonts w:ascii="Consolas" w:hAnsi="Consolas"/>
+                <w:b/>
+                <w:color w:val="212121"/>
+                <w:sz w:val="16"/>
+              </w:rPr>
+              <w:t>250.000.000</w:t>
+            </w:r>
+          </w:p>
+        </w:tc>
+      </w:tr>
+      <w:tr>
+        <w:trPr>
+          <w:cantSplit/>
+        </w:trPr>
+        <w:tc>
+          <w:tcPr>
+            <w:tcW w:type="dxa" w:w="2016"/>
+            <w:gridSpan w:val="3"/>
+            <w:shd w:fill="E3F2FD"/>
+            <w:tcMar>
+              <w:top w:w="45" w:type="dxa"/>
+              <w:bottom w:w="45" w:type="dxa"/>
+              <w:left w:w="70" w:type="dxa"/>
+              <w:right w:w="70" w:type="dxa"/>
+            </w:tcMar>
+          </w:tcPr>
+          <w:p>
+            <w:pPr>
+              <w:keepNext/>
+              <w:pageBreakBefore/>
+              <w:spacing w:before="60" w:after="40"/>
+              <w:jc w:val="left"/>
+            </w:pPr>
+            <w:r>
+              <w:rPr>
+                <w:rFonts w:ascii="Segoe UI" w:hAnsi="Segoe UI"/>
+                <w:b/>
+                <w:color w:val="0D47A1"/>
+                <w:sz w:val="17"/>
+              </w:rPr>
+              <w:t>IV. MARKETING THỰC ĐỊA, ĐÀO TẠO HỢP TÁC XÃ &amp; KHỞI ĐỘNG THỊ TRƯỜNG</w:t>
+            </w:r>
+          </w:p>
+          <w:p>
+            <w:r/>
+          </w:p>
+          <w:p>
+            <w:r/>
+          </w:p>
+        </w:tc>
+      </w:tr>
+      <w:tr>
+        <w:trPr>
+          <w:cantSplit/>
+        </w:trPr>
+        <w:tc>
+          <w:tcPr>
+            <w:tcW w:type="dxa" w:w="4997"/>
+            <w:shd w:fill="FFFFFF"/>
+            <w:tcMar>
+              <w:top w:w="35" w:type="dxa"/>
+              <w:bottom w:w="35" w:type="dxa"/>
+              <w:left w:w="60" w:type="dxa"/>
+              <w:right w:w="60" w:type="dxa"/>
+            </w:tcMar>
+          </w:tcPr>
+          <w:p>
+            <w:pPr>
+              <w:spacing w:before="30" w:after="30"/>
+              <w:jc w:val="left"/>
+            </w:pPr>
+            <w:r>
+              <w:rPr>
+                <w:rFonts w:ascii="Segoe UI" w:hAnsi="Segoe UI"/>
+                <w:color w:val="212121"/>
+                <w:sz w:val="15"/>
+              </w:rPr>
+              <w:t>4.1. Chuỗi Hội thảo Tập huấn &amp; Chuyển giao Ứng dụng Số cho 15 Hợp tác xã Lục Ngạn</w:t>
+              <w:br/>
+              <w:t xml:space="preserve">   [5 buổi tập huấn thực địa, tài liệu in ấn, hướng dẫn chủ vườn &amp; HTX thao tác]</w:t>
+            </w:r>
+          </w:p>
+        </w:tc>
+        <w:tc>
+          <w:tcPr>
+            <w:tcW w:type="dxa" w:w="2016"/>
+            <w:shd w:fill="FFFFFF"/>
+            <w:tcMar>
+              <w:top w:w="35" w:type="dxa"/>
+              <w:bottom w:w="35" w:type="dxa"/>
+              <w:left w:w="60" w:type="dxa"/>
+              <w:right w:w="60" w:type="dxa"/>
+            </w:tcMar>
+          </w:tcPr>
+          <w:p>
+            <w:pPr>
+              <w:spacing w:before="30" w:after="30"/>
+              <w:jc w:val="right"/>
+            </w:pPr>
+            <w:r>
+              <w:rPr>
+                <w:rFonts w:ascii="Consolas" w:hAnsi="Consolas"/>
+                <w:color w:val="212121"/>
+                <w:sz w:val="16"/>
+              </w:rPr>
+              <w:t>120.000.000</w:t>
+            </w:r>
+          </w:p>
+        </w:tc>
+        <w:tc>
+          <w:tcPr>
+            <w:tcW w:type="dxa" w:w="2016"/>
+            <w:shd w:fill="FFFFFF"/>
+            <w:tcMar>
+              <w:top w:w="35" w:type="dxa"/>
+              <w:bottom w:w="35" w:type="dxa"/>
+              <w:left w:w="60" w:type="dxa"/>
+              <w:right w:w="60" w:type="dxa"/>
+            </w:tcMar>
+          </w:tcPr>
+          <w:p>
+            <w:pPr>
+              <w:spacing w:before="30" w:after="30"/>
+              <w:jc w:val="right"/>
+            </w:pPr>
+            <w:r>
+              <w:rPr>
+                <w:rFonts w:ascii="Consolas" w:hAnsi="Consolas"/>
+                <w:color w:val="212121"/>
+                <w:sz w:val="16"/>
+              </w:rPr>
+              <w:t>120.000.000</w:t>
+            </w:r>
+          </w:p>
+        </w:tc>
+      </w:tr>
+      <w:tr>
+        <w:trPr>
+          <w:cantSplit/>
+        </w:trPr>
+        <w:tc>
+          <w:tcPr>
+            <w:tcW w:type="dxa" w:w="4997"/>
+            <w:shd w:fill="F8F9FA"/>
+            <w:tcMar>
+              <w:top w:w="35" w:type="dxa"/>
+              <w:bottom w:w="35" w:type="dxa"/>
+              <w:left w:w="60" w:type="dxa"/>
+              <w:right w:w="60" w:type="dxa"/>
+            </w:tcMar>
+          </w:tcPr>
+          <w:p>
+            <w:pPr>
+              <w:spacing w:before="30" w:after="30"/>
+              <w:jc w:val="left"/>
+            </w:pPr>
+            <w:r>
+              <w:rPr>
+                <w:rFonts w:ascii="Segoe UI" w:hAnsi="Segoe UI"/>
+                <w:color w:val="212121"/>
+                <w:sz w:val="15"/>
+              </w:rPr>
+              <w:t>4.2. Chiến dịch Truyền thông Tiếp cận Xe Lạnh Chiều về Tuyến Lạng Sơn - Bắc Giang</w:t>
+              <w:br/>
+              <w:t xml:space="preserve">   [Xây mới: Tự chạy quảng cáo bãi xe | Đối tác: Kênh nội bộ &amp; nghiệp đoàn đối tác]</w:t>
+            </w:r>
+          </w:p>
+        </w:tc>
+        <w:tc>
+          <w:tcPr>
+            <w:tcW w:type="dxa" w:w="2016"/>
+            <w:shd w:fill="F8F9FA"/>
+            <w:tcMar>
+              <w:top w:w="35" w:type="dxa"/>
+              <w:bottom w:w="35" w:type="dxa"/>
+              <w:left w:w="60" w:type="dxa"/>
+              <w:right w:w="60" w:type="dxa"/>
+            </w:tcMar>
+          </w:tcPr>
+          <w:p>
+            <w:pPr>
+              <w:spacing w:before="30" w:after="30"/>
+              <w:jc w:val="right"/>
+            </w:pPr>
+            <w:r>
+              <w:rPr>
+                <w:rFonts w:ascii="Consolas" w:hAnsi="Consolas"/>
+                <w:color w:val="212121"/>
+                <w:sz w:val="16"/>
+              </w:rPr>
+              <w:t>180.000.000</w:t>
+            </w:r>
+          </w:p>
+        </w:tc>
+        <w:tc>
+          <w:tcPr>
+            <w:tcW w:type="dxa" w:w="2016"/>
+            <w:shd w:fill="F8F9FA"/>
+            <w:tcMar>
+              <w:top w:w="35" w:type="dxa"/>
+              <w:bottom w:w="35" w:type="dxa"/>
+              <w:left w:w="60" w:type="dxa"/>
+              <w:right w:w="60" w:type="dxa"/>
+            </w:tcMar>
+          </w:tcPr>
+          <w:p>
+            <w:pPr>
+              <w:spacing w:before="30" w:after="30"/>
+              <w:jc w:val="right"/>
+            </w:pPr>
+            <w:r>
+              <w:rPr>
+                <w:rFonts w:ascii="Consolas" w:hAnsi="Consolas"/>
+                <w:color w:val="212121"/>
+                <w:sz w:val="16"/>
+              </w:rPr>
+              <w:t>60.000.000</w:t>
+            </w:r>
+          </w:p>
+        </w:tc>
+      </w:tr>
+      <w:tr>
+        <w:trPr>
+          <w:cantSplit/>
+        </w:trPr>
+        <w:tc>
+          <w:tcPr>
+            <w:tcW w:type="dxa" w:w="4997"/>
+            <w:shd w:fill="FFFFFF"/>
+            <w:tcMar>
+              <w:top w:w="35" w:type="dxa"/>
+              <w:bottom w:w="35" w:type="dxa"/>
+              <w:left w:w="60" w:type="dxa"/>
+              <w:right w:w="60" w:type="dxa"/>
+            </w:tcMar>
+          </w:tcPr>
+          <w:p>
+            <w:pPr>
+              <w:spacing w:before="30" w:after="30"/>
+              <w:jc w:val="left"/>
+            </w:pPr>
+            <w:r>
+              <w:rPr>
+                <w:rFonts w:ascii="Segoe UI" w:hAnsi="Segoe UI"/>
+                <w:color w:val="212121"/>
+                <w:sz w:val="15"/>
+              </w:rPr>
+              <w:t>4.3. Bộ Nhận diện Thương hiệu, Brochure, Standee &amp; Video Hướng dẫn Tác nghiệp</w:t>
+              <w:br/>
+              <w:t xml:space="preserve">   [Thiết kế nhận diện, quay video thực tế quy trình đóng xe &amp; in ấn cẩm nang]</w:t>
+            </w:r>
+          </w:p>
+        </w:tc>
+        <w:tc>
+          <w:tcPr>
+            <w:tcW w:type="dxa" w:w="2016"/>
+            <w:shd w:fill="FFFFFF"/>
+            <w:tcMar>
+              <w:top w:w="35" w:type="dxa"/>
+              <w:bottom w:w="35" w:type="dxa"/>
+              <w:left w:w="60" w:type="dxa"/>
+              <w:right w:w="60" w:type="dxa"/>
+            </w:tcMar>
+          </w:tcPr>
+          <w:p>
+            <w:pPr>
+              <w:spacing w:before="30" w:after="30"/>
+              <w:jc w:val="right"/>
+            </w:pPr>
+            <w:r>
+              <w:rPr>
+                <w:rFonts w:ascii="Consolas" w:hAnsi="Consolas"/>
+                <w:color w:val="212121"/>
+                <w:sz w:val="16"/>
+              </w:rPr>
+              <w:t>50.000.000</w:t>
+            </w:r>
+          </w:p>
+        </w:tc>
+        <w:tc>
+          <w:tcPr>
+            <w:tcW w:type="dxa" w:w="2016"/>
+            <w:shd w:fill="FFFFFF"/>
+            <w:tcMar>
+              <w:top w:w="35" w:type="dxa"/>
+              <w:bottom w:w="35" w:type="dxa"/>
+              <w:left w:w="60" w:type="dxa"/>
+              <w:right w:w="60" w:type="dxa"/>
+            </w:tcMar>
+          </w:tcPr>
+          <w:p>
+            <w:pPr>
+              <w:spacing w:before="30" w:after="30"/>
+              <w:jc w:val="right"/>
+            </w:pPr>
+            <w:r>
+              <w:rPr>
+                <w:rFonts w:ascii="Consolas" w:hAnsi="Consolas"/>
+                <w:color w:val="212121"/>
+                <w:sz w:val="16"/>
+              </w:rPr>
+              <w:t>50.000.000</w:t>
+            </w:r>
+          </w:p>
+        </w:tc>
+      </w:tr>
+      <w:tr>
+        <w:trPr>
+          <w:cantSplit/>
+        </w:trPr>
+        <w:tc>
+          <w:tcPr>
+            <w:tcW w:type="dxa" w:w="4997"/>
+            <w:shd w:fill="F8F9FA"/>
+            <w:tcMar>
+              <w:top w:w="35" w:type="dxa"/>
+              <w:bottom w:w="35" w:type="dxa"/>
+              <w:left w:w="60" w:type="dxa"/>
+              <w:right w:w="60" w:type="dxa"/>
+            </w:tcMar>
+          </w:tcPr>
+          <w:p>
+            <w:pPr>
+              <w:spacing w:before="30" w:after="30"/>
+              <w:jc w:val="left"/>
+            </w:pPr>
+            <w:r>
+              <w:rPr>
+                <w:rFonts w:ascii="Segoe UI" w:hAnsi="Segoe UI"/>
+                <w:color w:val="212121"/>
+                <w:sz w:val="15"/>
+              </w:rPr>
+              <w:t>4.4. Quỹ Khuyến khích &amp; Trợ giá Khởi động 100 Chuyến xe Đầu tiên (Incentive Pool)</w:t>
+              <w:br/>
+              <w:t xml:space="preserve">   [Xây mới: Nền tảng tự bỏ 100% | Đối tác: Đối tác mỏ neo cùng chia sẻ ngân sách]</w:t>
+            </w:r>
+          </w:p>
+        </w:tc>
+        <w:tc>
+          <w:tcPr>
+            <w:tcW w:type="dxa" w:w="2016"/>
+            <w:shd w:fill="F8F9FA"/>
+            <w:tcMar>
+              <w:top w:w="35" w:type="dxa"/>
+              <w:bottom w:w="35" w:type="dxa"/>
+              <w:left w:w="60" w:type="dxa"/>
+              <w:right w:w="60" w:type="dxa"/>
+            </w:tcMar>
+          </w:tcPr>
+          <w:p>
+            <w:pPr>
+              <w:spacing w:before="30" w:after="30"/>
+              <w:jc w:val="right"/>
+            </w:pPr>
+            <w:r>
+              <w:rPr>
+                <w:rFonts w:ascii="Consolas" w:hAnsi="Consolas"/>
+                <w:color w:val="212121"/>
+                <w:sz w:val="16"/>
+              </w:rPr>
+              <w:t>150.000.000</w:t>
+            </w:r>
+          </w:p>
+        </w:tc>
+        <w:tc>
+          <w:tcPr>
+            <w:tcW w:type="dxa" w:w="2016"/>
+            <w:shd w:fill="F8F9FA"/>
+            <w:tcMar>
+              <w:top w:w="35" w:type="dxa"/>
+              <w:bottom w:w="35" w:type="dxa"/>
+              <w:left w:w="60" w:type="dxa"/>
+              <w:right w:w="60" w:type="dxa"/>
+            </w:tcMar>
+          </w:tcPr>
+          <w:p>
+            <w:pPr>
+              <w:spacing w:before="30" w:after="30"/>
+              <w:jc w:val="right"/>
+            </w:pPr>
+            <w:r>
+              <w:rPr>
+                <w:rFonts w:ascii="Consolas" w:hAnsi="Consolas"/>
+                <w:color w:val="212121"/>
+                <w:sz w:val="16"/>
+              </w:rPr>
+              <w:t>70.000.000</w:t>
+            </w:r>
+          </w:p>
+        </w:tc>
+      </w:tr>
+      <w:tr>
+        <w:trPr>
+          <w:cantSplit/>
+        </w:trPr>
+        <w:tc>
+          <w:tcPr>
+            <w:tcW w:type="dxa" w:w="4997"/>
+            <w:shd w:fill="F1F8E9"/>
+            <w:tcMar>
+              <w:top w:w="40" w:type="dxa"/>
+              <w:bottom w:w="40" w:type="dxa"/>
+              <w:left w:w="60" w:type="dxa"/>
+              <w:right w:w="60" w:type="dxa"/>
+            </w:tcMar>
+          </w:tcPr>
+          <w:p>
+            <w:pPr>
+              <w:spacing w:before="40" w:after="40"/>
+              <w:jc w:val="left"/>
+            </w:pPr>
+            <w:r>
+              <w:rPr>
+                <w:rFonts w:ascii="Segoe UI" w:hAnsi="Segoe UI"/>
+                <w:b/>
+                <w:color w:val="2E7D32"/>
+                <w:sz w:val="16"/>
+              </w:rPr>
+              <w:t>Tiểu tổng Nhóm IV: Marketing, Đào tạo &amp; Khởi động (Tiết kiệm 200.000.000 VNĐ)</w:t>
+            </w:r>
+          </w:p>
+        </w:tc>
+        <w:tc>
+          <w:tcPr>
+            <w:tcW w:type="dxa" w:w="2016"/>
+            <w:shd w:fill="F1F8E9"/>
+            <w:tcMar>
+              <w:top w:w="40" w:type="dxa"/>
+              <w:bottom w:w="40" w:type="dxa"/>
+              <w:left w:w="60" w:type="dxa"/>
+              <w:right w:w="60" w:type="dxa"/>
+            </w:tcMar>
+          </w:tcPr>
+          <w:p>
+            <w:pPr>
+              <w:spacing w:before="40" w:after="40"/>
+              <w:jc w:val="right"/>
+            </w:pPr>
+            <w:r>
+              <w:rPr>
+                <w:rFonts w:ascii="Consolas" w:hAnsi="Consolas"/>
+                <w:b/>
+                <w:color w:val="212121"/>
+                <w:sz w:val="16"/>
+              </w:rPr>
+              <w:t>500.000.000</w:t>
+            </w:r>
+          </w:p>
+        </w:tc>
+        <w:tc>
+          <w:tcPr>
+            <w:tcW w:type="dxa" w:w="2016"/>
+            <w:shd w:fill="F1F8E9"/>
+            <w:tcMar>
+              <w:top w:w="40" w:type="dxa"/>
+              <w:bottom w:w="40" w:type="dxa"/>
+              <w:left w:w="60" w:type="dxa"/>
+              <w:right w:w="60" w:type="dxa"/>
+            </w:tcMar>
+          </w:tcPr>
+          <w:p>
+            <w:pPr>
+              <w:spacing w:before="40" w:after="40"/>
+              <w:jc w:val="right"/>
+            </w:pPr>
+            <w:r>
+              <w:rPr>
+                <w:rFonts w:ascii="Consolas" w:hAnsi="Consolas"/>
+                <w:b/>
+                <w:color w:val="212121"/>
+                <w:sz w:val="16"/>
+              </w:rPr>
+              <w:t>300.000.000</w:t>
+            </w:r>
+          </w:p>
+        </w:tc>
+      </w:tr>
+      <w:tr>
+        <w:trPr>
+          <w:cantSplit/>
+        </w:trPr>
+        <w:tc>
+          <w:tcPr>
+            <w:tcW w:type="dxa" w:w="4997"/>
+            <w:shd w:fill="C8E6C9"/>
+            <w:tcMar>
+              <w:top w:w="50" w:type="dxa"/>
+              <w:bottom w:w="50" w:type="dxa"/>
+              <w:left w:w="70" w:type="dxa"/>
+              <w:right w:w="70" w:type="dxa"/>
+            </w:tcMar>
+          </w:tcPr>
+          <w:p>
+            <w:pPr>
+              <w:spacing w:before="60" w:after="60"/>
+              <w:jc w:val="left"/>
+            </w:pPr>
+            <w:r>
+              <w:rPr>
+                <w:rFonts w:ascii="Segoe UI" w:hAnsi="Segoe UI"/>
+                <w:b/>
+                <w:color w:val="1B5E20"/>
+                <w:sz w:val="17"/>
+              </w:rPr>
+              <w:t>TỔNG CHI PHÍ ĐẦU TƯ BAN ĐẦU (CAPEX)</w:t>
+              <w:br/>
+              <w:t>[Mức tiết kiệm vốn đầu tư: 962.500.000 VNĐ - Giảm 34.2%]</w:t>
+            </w:r>
+          </w:p>
+        </w:tc>
+        <w:tc>
+          <w:tcPr>
+            <w:tcW w:type="dxa" w:w="2016"/>
+            <w:shd w:fill="C8E6C9"/>
+            <w:tcMar>
+              <w:top w:w="50" w:type="dxa"/>
+              <w:bottom w:w="50" w:type="dxa"/>
+              <w:left w:w="70" w:type="dxa"/>
+              <w:right w:w="70" w:type="dxa"/>
+            </w:tcMar>
+          </w:tcPr>
+          <w:p>
+            <w:pPr>
+              <w:spacing w:before="60" w:after="60"/>
+              <w:jc w:val="right"/>
+            </w:pPr>
+            <w:r>
+              <w:rPr>
+                <w:rFonts w:ascii="Consolas" w:hAnsi="Consolas"/>
+                <w:b/>
+                <w:color w:val="1B5E20"/>
+                <w:sz w:val="18"/>
+              </w:rPr>
+              <w:t>2.812.500.000</w:t>
+            </w:r>
+          </w:p>
+        </w:tc>
+        <w:tc>
+          <w:tcPr>
+            <w:tcW w:type="dxa" w:w="2016"/>
+            <w:shd w:fill="C8E6C9"/>
+            <w:tcMar>
+              <w:top w:w="50" w:type="dxa"/>
+              <w:bottom w:w="50" w:type="dxa"/>
+              <w:left w:w="70" w:type="dxa"/>
+              <w:right w:w="70" w:type="dxa"/>
+            </w:tcMar>
+          </w:tcPr>
+          <w:p>
+            <w:pPr>
+              <w:spacing w:before="60" w:after="60"/>
+              <w:jc w:val="right"/>
+            </w:pPr>
+            <w:r>
+              <w:rPr>
+                <w:rFonts w:ascii="Consolas" w:hAnsi="Consolas"/>
+                <w:b/>
+                <w:color w:val="1B5E20"/>
+                <w:sz w:val="18"/>
+              </w:rPr>
+              <w:t>1.850.000.000</w:t>
             </w:r>
           </w:p>
         </w:tc>

</xml_diff>

<commit_message>
docs(wording): replace two-tier terminology with Dual-Model Framework (Explainable OLS vs ML Champion XGBoost)
</commit_message>
<xml_diff>
--- a/docs/VNYLT 2026.docx
+++ b/docs/VNYLT 2026.docx
@@ -1031,7 +1031,7 @@
           <w:i/>
           <w:sz w:val="26"/>
         </w:rPr>
-        <w:t>Bước 1. Thu thập dữ liệu và Khung mô hình hóa dự báo sản lượng 2 tầng</w:t>
+        <w:t>Bước 1. Thu thập dữ liệu và Khung tiếp cận kép trong dự báo nhu cầu vận tải (Dual-Model Framework)</w:t>
       </w:r>
     </w:p>
     <w:p>
@@ -3062,11 +3062,9 @@
       <w:r>
         <w:rPr>
           <w:rFonts w:ascii="Times New Roman" w:hAnsi="Times New Roman"/>
-          <w:b w:val="0"/>
-          <w:i w:val="0"/>
-          <w:sz w:val="26"/>
-        </w:rPr>
-        <w:t>Để chuyển đổi dữ liệu thu thập thành sản lượng dự báo (Yₜ) vừa đảm bảo tính minh bạch kinh tế học vừa đạt độ chính xác vận hành tối đa, FROSTLINK thiết lập Khung mô hình hóa 2 tầng (Two-Stage AI Forecasting Framework):</w:t>
+          <w:sz w:val="26"/>
+        </w:rPr>
+        <w:t>Để chuyển đổi dữ liệu thu thập thành sản lượng dự báo (Yₜ) vừa đảm bảo tính minh bạch kinh tế học vừa đạt độ chính xác vận hành chuỗi lạnh, FROSTLINK thiết lập Khung tiếp cận kép (Dual-Model Forecasting Framework) kết hợp bổ trợ giữa Kinh tế lượng và Trí tuệ Nhân tạo:</w:t>
       </w:r>
     </w:p>
     <w:p>
@@ -3079,9 +3077,21 @@
           <w:szCs w:val="26"/>
         </w:rPr>
       </w:pPr>
-      <w:r>
-        <w:t>Tầng 1: Mô hình Kinh tế lượng OLS (Giải thích mối quan hệ nhân quả - Explainable Model):</w:t>
+      <w:r/>
+      <w:r>
+        <w:rPr>
+          <w:rFonts w:ascii="Times New Roman" w:hAnsi="Times New Roman"/>
+          <w:b/>
+          <w:sz w:val="26"/>
+        </w:rPr>
+        <w:t>1. Mô hình Giải thích Nhân quả Kinh tế lượng (Explainable OLS Baseline):</w:t>
         <w:br/>
+      </w:r>
+      <w:r>
+        <w:rPr>
+          <w:rFonts w:ascii="Times New Roman" w:hAnsi="Times New Roman"/>
+          <w:sz w:val="26"/>
+        </w:rPr>
         <w:t>Phương trình hồi quy tuyến tính thực nghiệm trên toàn bộ 92 ngày mùa vụ (R² kiểm chuẩn ngoại suy = 0.865):</w:t>
       </w:r>
     </w:p>
@@ -3336,10 +3346,22 @@
           <w:szCs w:val="26"/>
         </w:rPr>
       </w:pPr>
-      <w:r>
-        <w:t>Tầng 2: Động cơ Học máy phi tuyến XGBoost (Tối ưu hóa độ chính xác vận hành - Champion Engine):</w:t>
+      <w:r/>
+      <w:r>
+        <w:rPr>
+          <w:rFonts w:ascii="Times New Roman" w:hAnsi="Times New Roman"/>
+          <w:b/>
+          <w:sz w:val="26"/>
+        </w:rPr>
+        <w:t>2. Động cơ Học máy Tối ưu Vận hành Chuỗi lạnh (High-Precision ML Champion - XGBoost):</w:t>
         <w:br/>
-        <w:t>Mặc dù mô hình OLS lượng hóa rất tốt bản chất kinh tế, nhưng thời tiết mùa hè Lục Ngạn có các cú sốc dông bão cực đoan tạo ra tương tác phi tuyến mạnh mẽ (khiến mô hình tuyến tính OLS còn sai số 17.29 tấn/ngày, Truck WAPE = 6.94%). Do đó, FROSTLINK tích hợp thuật toán XGBoost (Extreme Gradient Boosting) với cơ chế điều chuẩn hóa L1/L2 và kiểm chuẩn chéo 5-Fold Cross Validation làm động cơ sản xuất lõi (Production Engine). XGBoost học sâu cấu trúc phi tuyến giữa nhiệt độ, lượng mưa tích lũy và tỷ lệ chín, triệt tiêu sai số sản lượng xuống chỉ còn 3.98 tấn/ngày (Truck MAE chỉ còn 0.18 xe/ngày, Truck WAPE đạt 1.53%, R² ngoại suy đạt 0.962) trước khi kích hoạt quy đổi số lượng phương tiện vận tải.</w:t>
+      </w:r>
+      <w:r>
+        <w:rPr>
+          <w:rFonts w:ascii="Times New Roman" w:hAnsi="Times New Roman"/>
+          <w:sz w:val="26"/>
+        </w:rPr>
+        <w:t>Mặc dù mô hình OLS lượng hóa rất tốt bản chất kinh tế, nhưng thời tiết mùa hè Lục Ngạn có các cú sốc dông bão cực đoan tạo ra tương tác phi tuyến mạnh mẽ (khiến mô hình tuyến tính OLS còn sai số 17.29 tấn/ngày, Truck WAPE = 6.94%). Do đó, FROSTLINK tích hợp thuật toán XGBoost (Extreme Gradient Boosting) với cơ chế điều chuẩn hóa L1/L2 và kiểm chuẩn chéo 5-Fold Cross Validation làm động cơ vận hành lõi (Production Champion Engine). XGBoost học sâu cấu trúc phi tuyến giữa nhiệt độ, lượng mưa tích lũy và tỷ lệ chín, triệt tiêu sai số sản lượng xuống chỉ còn 3.98 tấn/ngày (Truck MAE chỉ còn 0.18 xe/ngày, Truck WAPE đạt 1.53%, R² ngoại suy đạt 0.962) trước khi kích hoạt quy đổi số lượng phương tiện vận tải.</w:t>
       </w:r>
     </w:p>
     <w:p>

</xml_diff>

<commit_message>
docs: chuan hoa thuat ngu da mo hinh va bo sung Random Forest vao noi dung bao cao VNYLT 2026
</commit_message>
<xml_diff>
--- a/docs/VNYLT 2026.docx
+++ b/docs/VNYLT 2026.docx
@@ -903,16 +903,13 @@
       </w:pPr>
       <w:r>
         <w:rPr>
-          <w:rFonts w:ascii="Times New Roman" w:cs="Times New Roman" w:eastAsia="Times New Roman" w:hAnsi="Times New Roman"/>
-          <w:b w:val="1"/>
-          <w:bCs w:val="1"/>
-          <w:i w:val="1"/>
-          <w:iCs w:val="1"/>
-          <w:sz w:val="26"/>
-          <w:szCs w:val="26"/>
-          <w:rtl w:val="0"/>
-        </w:rPr>
-        <w:t xml:space="preserve">Bước 1. Thu thập dữ liệu và dự báo sản lượng thu hoạch theo khung mô hình hóa 2 tầng</w:t>
+          <w:rFonts w:ascii="Times New Roman" w:hAnsi="Times New Roman"/>
+          <w:b/>
+          <w:i/>
+          <w:color w:val="000000"/>
+          <w:sz w:val="26"/>
+        </w:rPr>
+        <w:t>Bước 1. Thu thập dữ liệu và dự báo sản lượng thu hoạch qua khung đối chuẩn đa mô hình</w:t>
       </w:r>
     </w:p>
     <w:p>
@@ -3067,12 +3064,13 @@
       </w:pPr>
       <w:r>
         <w:rPr>
-          <w:rFonts w:ascii="Times New Roman" w:cs="Times New Roman" w:eastAsia="Times New Roman" w:hAnsi="Times New Roman"/>
-          <w:sz w:val="26"/>
-          <w:szCs w:val="26"/>
-          <w:rtl w:val="0"/>
-        </w:rPr>
-        <w:t xml:space="preserve">Từ các dữ liệu thu thập được, FrostLink xây dựng mô hình dự báo sản lượng (Yₜ) theo hai tầng, nhằm vừa phản ánh mối quan hệ giữa các yếu tố đầu vào và sản lượng, vừa đáp ứng yêu cầu về độ chính xác trong điều phối vận tải:</w:t>
+          <w:rFonts w:ascii="Times New Roman" w:hAnsi="Times New Roman"/>
+          <w:b w:val="0"/>
+          <w:i w:val="0"/>
+          <w:color w:val="000000"/>
+          <w:sz w:val="26"/>
+        </w:rPr>
+        <w:t>Từ các dữ liệu thu thập được, FrostLink áp dụng khung nghiên cứu và đối chuẩn đa mô hình (Multi-Model Benchmarking Framework) để dự báo sản lượng (Yₜ). Phương pháp tiếp cận này kết hợp chặt chẽ giữa mô hình giải thích kinh tế lượng và các thuật toán học máy phi tuyến, vừa giúp minh bạch hóa cơ chế tác động của các biến số khí tượng - thị trường, vừa đáp ứng chuẩn xác yêu cầu điều phối công suất chuỗi lạnh mùa vụ:</w:t>
       </w:r>
     </w:p>
     <w:p>
@@ -3086,46 +3084,15 @@
           <w:szCs w:val="26"/>
         </w:rPr>
       </w:pPr>
-      <w:commentRangeStart w:id="10"/>
-      <w:commentRangeStart w:id="11"/>
-      <w:commentRangeStart w:id="12"/>
-      <w:commentRangeStart w:id="13"/>
-      <w:commentRangeStart w:id="14"/>
-      <w:r>
-        <w:rPr>
-          <w:rFonts w:ascii="Times New Roman" w:cs="Times New Roman" w:eastAsia="Times New Roman" w:hAnsi="Times New Roman"/>
-          <w:b w:val="1"/>
-          <w:bCs w:val="1"/>
-          <w:sz w:val="26"/>
-          <w:szCs w:val="26"/>
-          <w:rtl w:val="0"/>
-        </w:rPr>
-        <w:t xml:space="preserve">Tầng 1: Mô hình kinh tế lượng OLS</w:t>
-      </w:r>
-      <w:commentRangeEnd w:id="10"/>
-      <w:r>
-        <w:commentReference w:id="10"/>
-      </w:r>
-      <w:commentRangeEnd w:id="11"/>
-      <w:r>
-        <w:commentReference w:id="11"/>
-      </w:r>
-      <w:commentRangeEnd w:id="12"/>
-      <w:r>
-        <w:commentReference w:id="12"/>
-      </w:r>
-      <w:commentRangeEnd w:id="13"/>
-      <w:r>
-        <w:commentReference w:id="13"/>
-      </w:r>
-      <w:commentRangeEnd w:id="14"/>
-      <w:r>
-        <w:commentReference w:id="14"/>
-      </w:r>
-      <w:r>
-        <w:rPr>
-          <w:rtl w:val="0"/>
-        </w:rPr>
+      <w:r>
+        <w:rPr>
+          <w:rFonts w:ascii="Times New Roman" w:hAnsi="Times New Roman"/>
+          <w:b/>
+          <w:i w:val="0"/>
+          <w:color w:val="000000"/>
+          <w:sz w:val="26"/>
+        </w:rPr>
+        <w:t>1. Mô hình kinh tế lượng giải thích (OLS Econometrics)</w:t>
       </w:r>
     </w:p>
     <w:p>
@@ -3372,19 +3339,13 @@
       </w:pPr>
       <w:r>
         <w:rPr>
-          <w:rFonts w:ascii="Times New Roman" w:cs="Times New Roman" w:eastAsia="Times New Roman" w:hAnsi="Times New Roman"/>
-          <w:b w:val="1"/>
-          <w:bCs w:val="1"/>
-          <w:sz w:val="26"/>
-          <w:szCs w:val="26"/>
-          <w:rtl w:val="0"/>
-        </w:rPr>
-        <w:t xml:space="preserve">Tầng 2: Động cơ học máy phi tuyến XGBoost</w:t>
-      </w:r>
-      <w:r>
-        <w:rPr>
-          <w:rtl w:val="0"/>
-        </w:rPr>
+          <w:rFonts w:ascii="Times New Roman" w:hAnsi="Times New Roman"/>
+          <w:b/>
+          <w:i w:val="0"/>
+          <w:color w:val="000000"/>
+          <w:sz w:val="26"/>
+        </w:rPr>
+        <w:t>2. Mô hình học máy phi tuyến đối chuẩn (Random Forest - Rừng cây quyết định)</w:t>
       </w:r>
     </w:p>
     <w:p>
@@ -3398,7 +3359,38 @@
         </w:rPr>
       </w:pPr>
       <w:r>
-        <w:t>Mô hình OLS có khả năng phản ánh rõ nét mối quan hệ kinh tế giữa các yếu tố đầu vào và sản lượng thu hoạch. Tuy nhiên, trong điều kiện thời tiết mùa hè tại Lục Ngạn, các hiện tượng dông bão tạo ra những cú sốc phi tuyến bất thường mà mô hình tuyến tính khó phản ánh đầy đủ, dẫn đến sai số dự báo sản lượng kiểm chuẩn ngoại suy là 24,50 tấn/ngày (tương đương sai số 1,45 cont/ngày). Vì vậy, FrostLink tích hợp thuật toán XGBoost làm động cơ vận hành chính xác cao. Thuật toán này khai thác cấu trúc phi tuyến phức tạp giữa nhiệt độ, lượng mưa tích lũy và tỷ lệ chín đỏ, qua đó giảm sai số dự báo sản lượng ngoại suy xuống còn 18,05 tấn/ngày. Khi quy đổi sang tác nghiệp chuỗi lạnh, sai số điều xe được cắt giảm 51,4% so với cách làm thủ công của HTX (từ 2,16 cont xuống còn 1,05 cont/ngày), đưa Truck WAPE về mức 8,71% và R² ngoại suy đạt 0,852 vững chắc.</w:t>
+        <w:rPr>
+          <w:rFonts w:ascii="Times New Roman" w:hAnsi="Times New Roman"/>
+          <w:b w:val="0"/>
+          <w:i w:val="0"/>
+          <w:color w:val="000000"/>
+          <w:sz w:val="26"/>
+        </w:rPr>
+        <w:t>Trong điều kiện canh tác nông nghiệp mùa hè tại Lục Ngạn, các yếu tố thời tiết thường tạo ra những ngưỡng tác động phi tuyến mang tính đứt gãy mạnh (Non-linear Threshold Effects). Điển hình như khi lượng mưa dông vượt ngưỡng 20mm, nông dân buộc phải dừng bẻ cành hoàn toàn, khiến sản lượng thu hoạch sụt giảm đột ngột mà mô hình tuyến tính OLS khó có thể uốn cong kịp thời (dẫn đến sai số kiểm chuẩn ngoại suy của OLS lên tới 24,50 tấn/ngày, tương đương lệch 1,45 cont/ngày). Nhằm khắc phục hạn chế này, FrostLink đưa vào mô hình học máy phi tuyến Random Forest làm đối chuẩn nền tảng (Non-linear Benchmark). Thuật toán này ứng dụng kỹ thuật kết hợp cây song song (Bagging - Bootstrap Aggregating) với một 'hội đồng' 50 cây quyết định độc lập. Mỗi cây được huấn luyện trên một tập dữ liệu con ngẫu nhiên và kết quả dự báo cuối cùng là trung bình cộng biểu quyết số đông, giúp triệt tiêu phương sai và chống quá khớp (overfitting) rất tốt. Kết quả thực nghiệm kiểm chuẩn ngoại suy cho thấy Random Forest đã nâng cao độ chính xác rõ rệt so với OLS: sai số sản lượng giảm xuống còn 19,80 tấn/ngày, tương đương Truck MAE đạt 1,18 cont/ngày và Truck WAPE đạt 9,81% (R² ngoại suy đạt 0,812, cải thiện 45,3% so với phương pháp thủ công của HTX). Tuy nhiên, do các cây quyết định trong rừng được phát triển độc lập và lấy trung bình giản đơn, Random Forest vẫn gặp độ trễ nhất định ở các ngày có cú sốc dông bão cực đoan ở biên dữ liệu.</w:t>
+      </w:r>
+    </w:p>
+    <w:p>
+      <w:r>
+        <w:rPr>
+          <w:rFonts w:ascii="Times New Roman" w:hAnsi="Times New Roman"/>
+          <w:b/>
+          <w:i w:val="0"/>
+          <w:color w:val="000000"/>
+          <w:sz w:val="26"/>
+        </w:rPr>
+        <w:t>3. Động cơ học máy tối ưu vận hành lõi (XGBoost Champion Model)</w:t>
+      </w:r>
+    </w:p>
+    <w:p>
+      <w:r>
+        <w:rPr>
+          <w:rFonts w:ascii="Times New Roman" w:hAnsi="Times New Roman"/>
+          <w:b w:val="0"/>
+          <w:i w:val="0"/>
+          <w:color w:val="000000"/>
+          <w:sz w:val="26"/>
+        </w:rPr>
+        <w:t>Để giải quyết triệt để điểm yếu của Random Forest và tối ưu hóa độ chính xác phục vụ tác nghiệp điều xe thực tế, FrostLink nâng cấp lên thuật toán Extreme Gradient Boosting (XGBoost) làm động cơ vận hành lõi cho toàn bộ nền tảng. Khác với cơ chế phân nhánh độc lập của Random Forest, XGBoost hoạt động theo nguyên lý học tăng cường chuỗi tuần tự (Sequential Error Correction): mỗi cây quyết định sinh ra phía sau sẽ tập trung toàn lực học và bù đắp chính xác phần dư sai số (residual) của các cây phía trước. Đồng thời, XGBoost tích hợp sẵn hàm phạt điều chuẩn hóa tham số (Regularization L1/L2) trong hàm mất mát, giúp kiểm soát chặt chẽ độ sâu phân nhánh và ngăn chặn hiện tượng học vẹt trước các biến động thời tiết bất thường. Nhờ cơ chế sửa sai liên tục và kiểm soát quá khớp tối ưu, XGBoost đạt hiệu năng vượt trội nhất toàn diện: sai số dự báo sản lượng ngoại suy giảm xuống chỉ còn 18,05 tấn/ngày. Khi quy đổi sang tác nghiệp chuỗi lạnh, sai số điều xe được cắt giảm tới 51,4% so với cách làm thủ công của HTX (từ 2,16 cont xuống còn 1,05 cont/ngày), đưa Truck WAPE về mức 8,71% và R² ngoại suy đạt 0,852 vững chắc. Đây là cơ sở khoa học xác đáng để lựa chọn XGBoost làm động cơ vận hành trung tâm cho FrostLink.</w:t>
       </w:r>
     </w:p>
     <w:p>
@@ -6030,7 +6022,20 @@
         </w:rPr>
       </w:pPr>
       <w:r>
-        <w:t>Kết luận: Thuật toán XGBoost được lựa chọn làm động cơ vận hành lõi cho nền tảng FROSTLINK, giúp giảm sai số điều xe tới 51.4% so với cách làm thủ công của HTX (từ 2.16 cont xuống 1.05 cont/ngày), đưa Truck WAPE từ 17.92% xuống mức 8.71% và R² ngoại suy đạt 0.852 vững chắc.</w:t>
+        <w:rPr>
+          <w:rFonts w:ascii="Times New Roman" w:hAnsi="Times New Roman"/>
+          <w:b w:val="0"/>
+          <w:i w:val="0"/>
+          <w:color w:val="000000"/>
+          <w:sz w:val="26"/>
+        </w:rPr>
+        <w:t>Biện luận chuyên sâu kết quả đối chuẩn mô hình (Bảng 5.1):</w:t>
+        <w:br/>
+        <w:t>• Chiều hướng Tuyến tính vs Phi tuyến (OLS so với Random Forest &amp; XGBoost): Cả hai mô hình cây quyết định đều cải thiện vượt bậc so với OLS (R² tăng từ 0.725 lên 0.812 và 0.852; sai số sản lượng giảm từ 24,50 tấn xuống 19,80 tấn và 18,05 tấn). Điều này chứng minh mối quan hệ giữa biến động vi khí hậu và sản lượng nông nghiệp thực tế mang tính phi tuyến rõ nét, khẳng định việc ứng dụng học máy phi tuyến là hướng đi tất yếu của chuỗi lạnh mùa vụ.</w:t>
+        <w:br/>
+        <w:t>• Chiều hướng Đối đầu Trực diện: Random Forest (Bagging) vs XGBoost (Boosting): Mặc dù Random Forest kiểm soát phương sai rất tốt và đưa sai số điều xe về 1,18 cont/ngày (WAPE 9,81%), nhưng XGBoost vẫn thể hiện sự vượt trội rõ rệt khi giảm thêm 8,8% sai số sản lượng và giảm thêm 0,13 cont/ngày (đưa WAPE về mức 8,71%). Trong tác nghiệp logistics chuỗi lạnh thực tế, việc giảm thêm 0,13 cont/ngày đóng vai trò then chốt trong việc giải tỏa áp lực ùn ứ hàng chục tấn vải tươi mỗi tuần khi thời tiết chuyển mưa bão đột ngột. Cơ chế học tăng cường phần dư tuần tự và hàm phạt Regularization đã giúp XGBoost phản ứng chính xác và ổn định hơn hẳn trước các cú sốc thời tiết dị thường tại Lục Ngạn.</w:t>
+        <w:br/>
+        <w:t>• Quyết định lựa chọn Động cơ vận hành: Với hiệu năng dẫn đầu toàn diện trên cả 4 chỉ số đo lường thực nghiệm, thuật toán XGBoost chính thức được chọn làm Động cơ vận hành lõi (FrostLink Champion Model) cho toàn bộ hệ thống dự báo và điều phối của nền tảng.</w:t>
       </w:r>
     </w:p>
     <w:p>
@@ -6372,13 +6377,20 @@
         </w:rPr>
       </w:pPr>
       <w:r>
-        <w:t>Luận giải Phân tầng Giá trị Thực thi (Two-Tier Value Architecture): Kết quả thực nghiệm khẳng định đề án FrostLink đạt hiệu quả vận hành vượt trội thông qua sự kết hợp chặt chẽ của 2 tầng giá trị độc lập và bổ trợ lẫn nhau:</w:t>
+        <w:rPr>
+          <w:rFonts w:ascii="Times New Roman" w:hAnsi="Times New Roman"/>
+          <w:b w:val="0"/>
+          <w:i w:val="0"/>
+          <w:color w:val="000000"/>
+          <w:sz w:val="26"/>
+        </w:rPr>
+        <w:t>Luận giải Hai Trụ cột Giá trị Thực thi (Two-Pillar Value Architecture): Kết quả thực nghiệm khẳng định đề án FrostLink đạt hiệu quả vận hành vượt trội thông qua sự kết hợp chặt chẽ của 2 trụ cột giá trị độc lập và bổ trợ lẫn nhau:</w:t>
         <w:br/>
-        <w:t>• Tầng 1 (Động cơ AI Dự báo - Khung tiếp cận kép): Mô hình XGBoost cắt giảm 51.4% sai số điều xe thực địa (Truck WAPE giảm từ 17.92% xuống 8.71%, R² = 0.852), đóng vai trò 'la bàn định hướng' chuẩn xác cho nhu cầu công suất xe lạnh.</w:t>
+        <w:t>• Trụ cột 1 (Động cơ AI Dự báo chính xác cao): Mô hình XGBoost cắt giảm 51.4% sai số điều xe thực địa (Truck WAPE giảm từ 17.92% xuống 8.71%, R² = 0.852), đóng vai trò 'la bàn định hướng' chuẩn xác cho nhu cầu công suất xe lạnh.</w:t>
         <w:br/>
-        <w:t>• Tầng 2 (Cơ chế Quản trị Rủi ro Hợp đồng 3 Lớp Newsvendor): Cơ chế đặt cọc linh hoạt Lớp 2 cho phép hủy slot xe trước 24h khi có dông bão, đóng vai trò 'tấm khiên tài chính' giúp cắt giảm 51.5% tổng chi phí rủi ro chuỗi lạnh (thu hồi 429.8 triệu VNĐ tổn thất cho HTX).</w:t>
+        <w:t>• Trụ cột 2 (Cơ chế Quản trị Rủi ro Hợp đồng 3 Lớp Newsvendor): Cơ chế đặt cọc linh hoạt Lớp 2 cho phép hủy slot xe trước 24h khi có dông bão, đóng vai trò 'tấm khiên tài chính' giúp cắt giảm 51.5% tổng chi phí rủi ro chuỗi lạnh (thu hồi 429.8 triệu VNĐ tổn thất cho HTX).</w:t>
         <w:br/>
-        <w:t>Sự cộng hưởng giữa AI thực tế (~51%) và Hợp đồng kinh tế linh hoạt tạo nên một mô hình giải pháp vững chắc, khoa học và hoàn toàn khả thi ngoài thực địa.</w:t>
+        <w:t>Sự cộng hưởng giữa Động cơ AI tối ưu (~51%) và Hợp đồng kinh tế linh hoạt tạo nên một mô hình giải pháp vững chắc, khoa học và hoàn toàn khả thi ngoài thực địa.</w:t>
       </w:r>
     </w:p>
     <w:p>

</xml_diff>

<commit_message>
docs: tinh gon noi dung mo hinh hoa theo tieu chuan nghiep vu kinh te va logistics VYLT
</commit_message>
<xml_diff>
--- a/docs/VNYLT 2026.docx
+++ b/docs/VNYLT 2026.docx
@@ -3345,7 +3345,7 @@
           <w:color w:val="000000"/>
           <w:sz w:val="26"/>
         </w:rPr>
-        <w:t>2. Mô hình học máy phi tuyến đối chuẩn (Random Forest - Rừng cây quyết định)</w:t>
+        <w:t>2. Đối chuẩn và Lựa chọn Mô hình: Từ Kinh tế lượng đến Học máy Thực nghiệm</w:t>
       </w:r>
     </w:p>
     <w:p>
@@ -3366,31 +3366,13 @@
           <w:color w:val="000000"/>
           <w:sz w:val="26"/>
         </w:rPr>
-        <w:t>Trong điều kiện canh tác nông nghiệp mùa hè tại Lục Ngạn, các yếu tố thời tiết thường tạo ra những ngưỡng tác động phi tuyến mang tính đứt gãy mạnh (Non-linear Threshold Effects). Điển hình như khi lượng mưa dông vượt ngưỡng 20mm, nông dân buộc phải dừng bẻ cành hoàn toàn, khiến sản lượng thu hoạch sụt giảm đột ngột mà mô hình tuyến tính OLS khó có thể uốn cong kịp thời (dẫn đến sai số kiểm chuẩn ngoại suy của OLS lên tới 24,50 tấn/ngày, tương đương lệch 1,45 cont/ngày). Nhằm khắc phục hạn chế này, FrostLink đưa vào mô hình học máy phi tuyến Random Forest làm đối chuẩn nền tảng (Non-linear Benchmark). Thuật toán này ứng dụng kỹ thuật kết hợp cây song song (Bagging - Bootstrap Aggregating) với một 'hội đồng' 50 cây quyết định độc lập. Mỗi cây được huấn luyện trên một tập dữ liệu con ngẫu nhiên và kết quả dự báo cuối cùng là trung bình cộng biểu quyết số đông, giúp triệt tiêu phương sai và chống quá khớp (overfitting) rất tốt. Kết quả thực nghiệm kiểm chuẩn ngoại suy cho thấy Random Forest đã nâng cao độ chính xác rõ rệt so với OLS: sai số sản lượng giảm xuống còn 19,80 tấn/ngày, tương đương Truck MAE đạt 1,18 cont/ngày và Truck WAPE đạt 9,81% (R² ngoại suy đạt 0,812, cải thiện 45,3% so với phương pháp thủ công của HTX). Tuy nhiên, do các cây quyết định trong rừng được phát triển độc lập và lấy trung bình giản đơn, Random Forest vẫn gặp độ trễ nhất định ở các ngày có cú sốc dông bão cực đoan ở biên dữ liệu.</w:t>
-      </w:r>
-    </w:p>
-    <w:p>
-      <w:r>
-        <w:rPr>
-          <w:rFonts w:ascii="Times New Roman" w:hAnsi="Times New Roman"/>
-          <w:b/>
-          <w:i w:val="0"/>
-          <w:color w:val="000000"/>
-          <w:sz w:val="26"/>
-        </w:rPr>
-        <w:t>3. Động cơ học máy tối ưu vận hành lõi (XGBoost Champion Model)</w:t>
-      </w:r>
-    </w:p>
-    <w:p>
-      <w:r>
-        <w:rPr>
-          <w:rFonts w:ascii="Times New Roman" w:hAnsi="Times New Roman"/>
-          <w:b w:val="0"/>
-          <w:i w:val="0"/>
-          <w:color w:val="000000"/>
-          <w:sz w:val="26"/>
-        </w:rPr>
-        <w:t>Để giải quyết triệt để điểm yếu của Random Forest và tối ưu hóa độ chính xác phục vụ tác nghiệp điều xe thực tế, FrostLink nâng cấp lên thuật toán Extreme Gradient Boosting (XGBoost) làm động cơ vận hành lõi cho toàn bộ nền tảng. Khác với cơ chế phân nhánh độc lập của Random Forest, XGBoost hoạt động theo nguyên lý học tăng cường chuỗi tuần tự (Sequential Error Correction): mỗi cây quyết định sinh ra phía sau sẽ tập trung toàn lực học và bù đắp chính xác phần dư sai số (residual) của các cây phía trước. Đồng thời, XGBoost tích hợp sẵn hàm phạt điều chuẩn hóa tham số (Regularization L1/L2) trong hàm mất mát, giúp kiểm soát chặt chẽ độ sâu phân nhánh và ngăn chặn hiện tượng học vẹt trước các biến động thời tiết bất thường. Nhờ cơ chế sửa sai liên tục và kiểm soát quá khớp tối ưu, XGBoost đạt hiệu năng vượt trội nhất toàn diện: sai số dự báo sản lượng ngoại suy giảm xuống chỉ còn 18,05 tấn/ngày. Khi quy đổi sang tác nghiệp chuỗi lạnh, sai số điều xe được cắt giảm tới 51,4% so với cách làm thủ công của HTX (từ 2,16 cont xuống còn 1,05 cont/ngày), đưa Truck WAPE về mức 8,71% và R² ngoại suy đạt 0,852 vững chắc. Đây là cơ sở khoa học xác đáng để lựa chọn XGBoost làm động cơ vận hành trung tâm cho FrostLink.</w:t>
+        <w:t>Nhằm tìm kiếm phương án điều phối tối ưu, đề án thực hiện kiểm thử đối chuẩn qua 3 cách tiếp cận khoa học:</w:t>
+        <w:br/>
+        <w:t>• Hồi quy OLS (Kinh tế lượng giải thích): Giúp lượng hóa độ nhạy của sản lượng trước từng yếu tố thời tiết (hệ số biên β). Tuy nhiên, hạn chế của OLS là giả định tuyến tính (đường thẳng), không phản ánh được các ngưỡng đứt gãy mùa vụ (ví dụ: khi mưa dông vượt 20mm là nông dân dừng bẻ cành hoàn toàn), khiến sai số ngoại suy còn cao (24,50 tấn/ngày, tương đương sai số 1,45 cont/ngày).</w:t>
+        <w:br/>
+        <w:t>• Random Forest (Học máy phi tuyến đối chuẩn): Đóng vai trò mô hình thử nghiệm phi tuyến dựa trên cây quyết định. Thuật toán này nắm bắt tốt các ngưỡng đứt gãy thời tiết thực địa, kéo sai số sản lượng xuống 19,80 tấn/ngày (Truck MAE đạt 1,18 cont/ngày, WAPE 9,81%, cải thiện 45,3% so với thủ công). Tuy nhiên, mô hình vẫn bộc lộ độ trễ phản ứng nhất định khi gặp các đợt dông bão dị thường ở biên phân phối.</w:t>
+        <w:br/>
+        <w:t>• XGBoost (Động cơ tối ưu vận hành lõi): Nhờ cơ chế tự động tinh chỉnh và bù trừ sai số liên tục trước các biến động thời tiết cực đoan, XGBoost đạt hiệu năng vượt trội nhất toàn diện: sai số sản lượng ngoại suy chỉ còn 18,05 tấn/ngày, cắt giảm tới 51,4% sai số điều xe thực địa so với cách làm thủ công của HTX (từ 2,16 cont xuống còn 1,05 cont/ngày, Truck WAPE về mức 8,71% và R² ngoại suy đạt 0,852). Đây là động cơ lõi chuẩn xác nhất được lựa chọn làm căn cứ chốt công suất xe lạnh cho toàn bộ nền tảng FrostLink.</w:t>
       </w:r>
     </w:p>
     <w:p>
@@ -6029,13 +6011,13 @@
           <w:color w:val="000000"/>
           <w:sz w:val="26"/>
         </w:rPr>
-        <w:t>Biện luận chuyên sâu kết quả đối chuẩn mô hình (Bảng 5.1):</w:t>
+        <w:t>Biện luận kết quả đối chuẩn mô hình (Bảng 5.1):</w:t>
         <w:br/>
-        <w:t>• Chiều hướng Tuyến tính vs Phi tuyến (OLS so với Random Forest &amp; XGBoost): Cả hai mô hình cây quyết định đều cải thiện vượt bậc so với OLS (R² tăng từ 0.725 lên 0.812 và 0.852; sai số sản lượng giảm từ 24,50 tấn xuống 19,80 tấn và 18,05 tấn). Điều này chứng minh mối quan hệ giữa biến động vi khí hậu và sản lượng nông nghiệp thực tế mang tính phi tuyến rõ nét, khẳng định việc ứng dụng học máy phi tuyến là hướng đi tất yếu của chuỗi lạnh mùa vụ.</w:t>
+        <w:t>• Khảo sát Tuyến tính vs Phi tuyến (OLS so với Random Forest &amp; XGBoost): Cả hai mô hình cây đều vượt trội rõ rệt so với OLS (R² tăng từ 0.725 lên 0.812 và 0.852; sai số sản lượng giảm từ 24,50 tấn xuống 19,80 tấn và 18,05 tấn). Điều này chứng minh tác động của thời tiết đến sản lượng thu hoạch thực tế mang tính phi tuyến rõ nét theo các ngưỡng đứt gãy mùa vụ.</w:t>
         <w:br/>
-        <w:t>• Chiều hướng Đối đầu Trực diện: Random Forest (Bagging) vs XGBoost (Boosting): Mặc dù Random Forest kiểm soát phương sai rất tốt và đưa sai số điều xe về 1,18 cont/ngày (WAPE 9,81%), nhưng XGBoost vẫn thể hiện sự vượt trội rõ rệt khi giảm thêm 8,8% sai số sản lượng và giảm thêm 0,13 cont/ngày (đưa WAPE về mức 8,71%). Trong tác nghiệp logistics chuỗi lạnh thực tế, việc giảm thêm 0,13 cont/ngày đóng vai trò then chốt trong việc giải tỏa áp lực ùn ứ hàng chục tấn vải tươi mỗi tuần khi thời tiết chuyển mưa bão đột ngột. Cơ chế học tăng cường phần dư tuần tự và hàm phạt Regularization đã giúp XGBoost phản ứng chính xác và ổn định hơn hẳn trước các cú sốc thời tiết dị thường tại Lục Ngạn.</w:t>
+        <w:t>• Đối chuẩn thực nghiệm Random Forest vs XGBoost: Mặc dù Random Forest đã cải thiện đáng kể sai số điều xe về 1,18 cont/ngày (WAPE 9,81%), nhưng XGBoost vẫn thể hiện sự vượt trội khi giảm thêm 0,13 cont/ngày (đưa WAPE về mức 8,71%). Trong tác nghiệp logistics chuỗi lạnh thực tế, việc giảm thêm 0,13 cont/ngày giúp HTX chủ động giải phóng hàng chục tấn vải tươi mỗi tuần khi thời tiết chuyển mưa bão đột ngột, hạn chế tối đa chi phí phạt rỗng và ép cước.</w:t>
         <w:br/>
-        <w:t>• Quyết định lựa chọn Động cơ vận hành: Với hiệu năng dẫn đầu toàn diện trên cả 4 chỉ số đo lường thực nghiệm, thuật toán XGBoost chính thức được chọn làm Động cơ vận hành lõi (FrostLink Champion Model) cho toàn bộ hệ thống dự báo và điều phối của nền tảng.</w:t>
+        <w:t>• Quyết định lựa chọn: Với hiệu năng dẫn đầu toàn diện trên cả 4 chỉ số đo lường thực nghiệm, thuật toán XGBoost chính thức được chọn làm Động cơ vận hành lõi (FrostLink Champion Model) cho toàn bộ hệ thống điều phối của đề án.</w:t>
       </w:r>
     </w:p>
     <w:p>

</xml_diff>

<commit_message>
docs: tinh gon Buoc 4 Dieu phoi MILP thanh 4 doan gom cum suc tich
</commit_message>
<xml_diff>
--- a/docs/VNYLT 2026.docx
+++ b/docs/VNYLT 2026.docx
@@ -4104,831 +4104,79 @@
       </w:pPr>
       <w:r>
         <w:rPr>
-          <w:rFonts w:ascii="Times New Roman" w:cs="Times New Roman" w:eastAsia="Times New Roman" w:hAnsi="Times New Roman"/>
-          <w:sz w:val="26"/>
-          <w:szCs w:val="26"/>
-          <w:rtl w:val="0"/>
-        </w:rPr>
-        <w:t xml:space="preserve">Ở bước này, FrostLink không chỉ ghép 1 nhu cầu - 1 xe, mà xem toàn bộ mạng lưới trong một khoảng thời gian (ví dụ 1 - 3 ngày):</w:t>
-      </w:r>
-    </w:p>
-    <w:p>
-      <w:pPr>
-        <w:spacing w:after="20" w:before="20" w:line="312" w:lineRule="auto"/>
-        <w:ind w:left="280" w:firstLine="0"/>
-        <w:jc w:val="both"/>
-        <w:rPr>
-          <w:rFonts w:ascii="Times New Roman" w:cs="Times New Roman" w:eastAsia="Times New Roman" w:hAnsi="Times New Roman"/>
-          <w:sz w:val="26"/>
-          <w:szCs w:val="26"/>
-        </w:rPr>
-      </w:pPr>
-      <w:r>
-        <w:rPr>
-          <w:rFonts w:ascii="Times New Roman" w:cs="Times New Roman" w:eastAsia="Times New Roman" w:hAnsi="Times New Roman"/>
-          <w:sz w:val="26"/>
-          <w:szCs w:val="26"/>
-          <w:rtl w:val="0"/>
-        </w:rPr>
-        <w:t xml:space="preserve">• Gom tất cả nhu cầu từ nhiều HTX, nhiều điểm gom hàng.</w:t>
-      </w:r>
-    </w:p>
-    <w:p>
-      <w:pPr>
-        <w:spacing w:after="20" w:before="20" w:line="312" w:lineRule="auto"/>
-        <w:ind w:left="280" w:firstLine="0"/>
-        <w:jc w:val="both"/>
-        <w:rPr>
-          <w:rFonts w:ascii="Times New Roman" w:cs="Times New Roman" w:eastAsia="Times New Roman" w:hAnsi="Times New Roman"/>
-          <w:sz w:val="26"/>
-          <w:szCs w:val="26"/>
-        </w:rPr>
-      </w:pPr>
-      <w:r>
-        <w:rPr>
-          <w:rFonts w:ascii="Times New Roman" w:cs="Times New Roman" w:eastAsia="Times New Roman" w:hAnsi="Times New Roman"/>
-          <w:sz w:val="26"/>
-          <w:szCs w:val="26"/>
-          <w:rtl w:val="0"/>
-        </w:rPr>
-        <w:t xml:space="preserve">• Gom tất cả xe khả dụng (của đối tác cố định + xe vãng lai).</w:t>
-      </w:r>
-    </w:p>
-    <w:p>
-      <w:pPr>
-        <w:spacing w:after="20" w:before="20" w:line="312" w:lineRule="auto"/>
-        <w:ind w:left="280" w:firstLine="0"/>
-        <w:jc w:val="both"/>
-        <w:rPr>
-          <w:rFonts w:ascii="Times New Roman" w:cs="Times New Roman" w:eastAsia="Times New Roman" w:hAnsi="Times New Roman"/>
-          <w:sz w:val="26"/>
-          <w:szCs w:val="26"/>
-        </w:rPr>
-      </w:pPr>
-      <w:r>
-        <w:rPr>
-          <w:rFonts w:ascii="Times New Roman" w:cs="Times New Roman" w:eastAsia="Times New Roman" w:hAnsi="Times New Roman"/>
-          <w:sz w:val="26"/>
-          <w:szCs w:val="26"/>
-          <w:rtl w:val="0"/>
-        </w:rPr>
-        <w:t xml:space="preserve">• Đưa vào mô hình Quy hoạch tuyến tính nguyên (MILP – Mixed Integer Linear Programming).</w:t>
-      </w:r>
-    </w:p>
-    <w:p>
-      <w:pPr>
-        <w:spacing w:after="20" w:before="20" w:line="312" w:lineRule="auto"/>
-        <w:ind w:left="280" w:firstLine="0"/>
-        <w:jc w:val="both"/>
-        <w:rPr>
-          <w:rFonts w:ascii="Times New Roman" w:cs="Times New Roman" w:eastAsia="Times New Roman" w:hAnsi="Times New Roman"/>
-          <w:sz w:val="26"/>
-          <w:szCs w:val="26"/>
-        </w:rPr>
-      </w:pPr>
-      <w:r>
-        <w:rPr>
-          <w:rFonts w:ascii="Times New Roman" w:cs="Times New Roman" w:eastAsia="Times New Roman" w:hAnsi="Times New Roman"/>
-          <w:sz w:val="26"/>
-          <w:szCs w:val="26"/>
-          <w:rtl w:val="0"/>
-        </w:rPr>
-        <w:t xml:space="preserve">• Sử dụng bộ giải như Gurobi / PuLP (Python) để tìm phương án phân bổ tối ưu toàn cục.</w:t>
-      </w:r>
-    </w:p>
-    <w:p>
-      <w:pPr>
-        <w:spacing w:after="20" w:before="60" w:line="312" w:lineRule="auto"/>
-        <w:jc w:val="both"/>
-        <w:rPr>
-          <w:rFonts w:ascii="Times New Roman" w:cs="Times New Roman" w:eastAsia="Times New Roman" w:hAnsi="Times New Roman"/>
-          <w:sz w:val="26"/>
-          <w:szCs w:val="26"/>
-        </w:rPr>
-      </w:pPr>
-      <w:r>
-        <w:rPr>
-          <w:rFonts w:ascii="Times New Roman" w:cs="Times New Roman" w:eastAsia="Times New Roman" w:hAnsi="Times New Roman"/>
-          <w:sz w:val="26"/>
-          <w:szCs w:val="26"/>
-          <w:rtl w:val="0"/>
-        </w:rPr>
-        <w:t xml:space="preserve">Mục tiêu của MILP:</w:t>
-      </w:r>
-    </w:p>
-    <w:p>
-      <w:pPr>
-        <w:spacing w:after="20" w:before="20" w:line="312" w:lineRule="auto"/>
-        <w:ind w:left="280" w:firstLine="0"/>
-        <w:jc w:val="both"/>
-        <w:rPr>
-          <w:rFonts w:ascii="Times New Roman" w:cs="Times New Roman" w:eastAsia="Times New Roman" w:hAnsi="Times New Roman"/>
-          <w:sz w:val="26"/>
-          <w:szCs w:val="26"/>
-        </w:rPr>
-      </w:pPr>
-      <w:r>
-        <w:rPr>
-          <w:rFonts w:ascii="Times New Roman" w:cs="Times New Roman" w:eastAsia="Times New Roman" w:hAnsi="Times New Roman"/>
-          <w:sz w:val="26"/>
-          <w:szCs w:val="26"/>
-          <w:rtl w:val="0"/>
-        </w:rPr>
-        <w:t xml:space="preserve">• Ghép nối đa chuyến: một xe có thể chạy nhiều chặng / nhiều điểm trong ngày.</w:t>
-      </w:r>
-    </w:p>
-    <w:p>
-      <w:pPr>
-        <w:spacing w:after="20" w:before="20" w:line="312" w:lineRule="auto"/>
-        <w:ind w:left="280" w:firstLine="0"/>
-        <w:jc w:val="both"/>
-        <w:rPr>
-          <w:rFonts w:ascii="Times New Roman" w:cs="Times New Roman" w:eastAsia="Times New Roman" w:hAnsi="Times New Roman"/>
-          <w:sz w:val="26"/>
-          <w:szCs w:val="26"/>
-        </w:rPr>
-      </w:pPr>
-      <w:r>
-        <w:rPr>
-          <w:rFonts w:ascii="Times New Roman" w:cs="Times New Roman" w:eastAsia="Times New Roman" w:hAnsi="Times New Roman"/>
-          <w:sz w:val="26"/>
-          <w:szCs w:val="26"/>
-          <w:rtl w:val="0"/>
-        </w:rPr>
-        <w:t xml:space="preserve">• Triệt tiêu km chạy rỗng: giảm tối đa quãng đường xe không có hàng.</w:t>
-      </w:r>
-    </w:p>
-    <w:p>
-      <w:pPr>
-        <w:spacing w:after="20" w:before="20" w:line="312" w:lineRule="auto"/>
-        <w:ind w:left="280" w:firstLine="0"/>
-        <w:jc w:val="both"/>
-        <w:rPr>
-          <w:rFonts w:ascii="Times New Roman" w:cs="Times New Roman" w:eastAsia="Times New Roman" w:hAnsi="Times New Roman"/>
-          <w:sz w:val="26"/>
-          <w:szCs w:val="26"/>
-        </w:rPr>
-      </w:pPr>
-      <w:r>
-        <w:rPr>
-          <w:rFonts w:ascii="Times New Roman" w:cs="Times New Roman" w:eastAsia="Times New Roman" w:hAnsi="Times New Roman"/>
-          <w:sz w:val="26"/>
-          <w:szCs w:val="26"/>
-          <w:rtl w:val="0"/>
-        </w:rPr>
-        <w:t xml:space="preserve">• Cân bằng tải: tránh tình trạng có nơi thừa xe, nơi thiếu xe.</w:t>
-      </w:r>
-    </w:p>
-    <w:p>
-      <w:pPr>
-        <w:spacing w:after="100" w:before="40" w:line="312" w:lineRule="auto"/>
-        <w:jc w:val="both"/>
-        <w:rPr>
-          <w:rFonts w:ascii="Times New Roman" w:cs="Times New Roman" w:eastAsia="Times New Roman" w:hAnsi="Times New Roman"/>
-          <w:sz w:val="26"/>
-          <w:szCs w:val="26"/>
-        </w:rPr>
-      </w:pPr>
-      <w:r>
-        <w:rPr>
-          <w:rFonts w:ascii="Times New Roman" w:cs="Times New Roman" w:eastAsia="Times New Roman" w:hAnsi="Times New Roman"/>
-          <w:sz w:val="26"/>
-          <w:szCs w:val="26"/>
-          <w:rtl w:val="0"/>
-        </w:rPr>
-        <w:t xml:space="preserve">Nhờ MILP, FrostLink không chỉ có xe, mà còn có lộ trình xe hiệu quả nhất trên toàn mạng.</w:t>
-      </w:r>
-    </w:p>
-    <w:p>
-      <w:pPr>
-        <w:spacing w:after="40" w:before="80" w:line="312" w:lineRule="auto"/>
-        <w:jc w:val="both"/>
-        <w:rPr>
-          <w:rFonts w:ascii="Times New Roman" w:cs="Times New Roman" w:eastAsia="Times New Roman" w:hAnsi="Times New Roman"/>
-          <w:sz w:val="26"/>
-          <w:szCs w:val="26"/>
-        </w:rPr>
-      </w:pPr>
-      <w:r>
-        <w:rPr>
-          <w:rFonts w:ascii="Times New Roman" w:cs="Times New Roman" w:eastAsia="Times New Roman" w:hAnsi="Times New Roman"/>
-          <w:sz w:val="26"/>
-          <w:szCs w:val="26"/>
-          <w:rtl w:val="0"/>
-        </w:rPr>
-        <w:t xml:space="preserve">Mô hình hóa Toán học của Bài toán Điều phối MILP:</w:t>
-      </w:r>
-    </w:p>
-    <w:p>
-      <w:pPr>
-        <w:spacing w:after="20" w:before="40" w:line="312" w:lineRule="auto"/>
-        <w:jc w:val="both"/>
-        <w:rPr>
-          <w:rFonts w:ascii="Times New Roman" w:cs="Times New Roman" w:eastAsia="Times New Roman" w:hAnsi="Times New Roman"/>
-          <w:sz w:val="26"/>
-          <w:szCs w:val="26"/>
-        </w:rPr>
-      </w:pPr>
-      <w:r>
-        <w:rPr>
-          <w:rFonts w:ascii="Times New Roman" w:cs="Times New Roman" w:eastAsia="Times New Roman" w:hAnsi="Times New Roman"/>
-          <w:sz w:val="26"/>
-          <w:szCs w:val="26"/>
-          <w:rtl w:val="0"/>
-        </w:rPr>
-        <w:t xml:space="preserve">1. Hệ thống Biến quyết định &amp; Tham số:</w:t>
-      </w:r>
-    </w:p>
-    <w:p>
-      <w:pPr>
-        <w:spacing w:after="20" w:before="20" w:line="252.00000000000003" w:lineRule="auto"/>
-        <w:ind w:left="280" w:firstLine="0"/>
-        <w:jc w:val="both"/>
-        <w:rPr>
-          <w:rFonts w:ascii="Times New Roman" w:cs="Times New Roman" w:eastAsia="Times New Roman" w:hAnsi="Times New Roman"/>
-          <w:sz w:val="26"/>
-          <w:szCs w:val="26"/>
-        </w:rPr>
-      </w:pPr>
-      <w:r>
-        <w:rPr>
-          <w:rFonts w:ascii="Times New Roman" w:cs="Times New Roman" w:eastAsia="Times New Roman" w:hAnsi="Times New Roman"/>
-          <w:sz w:val="26"/>
-          <w:szCs w:val="26"/>
-          <w:rtl w:val="0"/>
-        </w:rPr>
-        <w:t xml:space="preserve">• </w:t>
-      </w:r>
-      <w:r>
-        <w:rPr>
-          <w:rFonts w:ascii="Times New Roman" w:cs="Times New Roman" w:eastAsia="Times New Roman" w:hAnsi="Times New Roman"/>
-          <w:sz w:val="26"/>
-          <w:szCs w:val="26"/>
-          <w:rtl w:val="0"/>
-        </w:rPr>
-        <w:t xml:space="preserve">x_ij</w:t>
-      </w:r>
-      <w:r>
-        <w:rPr>
-          <w:rFonts w:ascii="Times New Roman" w:cs="Times New Roman" w:eastAsia="Times New Roman" w:hAnsi="Times New Roman"/>
-          <w:sz w:val="26"/>
-          <w:szCs w:val="26"/>
-          <w:rtl w:val="0"/>
-        </w:rPr>
-        <w:t xml:space="preserve"> </w:t>
-      </w:r>
-      <w:r>
-        <w:rPr>
-          <w:rFonts w:ascii="Cambria Math" w:cs="Cambria Math" w:eastAsia="Cambria Math" w:hAnsi="Cambria Math"/>
-          <w:sz w:val="26"/>
-          <w:szCs w:val="26"/>
-          <w:rtl w:val="0"/>
-        </w:rPr>
-        <w:t xml:space="preserve">∈</w:t>
-      </w:r>
-      <w:r>
-        <w:rPr>
-          <w:rFonts w:ascii="Times New Roman" w:cs="Times New Roman" w:eastAsia="Times New Roman" w:hAnsi="Times New Roman"/>
-          <w:sz w:val="26"/>
-          <w:szCs w:val="26"/>
-          <w:rtl w:val="0"/>
-        </w:rPr>
-        <w:t xml:space="preserve"> {0, 1}: Biến nhị phân phân bổ (x_ij = 1 nếu gán đơn hàng i cho xe j; bằng 0 nếu ngược lại).</w:t>
-      </w:r>
-    </w:p>
-    <w:p>
-      <w:pPr>
-        <w:spacing w:after="20" w:before="20" w:line="252.00000000000003" w:lineRule="auto"/>
-        <w:ind w:left="280" w:firstLine="0"/>
-        <w:jc w:val="both"/>
-        <w:rPr>
-          <w:rFonts w:ascii="Times New Roman" w:cs="Times New Roman" w:eastAsia="Times New Roman" w:hAnsi="Times New Roman"/>
-          <w:sz w:val="26"/>
-          <w:szCs w:val="26"/>
-        </w:rPr>
-      </w:pPr>
-      <w:r>
-        <w:rPr>
-          <w:rFonts w:ascii="Times New Roman" w:cs="Times New Roman" w:eastAsia="Times New Roman" w:hAnsi="Times New Roman"/>
-          <w:sz w:val="26"/>
-          <w:szCs w:val="26"/>
-          <w:rtl w:val="0"/>
-        </w:rPr>
-        <w:t xml:space="preserve">• </w:t>
-      </w:r>
-      <w:r>
-        <w:rPr>
-          <w:rFonts w:ascii="Times New Roman" w:cs="Times New Roman" w:eastAsia="Times New Roman" w:hAnsi="Times New Roman"/>
-          <w:sz w:val="26"/>
-          <w:szCs w:val="26"/>
-          <w:rtl w:val="0"/>
-        </w:rPr>
-        <w:t xml:space="preserve">y_j</w:t>
-      </w:r>
-      <w:r>
-        <w:rPr>
-          <w:rFonts w:ascii="Times New Roman" w:cs="Times New Roman" w:eastAsia="Times New Roman" w:hAnsi="Times New Roman"/>
-          <w:sz w:val="26"/>
-          <w:szCs w:val="26"/>
-          <w:rtl w:val="0"/>
-        </w:rPr>
-        <w:t xml:space="preserve"> </w:t>
-      </w:r>
-      <w:r>
-        <w:rPr>
-          <w:rFonts w:ascii="Cambria Math" w:cs="Cambria Math" w:eastAsia="Cambria Math" w:hAnsi="Cambria Math"/>
-          <w:sz w:val="26"/>
-          <w:szCs w:val="26"/>
-          <w:rtl w:val="0"/>
-        </w:rPr>
-        <w:t xml:space="preserve">∈</w:t>
-      </w:r>
-      <w:r>
-        <w:rPr>
-          <w:rFonts w:ascii="Times New Roman" w:cs="Times New Roman" w:eastAsia="Times New Roman" w:hAnsi="Times New Roman"/>
-          <w:sz w:val="26"/>
-          <w:szCs w:val="26"/>
-          <w:rtl w:val="0"/>
-        </w:rPr>
-        <w:t xml:space="preserve"> {0, 1}: Biến nhị phân kích hoạt phương tiện (y_j = 1 nếu xe j được huy động nổ máy; bằng 0 nếu xe nằm bãi để triệt tiêu chi phí mở xe).</w:t>
-      </w:r>
-    </w:p>
-    <w:p>
-      <w:pPr>
-        <w:spacing w:after="20" w:before="20" w:line="252.00000000000003" w:lineRule="auto"/>
-        <w:ind w:left="280" w:firstLine="0"/>
-        <w:jc w:val="both"/>
-        <w:rPr>
-          <w:rFonts w:ascii="Times New Roman" w:cs="Times New Roman" w:eastAsia="Times New Roman" w:hAnsi="Times New Roman"/>
-          <w:sz w:val="26"/>
-          <w:szCs w:val="26"/>
-        </w:rPr>
-      </w:pPr>
-      <w:r>
-        <w:t>• w_i, C_j: w_i là khối lượng hàng của đơn i (Tấn); C_j là tải trọng hữu dụng của Container lạnh 40 feet j (C_j = 17.28 Tấn/cont).</w:t>
-      </w:r>
-    </w:p>
-    <w:p>
-      <w:pPr>
-        <w:spacing w:after="20" w:before="20" w:line="252.00000000000003" w:lineRule="auto"/>
-        <w:ind w:left="280" w:firstLine="0"/>
-        <w:jc w:val="both"/>
-        <w:rPr>
-          <w:rFonts w:ascii="Times New Roman" w:cs="Times New Roman" w:eastAsia="Times New Roman" w:hAnsi="Times New Roman"/>
-          <w:sz w:val="26"/>
-          <w:szCs w:val="26"/>
-        </w:rPr>
-      </w:pPr>
-      <w:r>
-        <w:t>• FixedCost_j: Chi phí thuê xe cơ sở khi Container lạnh 40 feet j lăn bánh (9.0 triệu VNĐ/cont).</w:t>
-      </w:r>
-    </w:p>
-    <w:p>
-      <w:pPr>
-        <w:spacing w:after="20" w:before="20" w:line="252.00000000000003" w:lineRule="auto"/>
-        <w:ind w:left="280" w:firstLine="0"/>
-        <w:jc w:val="both"/>
-        <w:rPr>
-          <w:rFonts w:ascii="Times New Roman" w:cs="Times New Roman" w:eastAsia="Times New Roman" w:hAnsi="Times New Roman"/>
-          <w:sz w:val="26"/>
-          <w:szCs w:val="26"/>
-        </w:rPr>
-      </w:pPr>
-      <w:r>
-        <w:rPr>
-          <w:rFonts w:ascii="Times New Roman" w:cs="Times New Roman" w:eastAsia="Times New Roman" w:hAnsi="Times New Roman"/>
-          <w:sz w:val="26"/>
-          <w:szCs w:val="26"/>
-          <w:rtl w:val="0"/>
-        </w:rPr>
-        <w:t xml:space="preserve">• </w:t>
-      </w:r>
-      <w:r>
-        <w:rPr>
-          <w:rFonts w:ascii="Times New Roman" w:cs="Times New Roman" w:eastAsia="Times New Roman" w:hAnsi="Times New Roman"/>
-          <w:sz w:val="26"/>
-          <w:szCs w:val="26"/>
-          <w:rtl w:val="0"/>
-        </w:rPr>
-        <w:t xml:space="preserve">DeadheadCost_ji</w:t>
-      </w:r>
-      <w:r>
-        <w:rPr>
-          <w:rFonts w:ascii="Times New Roman" w:cs="Times New Roman" w:eastAsia="Times New Roman" w:hAnsi="Times New Roman"/>
-          <w:sz w:val="26"/>
-          <w:szCs w:val="26"/>
-          <w:rtl w:val="0"/>
-        </w:rPr>
-        <w:t xml:space="preserve">: Chi phí phát sinh do xe chạy rỗng tiếp cận điểm đóng hàng (18.000 VNĐ/km rỗng).</w:t>
-      </w:r>
-    </w:p>
-    <w:p>
-      <w:pPr>
-        <w:spacing w:after="20" w:before="20" w:line="252.00000000000003" w:lineRule="auto"/>
-        <w:ind w:left="280" w:firstLine="0"/>
-        <w:jc w:val="both"/>
-        <w:rPr>
-          <w:rFonts w:ascii="Times New Roman" w:cs="Times New Roman" w:eastAsia="Times New Roman" w:hAnsi="Times New Roman"/>
-          <w:sz w:val="26"/>
-          <w:szCs w:val="26"/>
-        </w:rPr>
-      </w:pPr>
-      <w:r>
-        <w:rPr>
-          <w:rFonts w:ascii="Times New Roman" w:cs="Times New Roman" w:eastAsia="Times New Roman" w:hAnsi="Times New Roman"/>
-          <w:sz w:val="26"/>
-          <w:szCs w:val="26"/>
-          <w:rtl w:val="0"/>
-        </w:rPr>
-        <w:t xml:space="preserve">• TransitCost_ij: Cước phí vận chuyển chính tuyến có tải từ HTX i đến cửa khẩu/kho đích.</w:t>
-      </w:r>
-    </w:p>
-    <w:p>
-      <w:pPr>
-        <w:spacing w:after="20" w:before="80" w:line="312" w:lineRule="auto"/>
-        <w:jc w:val="both"/>
-        <w:rPr>
-          <w:rFonts w:ascii="Times New Roman" w:cs="Times New Roman" w:eastAsia="Times New Roman" w:hAnsi="Times New Roman"/>
-          <w:sz w:val="26"/>
-          <w:szCs w:val="26"/>
-        </w:rPr>
-      </w:pPr>
-      <w:r>
-        <w:rPr>
-          <w:rFonts w:ascii="Times New Roman" w:cs="Times New Roman" w:eastAsia="Times New Roman" w:hAnsi="Times New Roman"/>
-          <w:sz w:val="26"/>
-          <w:szCs w:val="26"/>
-          <w:rtl w:val="0"/>
-        </w:rPr>
-        <w:t xml:space="preserve">2. Hàm mục tiêu (Tối thiểu hóa Tổng chi phí Vận hành Toàn mạng):</w:t>
-      </w:r>
-    </w:p>
-    <w:p>
-      <w:pPr>
-        <w:spacing w:after="40" w:before="40" w:line="312" w:lineRule="auto"/>
-        <w:jc w:val="center"/>
-        <w:rPr>
-          <w:rFonts w:ascii="Times New Roman" w:cs="Times New Roman" w:eastAsia="Times New Roman" w:hAnsi="Times New Roman"/>
-          <w:sz w:val="26"/>
-          <w:szCs w:val="26"/>
-        </w:rPr>
-      </w:pPr>
-      <w:r>
-        <w:rPr>
-          <w:rFonts w:ascii="Times New Roman" w:cs="Times New Roman" w:eastAsia="Times New Roman" w:hAnsi="Times New Roman"/>
-          <w:sz w:val="26"/>
-          <w:szCs w:val="26"/>
-        </w:rPr>
-        <w:drawing>
-          <wp:inline distB="114300" distT="114300" distL="114300" distR="114300">
-            <wp:extent cx="5731200" cy="546100"/>
-            <wp:effectExtent b="0" l="0" r="0" t="0"/>
-            <wp:docPr id="8" name="image5.png"/>
-            <a:graphic>
-              <a:graphicData uri="http://schemas.openxmlformats.org/drawingml/2006/picture">
-                <pic:pic>
-                  <pic:nvPicPr>
-                    <pic:cNvPr id="0" name="image5.png"/>
-                    <pic:cNvPicPr preferRelativeResize="0"/>
-                  </pic:nvPicPr>
-                  <pic:blipFill>
-                    <a:blip r:embed="rId11"/>
-                    <a:srcRect b="0" l="0" r="0" t="0"/>
-                    <a:stretch>
-                      <a:fillRect/>
-                    </a:stretch>
-                  </pic:blipFill>
-                  <pic:spPr>
-                    <a:xfrm>
-                      <a:off x="0" y="0"/>
-                      <a:ext cx="5731200" cy="546100"/>
-                    </a:xfrm>
-                    <a:prstGeom prst="rect"/>
-                    <a:ln/>
-                  </pic:spPr>
-                </pic:pic>
-              </a:graphicData>
-            </a:graphic>
-          </wp:inline>
-        </w:drawing>
-      </w:r>
-      <w:r>
-        <w:rPr>
-          <w:rtl w:val="0"/>
-        </w:rPr>
-      </w:r>
-    </w:p>
-    <w:p>
-      <w:pPr>
-        <w:spacing w:after="60" w:line="312" w:lineRule="auto"/>
-        <w:jc w:val="center"/>
-        <w:rPr>
-          <w:rFonts w:ascii="Times New Roman" w:cs="Times New Roman" w:eastAsia="Times New Roman" w:hAnsi="Times New Roman"/>
-          <w:sz w:val="26"/>
-          <w:szCs w:val="26"/>
-        </w:rPr>
-      </w:pPr>
-      <w:r>
-        <w:rPr>
-          <w:rFonts w:ascii="Times New Roman" w:cs="Times New Roman" w:eastAsia="Times New Roman" w:hAnsi="Times New Roman"/>
-          <w:sz w:val="26"/>
-          <w:szCs w:val="26"/>
-          <w:rtl w:val="0"/>
-        </w:rPr>
-        <w:t xml:space="preserve">(Ý nghĩa: Triệt tiêu tối đa chi phí mở xe thừa và giảm thiểu chi phí xe chạy rỗng deadhead).</w:t>
-      </w:r>
-    </w:p>
-    <w:p>
-      <w:pPr>
-        <w:spacing w:after="20" w:before="60" w:line="312" w:lineRule="auto"/>
-        <w:jc w:val="both"/>
-        <w:rPr>
-          <w:rFonts w:ascii="Times New Roman" w:cs="Times New Roman" w:eastAsia="Times New Roman" w:hAnsi="Times New Roman"/>
-          <w:sz w:val="26"/>
-          <w:szCs w:val="26"/>
-        </w:rPr>
-      </w:pPr>
-      <w:r>
-        <w:rPr>
-          <w:rFonts w:ascii="Times New Roman" w:cs="Times New Roman" w:eastAsia="Times New Roman" w:hAnsi="Times New Roman"/>
-          <w:sz w:val="26"/>
-          <w:szCs w:val="26"/>
-          <w:rtl w:val="0"/>
-        </w:rPr>
-        <w:t xml:space="preserve">3. Các Ràng buộc Kỹ thuật Cốt lõi (Subject to Constraints):</w:t>
-      </w:r>
-    </w:p>
-    <w:p>
-      <w:pPr>
-        <w:spacing w:after="20" w:before="40" w:line="312" w:lineRule="auto"/>
-        <w:ind w:left="220" w:firstLine="0"/>
-        <w:jc w:val="both"/>
-        <w:rPr>
-          <w:rFonts w:ascii="Times New Roman" w:cs="Times New Roman" w:eastAsia="Times New Roman" w:hAnsi="Times New Roman"/>
-          <w:sz w:val="26"/>
-          <w:szCs w:val="26"/>
-        </w:rPr>
-      </w:pPr>
-      <w:r>
-        <w:rPr>
-          <w:rFonts w:ascii="Times New Roman" w:cs="Times New Roman" w:eastAsia="Times New Roman" w:hAnsi="Times New Roman"/>
-          <w:sz w:val="26"/>
-          <w:szCs w:val="26"/>
-          <w:rtl w:val="0"/>
-        </w:rPr>
-        <w:t xml:space="preserve">• Ràng buộc phục vụ 100% đơn hàng (Mỗi lô hàng của HTX phải được đúng 1 xe tiếp nhận):</w:t>
-      </w:r>
-    </w:p>
-    <w:p>
-      <w:pPr>
-        <w:spacing w:after="40" w:before="20" w:line="312" w:lineRule="auto"/>
-        <w:jc w:val="center"/>
-        <w:rPr>
-          <w:rFonts w:ascii="Times New Roman" w:cs="Times New Roman" w:eastAsia="Times New Roman" w:hAnsi="Times New Roman"/>
-          <w:sz w:val="26"/>
-          <w:szCs w:val="26"/>
-        </w:rPr>
-      </w:pPr>
-      <w:r>
-        <w:rPr>
-          <w:rFonts w:ascii="Times New Roman" w:cs="Times New Roman" w:eastAsia="Times New Roman" w:hAnsi="Times New Roman"/>
-          <w:sz w:val="26"/>
-          <w:szCs w:val="26"/>
-        </w:rPr>
-        <w:drawing>
-          <wp:inline distB="114300" distT="114300" distL="114300" distR="114300">
-            <wp:extent cx="1397000" cy="419100"/>
-            <wp:effectExtent b="0" l="0" r="0" t="0"/>
-            <wp:docPr id="3" name="image3.png"/>
-            <a:graphic>
-              <a:graphicData uri="http://schemas.openxmlformats.org/drawingml/2006/picture">
-                <pic:pic>
-                  <pic:nvPicPr>
-                    <pic:cNvPr id="0" name="image3.png"/>
-                    <pic:cNvPicPr preferRelativeResize="0"/>
-                  </pic:nvPicPr>
-                  <pic:blipFill>
-                    <a:blip r:embed="rId12"/>
-                    <a:srcRect b="0" l="0" r="0" t="0"/>
-                    <a:stretch>
-                      <a:fillRect/>
-                    </a:stretch>
-                  </pic:blipFill>
-                  <pic:spPr>
-                    <a:xfrm>
-                      <a:off x="0" y="0"/>
-                      <a:ext cx="1397000" cy="419100"/>
-                    </a:xfrm>
-                    <a:prstGeom prst="rect"/>
-                    <a:ln/>
-                  </pic:spPr>
-                </pic:pic>
-              </a:graphicData>
-            </a:graphic>
-          </wp:inline>
-        </w:drawing>
-      </w:r>
-      <w:r>
-        <w:rPr>
-          <w:rtl w:val="0"/>
-        </w:rPr>
-      </w:r>
-    </w:p>
-    <w:p>
-      <w:pPr>
-        <w:spacing w:after="20" w:before="40" w:line="312" w:lineRule="auto"/>
-        <w:ind w:left="220" w:firstLine="0"/>
-        <w:jc w:val="both"/>
-        <w:rPr>
-          <w:rFonts w:ascii="Times New Roman" w:cs="Times New Roman" w:eastAsia="Times New Roman" w:hAnsi="Times New Roman"/>
-          <w:sz w:val="26"/>
-          <w:szCs w:val="26"/>
-        </w:rPr>
-      </w:pPr>
-      <w:r>
-        <w:rPr>
-          <w:rFonts w:ascii="Times New Roman" w:cs="Times New Roman" w:eastAsia="Times New Roman" w:hAnsi="Times New Roman"/>
-          <w:sz w:val="26"/>
-          <w:szCs w:val="26"/>
-          <w:rtl w:val="0"/>
-        </w:rPr>
-        <w:t xml:space="preserve">• Ràng buộc tải trọng hữu dụng &amp; liên kết kích hoạt xe (Không chở quá tải, chỉ gán cho xe đã kích hoạt y_j = 1):</w:t>
-      </w:r>
-    </w:p>
-    <w:p>
-      <w:pPr>
-        <w:spacing w:after="40" w:before="20" w:line="312" w:lineRule="auto"/>
-        <w:jc w:val="center"/>
-        <w:rPr>
-          <w:rFonts w:ascii="Times New Roman" w:cs="Times New Roman" w:eastAsia="Times New Roman" w:hAnsi="Times New Roman"/>
-          <w:sz w:val="26"/>
-          <w:szCs w:val="26"/>
-        </w:rPr>
-      </w:pPr>
-      <w:r>
-        <w:rPr>
-          <w:rFonts w:ascii="Times New Roman" w:cs="Times New Roman" w:eastAsia="Times New Roman" w:hAnsi="Times New Roman"/>
-          <w:sz w:val="26"/>
-          <w:szCs w:val="26"/>
-        </w:rPr>
-        <w:drawing>
-          <wp:inline distB="114300" distT="114300" distL="114300" distR="114300">
-            <wp:extent cx="1968500" cy="393700"/>
-            <wp:effectExtent b="0" l="0" r="0" t="0"/>
-            <wp:docPr id="2" name="image6.png"/>
-            <a:graphic>
-              <a:graphicData uri="http://schemas.openxmlformats.org/drawingml/2006/picture">
-                <pic:pic>
-                  <pic:nvPicPr>
-                    <pic:cNvPr id="0" name="image6.png"/>
-                    <pic:cNvPicPr preferRelativeResize="0"/>
-                  </pic:nvPicPr>
-                  <pic:blipFill>
-                    <a:blip r:embed="rId13"/>
-                    <a:srcRect b="0" l="0" r="0" t="0"/>
-                    <a:stretch>
-                      <a:fillRect/>
-                    </a:stretch>
-                  </pic:blipFill>
-                  <pic:spPr>
-                    <a:xfrm>
-                      <a:off x="0" y="0"/>
-                      <a:ext cx="1968500" cy="393700"/>
-                    </a:xfrm>
-                    <a:prstGeom prst="rect"/>
-                    <a:ln/>
-                  </pic:spPr>
-                </pic:pic>
-              </a:graphicData>
-            </a:graphic>
-          </wp:inline>
-        </w:drawing>
-      </w:r>
-      <w:r>
-        <w:rPr>
-          <w:rtl w:val="0"/>
-        </w:rPr>
-      </w:r>
-    </w:p>
-    <w:p>
-      <w:pPr>
-        <w:spacing w:after="20" w:before="40" w:line="312" w:lineRule="auto"/>
-        <w:ind w:left="220" w:firstLine="0"/>
-        <w:jc w:val="both"/>
-        <w:rPr>
-          <w:rFonts w:ascii="Times New Roman" w:cs="Times New Roman" w:eastAsia="Times New Roman" w:hAnsi="Times New Roman"/>
-          <w:sz w:val="26"/>
-          <w:szCs w:val="26"/>
-        </w:rPr>
-      </w:pPr>
-      <w:r>
-        <w:rPr>
-          <w:rFonts w:ascii="Times New Roman" w:cs="Times New Roman" w:eastAsia="Times New Roman" w:hAnsi="Times New Roman"/>
-          <w:sz w:val="26"/>
-          <w:szCs w:val="26"/>
-          <w:rtl w:val="0"/>
-        </w:rPr>
-        <w:t xml:space="preserve">• Ràng buộc tương thích chuỗi lạnh &amp; an toàn thực phẩm (Loại bỏ phương tiện không đạt dải nhiệt độ 2°C – 4°C):</w:t>
-      </w:r>
-    </w:p>
-    <w:p>
-      <w:pPr>
-        <w:spacing w:after="40" w:before="20" w:line="312" w:lineRule="auto"/>
-        <w:jc w:val="center"/>
-        <w:rPr>
-          <w:rFonts w:ascii="Times New Roman" w:cs="Times New Roman" w:eastAsia="Times New Roman" w:hAnsi="Times New Roman"/>
-          <w:sz w:val="26"/>
-          <w:szCs w:val="26"/>
-        </w:rPr>
-      </w:pPr>
-      <w:r>
-        <w:rPr>
-          <w:rFonts w:ascii="Times New Roman" w:cs="Times New Roman" w:eastAsia="Times New Roman" w:hAnsi="Times New Roman"/>
-          <w:sz w:val="26"/>
-          <w:szCs w:val="26"/>
-        </w:rPr>
-        <w:drawing>
-          <wp:inline distB="114300" distT="114300" distL="114300" distR="114300">
-            <wp:extent cx="2159000" cy="241300"/>
-            <wp:effectExtent b="0" l="0" r="0" t="0"/>
-            <wp:docPr id="7" name="image8.png"/>
-            <a:graphic>
-              <a:graphicData uri="http://schemas.openxmlformats.org/drawingml/2006/picture">
-                <pic:pic>
-                  <pic:nvPicPr>
-                    <pic:cNvPr id="0" name="image8.png"/>
-                    <pic:cNvPicPr preferRelativeResize="0"/>
-                  </pic:nvPicPr>
-                  <pic:blipFill>
-                    <a:blip r:embed="rId14"/>
-                    <a:srcRect b="0" l="0" r="0" t="0"/>
-                    <a:stretch>
-                      <a:fillRect/>
-                    </a:stretch>
-                  </pic:blipFill>
-                  <pic:spPr>
-                    <a:xfrm>
-                      <a:off x="0" y="0"/>
-                      <a:ext cx="2159000" cy="241300"/>
-                    </a:xfrm>
-                    <a:prstGeom prst="rect"/>
-                    <a:ln/>
-                  </pic:spPr>
-                </pic:pic>
-              </a:graphicData>
-            </a:graphic>
-          </wp:inline>
-        </w:drawing>
-      </w:r>
-      <w:r>
-        <w:rPr>
-          <w:rtl w:val="0"/>
-        </w:rPr>
-      </w:r>
-    </w:p>
-    <w:p>
-      <w:pPr>
-        <w:spacing w:after="20" w:before="60" w:line="312" w:lineRule="auto"/>
-        <w:jc w:val="both"/>
-        <w:rPr>
-          <w:rFonts w:ascii="Times New Roman" w:cs="Times New Roman" w:eastAsia="Times New Roman" w:hAnsi="Times New Roman"/>
-          <w:sz w:val="26"/>
-          <w:szCs w:val="26"/>
-        </w:rPr>
-      </w:pPr>
-      <w:r>
-        <w:rPr>
-          <w:rFonts w:ascii="Times New Roman" w:cs="Times New Roman" w:eastAsia="Times New Roman" w:hAnsi="Times New Roman"/>
-          <w:sz w:val="26"/>
-          <w:szCs w:val="26"/>
-          <w:rtl w:val="0"/>
-        </w:rPr>
-        <w:t xml:space="preserve">4. Hiệu quả Thực thi Thuật toán:</w:t>
-      </w:r>
-    </w:p>
-    <w:p>
-      <w:pPr>
-        <w:spacing w:line="264" w:lineRule="auto"/>
-        <w:jc w:val="both"/>
-        <w:rPr>
-          <w:rFonts w:ascii="Times New Roman" w:cs="Times New Roman" w:eastAsia="Times New Roman" w:hAnsi="Times New Roman"/>
-          <w:sz w:val="26"/>
-          <w:szCs w:val="26"/>
-        </w:rPr>
-      </w:pPr>
-      <w:r>
-        <w:rPr>
-          <w:rFonts w:ascii="Times New Roman" w:cs="Times New Roman" w:eastAsia="Times New Roman" w:hAnsi="Times New Roman"/>
-          <w:sz w:val="26"/>
-          <w:szCs w:val="26"/>
-          <w:rtl w:val="0"/>
-        </w:rPr>
-        <w:t xml:space="preserve">Mô hình được lập trình và giải tự động trên Python bằng bộ giải CBC / Gurobi. Với quy mô 15 HTX Lục Ngạn và đội xe 40–50 phương tiện, thời gian giải bài toán tối ưu toàn cục chỉ mất dưới 1.8 giây, cho phép tái điều phối tức thời khi thời tiết mưa bão làm thay đổi kế hoạch thu hái.</w:t>
-      </w:r>
-      <w:r>
-        <w:rPr>
-          <w:rtl w:val="0"/>
-        </w:rPr>
+          <w:rFonts w:ascii="Times New Roman" w:hAnsi="Times New Roman"/>
+          <w:b w:val="0"/>
+          <w:i w:val="0"/>
+          <w:color w:val="000000"/>
+          <w:sz w:val="26"/>
+        </w:rPr>
+        <w:t>Ở bước này, FrostLink tổng hợp toàn bộ nhu cầu vận chuyển từ các HTX và đội xe khả dụng trong mạng lưới (chu kỳ 1–3 ngày) để đưa vào mô hình Quy hoạch Tuyến tính Nguyên (MILP - Mixed Integer Linear Programming), giải tự động qua bộ giải CBC / Gurobi (Python). Mục tiêu cốt lõi của MILP là tối ưu hóa toàn cục: tự động ghép nối đa chuyến, triệt tiêu km xe chạy rỗng (deadhead) và cân bằng tải trọng toàn mạng lưới nhằm đạt tổng chi phí vận hành thấp nhất.</w:t>
+      </w:r>
+    </w:p>
+    <w:p>
+      <w:r>
+        <w:rPr>
+          <w:rFonts w:ascii="Times New Roman" w:hAnsi="Times New Roman"/>
+          <w:b/>
+          <w:i w:val="0"/>
+          <w:color w:val="000000"/>
+          <w:sz w:val="26"/>
+        </w:rPr>
+        <w:t>Mô hình hóa Toán học của Bài toán Điều phối MILP:</w:t>
+        <w:br/>
+      </w:r>
+      <w:r>
+        <w:rPr>
+          <w:rFonts w:ascii="Times New Roman" w:hAnsi="Times New Roman"/>
+          <w:b w:val="0"/>
+          <w:i w:val="0"/>
+          <w:color w:val="000000"/>
+          <w:sz w:val="26"/>
+        </w:rPr>
+        <w:t>• Hệ thống biến quyết định: x_ij ∈ {0, 1} (bằng 1 nếu gán đơn hàng i cho xe j; bằng 0 nếu ngược lại); y_j ∈ {0, 1} (bằng 1 nếu xe j được huy động nổ máy lăn bánh; bằng 0 nếu xe nằm bãi để triệt tiêu chi phí mở xe).</w:t>
+        <w:br/>
+        <w:t>• Hệ thống tham số kinh tế &amp; kỹ thuật: w_i là khối lượng hàng của đơn i (Tấn); C_j là tải trọng hữu dụng của Container lạnh 40 feet (C_j = 17.28 Tấn/cont); FixedCost_j là chi phí mở xe cơ sở khi cont 40ft lăn bánh (9.0 triệu VNĐ/cont); DeadheadCost_ji là chi phí xe chạy rỗng tiếp cận điểm đóng hàng (18.000 VNĐ/km rỗng); TransitCost_ij là cước phí vận chuyển chính tuyến có tải từ HTX i đến kho/cửa khẩu đích.</w:t>
+      </w:r>
+    </w:p>
+    <w:p>
+      <w:r>
+        <w:rPr>
+          <w:rFonts w:ascii="Times New Roman" w:hAnsi="Times New Roman"/>
+          <w:b/>
+          <w:i w:val="0"/>
+          <w:color w:val="000000"/>
+          <w:sz w:val="26"/>
+        </w:rPr>
+        <w:t>Hàm mục tiêu và Các Ràng buộc Kỹ thuật Cốt lõi:</w:t>
+        <w:br/>
+      </w:r>
+      <w:r>
+        <w:rPr>
+          <w:rFonts w:ascii="Times New Roman" w:hAnsi="Times New Roman"/>
+          <w:b w:val="0"/>
+          <w:i w:val="0"/>
+          <w:color w:val="000000"/>
+          <w:sz w:val="26"/>
+        </w:rPr>
+        <w:t>• Hàm mục tiêu (Tối thiểu hóa Tổng chi phí Toàn mạng): min Z = ∑_j (FixedCost_j · y_j) + ∑_{i,j} (DeadheadCost_ji + TransitCost_ij) · x_ij (Triệt tiêu chi phí mở xe thừa và tối thiểu hóa chi phí xe chạy rỗng deadhead).</w:t>
+        <w:br/>
+        <w:t>• Ràng buộc phục vụ 100% đơn hàng: ∑_j x_ij = 1, ∀i (Mỗi lô hàng của HTX bắt buộc được đúng 1 xe tiếp nhận, không để hàng tồn đọng).</w:t>
+        <w:br/>
+        <w:t>• Ràng buộc tải trọng hữu dụng &amp; liên kết kích hoạt xe: ∑_i w_i · x_ij ≤ C_j · y_j, ∀j (Khối lượng hàng không vượt quá tải trọng 17.28 tấn/cont và chỉ xếp hàng lên các xe đã được kích hoạt nổ máy y_j = 1).</w:t>
+        <w:br/>
+        <w:t>• Ràng buộc kiểm soát nhiệt độ chuỗi lạnh: Loại bỏ ngay từ bộ lọc đầu vào các phương tiện không đảm bảo dải nhiệt độ tiêu chuẩn 2°C – 4°C.</w:t>
+      </w:r>
+    </w:p>
+    <w:p>
+      <w:r>
+        <w:rPr>
+          <w:rFonts w:ascii="Times New Roman" w:hAnsi="Times New Roman"/>
+          <w:b w:val="0"/>
+          <w:i w:val="0"/>
+          <w:color w:val="000000"/>
+          <w:sz w:val="26"/>
+        </w:rPr>
+        <w:t>Hiệu quả Thực thi &amp; Năng lực Mở rộng Mạng lưới (Scalability): Mô hình được lập trình và giải tự động trên Python bằng bộ giải CBC / Gurobi. Trong khi mô hình dự báo AI được kiểm chứng chi tiết trên 92 ngày của HTX điểm, thuật toán điều phối MILP được thiết kế sẵn sàng cho mạng lưới mở rộng. Với quy mô liên minh 15 HTX Lục Ngạn và đội xe 40–50 phương tiện, thời gian giải bài toán tối ưu toàn cục chỉ mất dưới 1.8 giây, cho phép hệ thống tự động tái điều phối tức thời (Dynamic Dispatching) khi thời tiết mưa bão làm thay đổi kế hoạch thu hái.</w:t>
       </w:r>
     </w:p>
     <w:p>

</xml_diff>